<commit_message>
Add exercise options to Aimee Morris's Tricep Dip and metabolic circuit
Tricep Dip (Day B push-up block) now offers Keiser/DB Kickback as an
alternative. Day B metabolic circuit's hip-hinge slot is now
Kettlebell Swing OR Cable/Band Pull-Through, replacing Goblet Squat
in that spot.

Co-Authored-By: Claude Sonnet 5 <noreply@anthropic.com>
Claude-Session: https://claude.ai/code/session_01VTRA12TAy4P16NRVKS4SK5
</commit_message>
<xml_diff>
--- a/clients/aimee_morris/Aimee_Morris_2Day_Training_Plan.docx
+++ b/clients/aimee_morris/Aimee_Morris_2Day_Training_Plan.docx
@@ -12197,7 +12197,7 @@
                 <w:sz w:val="18"/>
                 <w:szCs w:val="18"/>
               </w:rPr>
-              <w:t xml:space="preserve">Tricep Dip (Bench)</w:t>
+              <w:t xml:space="preserve">Tricep Dip (Bench) OR Keiser / DB Kickback</w:t>
             </w:r>
           </w:p>
         </w:tc>
@@ -12296,7 +12296,7 @@
                 <w:sz w:val="15"/>
                 <w:szCs w:val="15"/>
               </w:rPr>
-              <w:t xml:space="preserve">Bodyweight</w:t>
+              <w:t xml:space="preserve">Bodyweight (dip) or Light-Mod (kickback)</w:t>
             </w:r>
           </w:p>
         </w:tc>
@@ -12392,7 +12392,7 @@
                 <w:sz w:val="17"/>
                 <w:szCs w:val="17"/>
               </w:rPr>
-              <w:t xml:space="preserve">Hands on bench behind body. Lower until elbows reach 90°, drive back up. Complements pressing volume. Builds tricep strength for push-up progression.</w:t>
+              <w:t xml:space="preserve">Dip: hands on bench behind body, lower until elbows reach 90°, drive back up. Keiser/DB kickback: hinge forward, elbow fixed at side, extend through full range, squeeze at lockout. Coach/client choice — both build tricep strength for push-up progression.</w:t>
             </w:r>
           </w:p>
         </w:tc>
@@ -12441,7 +12441,7 @@
           <w:sz w:val="17"/>
           <w:szCs w:val="17"/>
         </w:rPr>
-        <w:t xml:space="preserve">Day B's cardiovascular work is a metabolic circuit rather than dedicated cardio. This provides the strength-plus-conditioning stimulus that is most effective for fat loss and body composition at 2 days per week. Kettlebell swing is new this update — a moderate, hip-hinge-dominant option from the cross-training notes (client/coach choice over jump squat, which stays deferred for now given moderate-progression pacing). After 3 circuit rounds: 10-minute cardiovascular finisher — choose stationary bike easy spin, treadmill Zone 2 walk, or rowing machine easy pace.</w:t>
+        <w:t xml:space="preserve">Day B's cardiovascular work is a metabolic circuit rather than dedicated cardio. This provides the strength-plus-conditioning stimulus that is most effective for fat loss and body composition at 2 days per week. Kettlebell swing and pull-through are new this update — moderate, hip-hinge-dominant options from the cross-training notes, replacing goblet squat in this slot (client/coach choice over jump squat, which stays deferred for now given moderate-progression pacing). After 3 circuit rounds: 10-minute cardiovascular finisher — choose stationary bike easy spin, treadmill Zone 2 walk, or rowing machine easy pace.</w:t>
       </w:r>
     </w:p>
     <w:tbl>
@@ -12741,7 +12741,7 @@
                 <w:sz w:val="18"/>
                 <w:szCs w:val="18"/>
               </w:rPr>
-              <w:t xml:space="preserve">Kettlebell Swing OR Goblet Squat (Light, Continuous)</w:t>
+              <w:t xml:space="preserve">Kettlebell Swing OR Cable/Band Pull-Through</w:t>
             </w:r>
           </w:p>
         </w:tc>
@@ -12840,7 +12840,7 @@
                 <w:sz w:val="15"/>
                 <w:szCs w:val="15"/>
               </w:rPr>
-              <w:t xml:space="preserve">Light-Mod KB or 25―30 lbs DB</w:t>
+              <w:t xml:space="preserve">Light-Mod KB or band/cable</w:t>
             </w:r>
           </w:p>
         </w:tc>
@@ -12936,7 +12936,7 @@
                 <w:sz w:val="17"/>
                 <w:szCs w:val="17"/>
               </w:rPr>
-              <w:t xml:space="preserve">New: KB swing — hip hinge, snap glutes at top, arms relaxed. If goblet squat: sub-maximal load, continuous reps. Coach discretion which to use. Into the next exercise after 15 seconds.</w:t>
+              <w:t xml:space="preserve">KB swing: hip hinge, snap glutes at top, arms relaxed. Pull-through: hinge back to reach through legs, drive hips forward to stand tall, squeeze glutes at top. Both hip-hinge dominant — coach discretion which to use. Into the next exercise after 15 seconds.</w:t>
             </w:r>
           </w:p>
         </w:tc>

</xml_diff>

<commit_message>
Add LIFTMOR bone-loading candidacy notes to Aimee Morris + Elizabeth Poyner
Roster-wide research-coverage sweep (women 45-55/55-65/65+ brackets)
found both were missing a note every same-bracket peer already carries.

Aimee Morris: missing both the LIFTMOR/T-score screening note and a
perimenopausal-status-ambiguity note, despite real heavy hinge/hip-thrust
content.

Elizabeth Poyner (Priority Client): her separate Improvement Report
already recommends DEXA/LIFTMOR screening, but her actual training plan
never carried the candidacy-screening framing her bracket-mates have —
added there too so it lives in the document she trains from.

Both independently audited in full (Elizabeth Poyner per her Priority
Client no-shortcuts standard): single-paragraph insertions only, zero
collateral changes, all tables byte-identical to the pre-edit versions.
</commit_message>
<xml_diff>
--- a/clients/aimee_morris/Aimee_Morris_2Day_Training_Plan.docx
+++ b/clients/aimee_morris/Aimee_Morris_2Day_Training_Plan.docx
@@ -2430,6 +2430,56 @@
           <w:szCs w:val="17"/>
         </w:rPr>
         <w:t xml:space="preserve">Reverse Lunge is added to Day B's primary squat block as a genuinely distinct lunge-pattern exercise. Previously, DB Split Squat was covering both the squat and lunge movement-pattern territory in this program — a stationary front-foot-elevated split squat and a true stepping reverse lunge train meaningfully differently, so this closes that gap rather than relying on one exercise to stand in for both. No baseline has been tested for this pattern; Week 1 starts at bodyweight for quality reps, consistent with the moderate-progression approach already used for every other newly-introduced movement in this program, and given her spinal stenosis history a reverse lunge (controlled step-back, no forward-stepping deceleration load) is the more conservative starting variant vs. a walking or curtsy lunge.</w:t>
+      </w:r>
+    </w:p>
+    <w:p>
+      <w:pPr>
+        <w:spacing w:after="100"/>
+      </w:pPr>
+      <w:r>
+        <w:rPr>
+          <w:rFonts w:ascii="Arial" w:cs="Arial" w:eastAsia="Arial" w:hAnsi="Arial"/>
+          <w:b/>
+          <w:bCs/>
+          <w:color w:val="C9A227"/>
+          <w:sz w:val="17"/>
+          <w:szCs w:val="17"/>
+        </w:rPr>
+        <w:t xml:space="preserve">Age Bracket — Perimenopause / Menopause Transition (45–55):  </w:t>
+      </w:r>
+      <w:r>
+        <w:rPr>
+          <w:rFonts w:ascii="Arial" w:cs="Arial" w:eastAsia="Arial" w:hAnsi="Arial"/>
+          <w:color w:val="2C2C2C"/>
+          <w:sz w:val="17"/>
+          <w:szCs w:val="17"/>
+        </w:rPr>
+        <w:t xml:space="preserve">At 48, Aimee sits in the 45–55 age bracket. LIFTMOR-style bone-loading candidacy screening (T-score &lt; -1.0) is worth introducing as part of ongoing care as estrogen decline accelerates through this window — framed as "bone investment," not added risk, and directly relevant given real heavy Hex Bar Deadlift and Hip Thrust content already in her program. No DEXA/T-score data is currently on file to confirm candidacy either way. Every other 45-55/55-65 bracket client on the roster carries this note; it was missing here and is added now (8/17/2026, roster-wide research-coverage sweep).</w:t>
+      </w:r>
+    </w:p>
+    <w:p>
+      <w:pPr>
+        <w:spacing w:after="100"/>
+      </w:pPr>
+      <w:r>
+        <w:rPr>
+          <w:rFonts w:ascii="Arial" w:cs="Arial" w:eastAsia="Arial" w:hAnsi="Arial"/>
+          <w:b/>
+          <w:bCs/>
+          <w:color w:val="E65100"/>
+          <w:sz w:val="17"/>
+          <w:szCs w:val="17"/>
+        </w:rPr>
+        <w:t xml:space="preserve">Perimenopausal Status — Not Assessed at Intake:  </w:t>
+      </w:r>
+      <w:r>
+        <w:rPr>
+          <w:rFonts w:ascii="Arial" w:cs="Arial" w:eastAsia="Arial" w:hAnsi="Arial"/>
+          <w:color w:val="2C2C2C"/>
+          <w:sz w:val="17"/>
+          <w:szCs w:val="17"/>
+        </w:rPr>
+        <w:t xml:space="preserve">No menstrual irregularity, vasomotor symptoms (hot flashes/night sweats), sleep disruption, or mood-change data was reported at intake, and `isPostmenopausal` is left unset rather than fabricated either direction. Per CLAUDE.md's "Perimenopausal Status — Screening Ambiguity in a Non-Clinical Context" guidance, this is the exact bracket/symptom-ambiguity window the guidance is written around — and given real heavy hip-thrust/deadlift content in this program, worth confirming at next intake given how load-bearing that determination is for the pelvic floor protocol. Revisit if symptom data becomes available.</w:t>
       </w:r>
     </w:p>
     <w:p>

</xml_diff>

<commit_message>
Update Aimee Morris and Nancy Avitable programs from today's Jason Bethea SOAP notes
</commit_message>
<xml_diff>
--- a/clients/aimee_morris/Aimee_Morris_2Day_Training_Plan.docx
+++ b/clients/aimee_morris/Aimee_Morris_2Day_Training_Plan.docx
@@ -400,7 +400,7 @@
                 <w:sz w:val="16"/>
                 <w:szCs w:val="16"/>
               </w:rPr>
-              <w:t xml:space="preserve">Wk1: 95 lbs ×4×4 (hip hinge form first) → Wk4: 120 lbs ×4. Spine-safe: hex bar only, no conventional barbell.</w:t>
+              <w:t xml:space="preserve">Wk1: 95 lbs ×4×4 (hip hinge form first) → Wk4: 120 lbs ×4. Spine-safe: hex bar only, no conventional barbell. PT-documented target: 95 → 135 lbs over 6–8 weeks — this 4-week table is the compatible near-term step on that trajectory.</w:t>
             </w:r>
           </w:p>
         </w:tc>
@@ -2509,6 +2509,31 @@
     </w:p>
     <w:p>
       <w:pPr>
+        <w:spacing w:after="100"/>
+      </w:pPr>
+      <w:r>
+        <w:rPr>
+          <w:rFonts w:ascii="Arial" w:cs="Arial" w:eastAsia="Arial" w:hAnsi="Arial"/>
+          <w:b/>
+          <w:bCs/>
+          <w:color w:val="43A047"/>
+          <w:sz w:val="17"/>
+          <w:szCs w:val="17"/>
+        </w:rPr>
+        <w:t xml:space="preserve">PT Update — 8/10/2026 Session (Jason Bethea):  </w:t>
+      </w:r>
+      <w:r>
+        <w:rPr>
+          <w:rFonts w:ascii="Arial" w:cs="Arial" w:eastAsia="Arial" w:hAnsi="Arial"/>
+          <w:color w:val="2C2C2C"/>
+          <w:sz w:val="17"/>
+          <w:szCs w:val="17"/>
+        </w:rPr>
+        <w:t xml:space="preserve">New SOAP note (SOAP_AimeeMorris_2026-08-10.pdf, a real session note, distinct from the 7/31/2026 template-source note above) documents two durable additions: (1) Single-Leg Reverse Hyper, introduced as an assessment tool for pelvic control/hip-extension quality — added to Day A, Block A's hip hinge corrective work below. (2) An explicit Hex Bar Deadlift progression target of 95 lbs → 135 lbs over 6–8 weeks — this document's existing Wk1→Wk4 progression (95→120 lbs) is the compatible near-term step on that same trajectory, not a conflicting number (see the baselines table and Block B intro below for the full target). A DOMS-driven single-session substitution noted in the same session (SL Deadlift → walking reach) was a one-off accommodation for that session only, not carried into the standing program.</w:t>
+      </w:r>
+    </w:p>
+    <w:p>
+      <w:pPr>
         <w:spacing w:after="80"/>
       </w:pPr>
     </w:p>
@@ -3703,6 +3728,248 @@
           </w:p>
         </w:tc>
       </w:tr>
+      <w:tr>
+        <w:tc>
+          <w:tcPr>
+            <w:tcW w:type="dxa" w:w="2400"/>
+            <w:tcBorders>
+              <w:top w:val="none" w:color="FFFFFF" w:sz="0"/>
+              <w:left w:val="none" w:color="FFFFFF" w:sz="0"/>
+              <w:bottom w:val="none" w:color="FFFFFF" w:sz="0"/>
+              <w:right w:val="none" w:color="FFFFFF" w:sz="0"/>
+            </w:tcBorders>
+            <w:shd w:fill="FFFFFF" w:color="auto" w:val="clear"/>
+            <w:tcMar>
+              <w:top w:type="dxa" w:w="40"/>
+              <w:left w:type="dxa" w:w="80"/>
+              <w:bottom w:type="dxa" w:w="40"/>
+              <w:right w:type="dxa" w:w="80"/>
+            </w:tcMar>
+            <w:vAlign w:val="center"/>
+          </w:tcPr>
+          <w:p>
+            <w:r>
+              <w:rPr>
+                <w:rFonts w:ascii="Arial" w:cs="Arial" w:eastAsia="Arial" w:hAnsi="Arial"/>
+                <w:b/>
+                <w:bCs/>
+                <w:color w:val="2C2C2C"/>
+                <w:sz w:val="18"/>
+                <w:szCs w:val="18"/>
+              </w:rPr>
+              <w:t xml:space="preserve">Single-Leg Reverse Hyper (Bench-Supported, Assessment)</w:t>
+            </w:r>
+          </w:p>
+          <w:p>
+            <w:r>
+              <w:rPr>
+                <w:rFonts w:ascii="Arial" w:cs="Arial" w:eastAsia="Arial" w:hAnsi="Arial"/>
+                <w:i/>
+                <w:iCs/>
+                <w:color w:val="B71C1C"/>
+                <w:sz w:val="14"/>
+                <w:szCs w:val="14"/>
+              </w:rPr>
+              <w:t xml:space="preserve">PT assessment — pelvic control / hip-extension quality</w:t>
+            </w:r>
+          </w:p>
+        </w:tc>
+        <w:tc>
+          <w:tcPr>
+            <w:tcW w:type="dxa" w:w="380"/>
+            <w:tcBorders>
+              <w:top w:val="none" w:color="FFFFFF" w:sz="0"/>
+              <w:left w:val="none" w:color="FFFFFF" w:sz="0"/>
+              <w:bottom w:val="none" w:color="FFFFFF" w:sz="0"/>
+              <w:right w:val="none" w:color="FFFFFF" w:sz="0"/>
+            </w:tcBorders>
+            <w:shd w:fill="FFFFFF" w:color="auto" w:val="clear"/>
+            <w:tcMar>
+              <w:top w:type="dxa" w:w="40"/>
+              <w:left w:type="dxa" w:w="80"/>
+              <w:bottom w:type="dxa" w:w="40"/>
+              <w:right w:type="dxa" w:w="80"/>
+            </w:tcMar>
+            <w:vAlign w:val="center"/>
+          </w:tcPr>
+          <w:p>
+            <w:pPr>
+              <w:jc w:val="center"/>
+            </w:pPr>
+            <w:r>
+              <w:rPr>
+                <w:rFonts w:ascii="Arial" w:cs="Arial" w:eastAsia="Arial" w:hAnsi="Arial"/>
+                <w:color w:val="6B6B6B"/>
+                <w:sz w:val="15"/>
+                <w:szCs w:val="15"/>
+              </w:rPr>
+              <w:t xml:space="preserve">2</w:t>
+            </w:r>
+          </w:p>
+        </w:tc>
+        <w:tc>
+          <w:tcPr>
+            <w:tcW w:type="dxa" w:w="420"/>
+            <w:tcBorders>
+              <w:top w:val="none" w:color="FFFFFF" w:sz="0"/>
+              <w:left w:val="none" w:color="FFFFFF" w:sz="0"/>
+              <w:bottom w:val="none" w:color="FFFFFF" w:sz="0"/>
+              <w:right w:val="none" w:color="FFFFFF" w:sz="0"/>
+            </w:tcBorders>
+            <w:shd w:fill="FFFFFF" w:color="auto" w:val="clear"/>
+            <w:tcMar>
+              <w:top w:type="dxa" w:w="40"/>
+              <w:left w:type="dxa" w:w="80"/>
+              <w:bottom w:type="dxa" w:w="40"/>
+              <w:right w:type="dxa" w:w="80"/>
+            </w:tcMar>
+            <w:vAlign w:val="center"/>
+          </w:tcPr>
+          <w:p>
+            <w:pPr>
+              <w:jc w:val="center"/>
+            </w:pPr>
+            <w:r>
+              <w:rPr>
+                <w:rFonts w:ascii="Arial" w:cs="Arial" w:eastAsia="Arial" w:hAnsi="Arial"/>
+                <w:color w:val="6B6B6B"/>
+                <w:sz w:val="15"/>
+                <w:szCs w:val="15"/>
+              </w:rPr>
+              <w:t xml:space="preserve">8 ea</w:t>
+            </w:r>
+          </w:p>
+        </w:tc>
+        <w:tc>
+          <w:tcPr>
+            <w:tcW w:type="dxa" w:w="680"/>
+            <w:tcBorders>
+              <w:top w:val="none" w:color="FFFFFF" w:sz="0"/>
+              <w:left w:val="none" w:color="FFFFFF" w:sz="0"/>
+              <w:bottom w:val="none" w:color="FFFFFF" w:sz="0"/>
+              <w:right w:val="none" w:color="FFFFFF" w:sz="0"/>
+            </w:tcBorders>
+            <w:shd w:fill="FFFFFF" w:color="auto" w:val="clear"/>
+            <w:tcMar>
+              <w:top w:type="dxa" w:w="40"/>
+              <w:left w:type="dxa" w:w="80"/>
+              <w:bottom w:type="dxa" w:w="40"/>
+              <w:right w:type="dxa" w:w="80"/>
+            </w:tcMar>
+            <w:vAlign w:val="center"/>
+          </w:tcPr>
+          <w:p>
+            <w:pPr>
+              <w:jc w:val="center"/>
+            </w:pPr>
+            <w:r>
+              <w:rPr>
+                <w:rFonts w:ascii="Arial" w:cs="Arial" w:eastAsia="Arial" w:hAnsi="Arial"/>
+                <w:color w:val="6B6B6B"/>
+                <w:sz w:val="15"/>
+                <w:szCs w:val="15"/>
+              </w:rPr>
+              <w:t xml:space="preserve">Bodyweight</w:t>
+            </w:r>
+          </w:p>
+        </w:tc>
+        <w:tc>
+          <w:tcPr>
+            <w:tcW w:type="dxa" w:w="540"/>
+            <w:tcBorders>
+              <w:top w:val="none" w:color="FFFFFF" w:sz="0"/>
+              <w:left w:val="none" w:color="FFFFFF" w:sz="0"/>
+              <w:bottom w:val="none" w:color="FFFFFF" w:sz="0"/>
+              <w:right w:val="none" w:color="FFFFFF" w:sz="0"/>
+            </w:tcBorders>
+            <w:shd w:fill="FFFFFF" w:color="auto" w:val="clear"/>
+            <w:tcMar>
+              <w:top w:type="dxa" w:w="40"/>
+              <w:left w:type="dxa" w:w="80"/>
+              <w:bottom w:type="dxa" w:w="40"/>
+              <w:right w:type="dxa" w:w="80"/>
+            </w:tcMar>
+            <w:vAlign w:val="center"/>
+          </w:tcPr>
+          <w:p>
+            <w:pPr>
+              <w:jc w:val="center"/>
+            </w:pPr>
+            <w:r>
+              <w:rPr>
+                <w:rFonts w:ascii="Arial" w:cs="Arial" w:eastAsia="Arial" w:hAnsi="Arial"/>
+                <w:color w:val="6B6B6B"/>
+                <w:sz w:val="15"/>
+                <w:szCs w:val="15"/>
+              </w:rPr>
+              <w:t xml:space="preserve">2-1-2</w:t>
+            </w:r>
+          </w:p>
+        </w:tc>
+        <w:tc>
+          <w:tcPr>
+            <w:tcW w:type="dxa" w:w="440"/>
+            <w:tcBorders>
+              <w:top w:val="none" w:color="FFFFFF" w:sz="0"/>
+              <w:left w:val="none" w:color="FFFFFF" w:sz="0"/>
+              <w:bottom w:val="none" w:color="FFFFFF" w:sz="0"/>
+              <w:right w:val="none" w:color="FFFFFF" w:sz="0"/>
+            </w:tcBorders>
+            <w:shd w:fill="FFFFFF" w:color="auto" w:val="clear"/>
+            <w:tcMar>
+              <w:top w:type="dxa" w:w="40"/>
+              <w:left w:type="dxa" w:w="80"/>
+              <w:bottom w:type="dxa" w:w="40"/>
+              <w:right w:type="dxa" w:w="80"/>
+            </w:tcMar>
+            <w:vAlign w:val="center"/>
+          </w:tcPr>
+          <w:p>
+            <w:pPr>
+              <w:jc w:val="center"/>
+            </w:pPr>
+            <w:r>
+              <w:rPr>
+                <w:rFonts w:ascii="Arial" w:cs="Arial" w:eastAsia="Arial" w:hAnsi="Arial"/>
+                <w:color w:val="6B6B6B"/>
+                <w:sz w:val="15"/>
+                <w:szCs w:val="15"/>
+              </w:rPr>
+              <w:t xml:space="preserve">30s</w:t>
+            </w:r>
+          </w:p>
+        </w:tc>
+        <w:tc>
+          <w:tcPr>
+            <w:tcW w:type="dxa" w:w="5580"/>
+            <w:tcBorders>
+              <w:top w:val="none" w:color="FFFFFF" w:sz="0"/>
+              <w:left w:val="none" w:color="FFFFFF" w:sz="0"/>
+              <w:bottom w:val="none" w:color="FFFFFF" w:sz="0"/>
+              <w:right w:val="none" w:color="FFFFFF" w:sz="0"/>
+            </w:tcBorders>
+            <w:shd w:fill="FFFFFF" w:color="auto" w:val="clear"/>
+            <w:tcMar>
+              <w:top w:type="dxa" w:w="40"/>
+              <w:left w:type="dxa" w:w="80"/>
+              <w:bottom w:type="dxa" w:w="40"/>
+              <w:right w:type="dxa" w:w="80"/>
+            </w:tcMar>
+            <w:vAlign w:val="center"/>
+          </w:tcPr>
+          <w:p>
+            <w:r>
+              <w:rPr>
+                <w:rFonts w:ascii="Arial" w:cs="Arial" w:eastAsia="Arial" w:hAnsi="Arial"/>
+                <w:color w:val="6B6B6B"/>
+                <w:sz w:val="17"/>
+                <w:szCs w:val="17"/>
+              </w:rPr>
+              <w:t xml:space="preserve">New PT assessment tool. Hips at bench edge, one leg extends behind on a controlled hip-extension arc, opposite leg braces. Watch for pelvic rotation or lumbar compensation each side; quality over load.</w:t>
+            </w:r>
+          </w:p>
+        </w:tc>
+      </w:tr>
     </w:tbl>
     <w:p>
       <w:pPr>
@@ -3747,7 +4014,7 @@
           <w:sz w:val="17"/>
           <w:szCs w:val="17"/>
         </w:rPr>
-        <w:t xml:space="preserve">Week 1 backs down to 95 lbs ×4×4. The 3RM baseline means technique may be under pressure at higher loads. Given the spinal stenosis, form is the absolute priority over load. Hip hinge corrective runs before every set. Add 5 lbs per week when all sets complete with clean hip hinge mechanics. Hex bar only — no conventional barbell. Hip thrust is new this block — hip-dominant and fully spine-safe, it reinforces the hip hinge pattern without any axial load.</w:t>
+        <w:t xml:space="preserve">Week 1 backs down to 95 lbs ×4×4. The 3RM baseline means technique may be under pressure at higher loads. Given the spinal stenosis, form is the absolute priority over load. Hip hinge corrective runs before every set. Add 5 lbs per week when all sets complete with clean hip hinge mechanics. Hex bar only — no conventional barbell. Hip thrust is new this block — hip-dominant and fully spine-safe, it reinforces the hip hinge pattern without any axial load. Your PT has set an explicit longer-arc target of 95 → 135 lbs over 6–8 weeks — this program's Wk1→Wk4 progression (95→120 lbs) is the compatible first step toward that goal.</w:t>
       </w:r>
     </w:p>
     <w:tbl>
@@ -15229,7 +15496,7 @@
           <w:sz w:val="17"/>
           <w:szCs w:val="17"/>
         </w:rPr>
-        <w:t xml:space="preserve">Strength: Hex DL 130+ lbs ×4. Hip Thrust 115+ lbs ×5–6. OHP 22.5 lbs/hand ×8. Incline 22.5 lbs/hand ×8. Flat Press 27.5 lbs/hand ×8. Row 32.5 lbs ×8. Split Squat 37.5 lbs/hand ×8. Landmine Squat progressing in load. Goblet 45 lbs ×10. SL-RDL 32.5 lbs/hand. Carry 50 lbs/hand. Push-up 12 full unassisted. Pull-up 8 reps all grips. Plank 1:30. Sit-up/bicycle crunch and KB swing clean and symptom-free for 3–4+ weeks. Cardiovascular: Day A cardio finisher extends to 20–25 min Zone 2 or 10 rounds of incline intervals; Day B metabolic circuit completes 3 rounds faster than Week 1 at the same loads. Revisit barbell back squat, conventional barbell deadlift, and clean-to-overhead-press for reintroduction once the above is consistent.</w:t>
+        <w:t xml:space="preserve">Strength: Hex DL progressing toward the PT-documented 95→135 lbs / 6–8 week target (Wk4 program checkpoint 120 lbs). Hip Thrust 115+ lbs ×5–6. OHP 22.5 lbs/hand ×8. Incline 22.5 lbs/hand ×8. Flat Press 27.5 lbs/hand ×8. Row 32.5 lbs ×8. Split Squat 37.5 lbs/hand ×8. Landmine Squat progressing in load. Goblet 45 lbs ×10. SL-RDL 32.5 lbs/hand. Carry 50 lbs/hand. Push-up 12 full unassisted. Pull-up 8 reps all grips. Plank 1:30. Single-Leg Reverse Hyper: clean, controlled hip extension with no pelvic rotation either side. Sit-up/bicycle crunch and KB swing clean and symptom-free for 3–4+ weeks. Cardiovascular: Day A cardio finisher extends to 20–25 min Zone 2 or 10 rounds of incline intervals; Day B metabolic circuit completes 3 rounds faster than Week 1 at the same loads. Revisit barbell back squat, conventional barbell deadlift, and clean-to-overhead-press for reintroduction once the above is consistent.</w:t>
       </w:r>
     </w:p>
     <w:p>

</xml_diff>

<commit_message>
Checkpoint: Aimee Morris activation/accessory additions from SOAP note
</commit_message>
<xml_diff>
--- a/clients/aimee_morris/Aimee_Morris_2Day_Training_Plan.docx
+++ b/clients/aimee_morris/Aimee_Morris_2Day_Training_Plan.docx
@@ -2534,6 +2534,31 @@
     </w:p>
     <w:p>
       <w:pPr>
+        <w:spacing w:after="100"/>
+      </w:pPr>
+      <w:r>
+        <w:rPr>
+          <w:rFonts w:ascii="Arial" w:cs="Arial" w:eastAsia="Arial" w:hAnsi="Arial"/>
+          <w:b/>
+          <w:bCs/>
+          <w:color w:val="43A047"/>
+          <w:sz w:val="17"/>
+          <w:szCs w:val="17"/>
+        </w:rPr>
+        <w:t xml:space="preserve">PT Update — 8/10/2026 Session, Additional Activation &amp; Accessory Detail (Jason Bethea):  </w:t>
+      </w:r>
+      <w:r>
+        <w:rPr>
+          <w:rFonts w:ascii="Arial" w:cs="Arial" w:eastAsia="Arial" w:hAnsi="Arial"/>
+          <w:color w:val="2C2C2C"/>
+          <w:sz w:val="17"/>
+          <w:szCs w:val="17"/>
+        </w:rPr>
+        <w:t xml:space="preserve">The same SOAP note above (SOAP_AimeeMorris_2026-08-10.pdf) documented a fuller PT-led warm-up and activation circuit than the headline additions alone captured. Folded in this update: (1) a full-body PVC-stick mobility routine (shoulder passovers, overhead squat with stick, hip openers) used as her actual session opener, added to Day A's warm-up; (2) Kettlebell Hip-Hinge Hang, an isometric hinge-position hold, added to Day A Block A alongside the dynamic hinge drills; (3) Glute Kickback (band or cable), added to Day A Block A — genuinely new, not already covered by the Day B "Keiser/DB Kickback" line, which is a tricep kickback; (4) Standing Hip-Hinge Back Fly and Around-the-World Lateral Raise, real postural/shoulder activation from the same session, added to Day A's warm-up as pre-compound priming ahead of the day's heavier pressing work; (5) Walking Reach documented as a named low-fatigue regression option on the Single-Leg RDL exercise (not programmed as a standing swap — a DOMS-driven one-off accommodation, per the note above).</w:t>
+      </w:r>
+    </w:p>
+    <w:p>
+      <w:pPr>
         <w:spacing w:after="80"/>
       </w:pPr>
     </w:p>
@@ -2729,7 +2754,7 @@
           <w:sz w:val="17"/>
           <w:szCs w:val="17"/>
         </w:rPr>
-        <w:t xml:space="preserve">10 min: 5 min stationary bike or treadmill walk (Zone 2 — cardiovascular warm-in). Then hip hinge rehearsal: PVC or broomstick hip hinge drill 2×10 (spine neutral, hinge from hips not back), glute bridge 2×15, dead bug 2×8 each side (spine decompression before loading), cat-cow 10 slow reps, ankle circles 10 each.</w:t>
+        <w:t xml:space="preserve">10 min: 5 min stationary bike or treadmill walk (Zone 2 — cardiovascular warm-in). Then hip hinge rehearsal: PVC or broomstick hip hinge drill 2×10 (spine neutral, hinge from hips not back), glute bridge 2×15, dead bug 2×8 each side (spine decompression before loading), cat-cow 10 slow reps, ankle circles 10 each. PT-documented stick mobility circuit (from the 8/10 session): PVC/stick shoulder passovers 2×10 (front-to-back overhead pass, shoulder mobility prep ahead of today's pressing work), overhead squat with stick 2×8 (integrated hip/shoulder mobility), hip openers (90/90 or open-book) 8 each side. Shoulder/postural activation: standing hip-hinge back fly 2×10-12 (light DBs, rear delt/upper back, postural anti-hunch), around-the-world lateral raise 2×10 (3-5 lb, full ROM shoulder abduction, shoulders down away from ears).</w:t>
       </w:r>
     </w:p>
     <w:p>
@@ -2770,7 +2795,7 @@
           <w:sz w:val="17"/>
           <w:szCs w:val="17"/>
         </w:rPr>
-        <w:t xml:space="preserve">Hip hinge needs improvement. This means Aimee is currently bending from the lumbar spine rather than hinging from the hip joint. Under load, this puts direct stress on the stenosis. These drills run before every deadlift set until the hinge is reflexive. Hip hinge cue: push the hips BACK toward the wall behind you, not down toward the floor.</w:t>
+        <w:t xml:space="preserve">Hip hinge needs improvement. This means Aimee is currently bending from the lumbar spine rather than hinging from the hip joint. Under load, this puts direct stress on the stenosis. These drills run before every deadlift set until the hinge is reflexive. Hip hinge cue: push the hips BACK toward the wall behind you, not down toward the floor. Kettlebell Hip-Hinge Hang and Glute Kickback are added this update — an isometric hinge-position hold and a targeted hip-extension isolation drill, both reinforcing the same hip-hinge/hip-extension quality this block exists to build.</w:t>
       </w:r>
     </w:p>
     <w:tbl>
@@ -3528,7 +3553,7 @@
                 <w:sz w:val="18"/>
                 <w:szCs w:val="18"/>
               </w:rPr>
-              <w:t xml:space="preserve">Single-Leg Hip Hinge (Bodyweight)</w:t>
+              <w:t xml:space="preserve">Kettlebell Hip-Hinge Hang (Isometric)</w:t>
             </w:r>
           </w:p>
         </w:tc>
@@ -3594,7 +3619,7 @@
                 <w:sz w:val="15"/>
                 <w:szCs w:val="15"/>
               </w:rPr>
-              <w:t xml:space="preserve">8 ea</w:t>
+              <w:t xml:space="preserve">3-5 controlled breaths (hold)</w:t>
             </w:r>
           </w:p>
         </w:tc>
@@ -3627,7 +3652,7 @@
                 <w:sz w:val="15"/>
                 <w:szCs w:val="15"/>
               </w:rPr>
-              <w:t xml:space="preserve">Bodyweight</w:t>
+              <w:t xml:space="preserve">20 lbs KB</w:t>
             </w:r>
           </w:p>
         </w:tc>
@@ -3660,7 +3685,7 @@
                 <w:sz w:val="15"/>
                 <w:szCs w:val="15"/>
               </w:rPr>
-              <w:t xml:space="preserve">3-1-1</w:t>
+              <w:t xml:space="preserve">—</w:t>
             </w:r>
           </w:p>
         </w:tc>
@@ -3723,7 +3748,7 @@
                 <w:sz w:val="17"/>
                 <w:szCs w:val="17"/>
               </w:rPr>
-              <w:t xml:space="preserve">One leg, hinge from the hip, reach toward the floor. Develops hip hinge on each side independently. Left and right equal sets.</w:t>
+              <w:t xml:space="preserve">New this update. Hold at the bottom of the hinge position — neutral spine, lats engaged, no eccentric loading. Builds hinge-position control and time-under-tension awareness without adding load stress before the working sets.</w:t>
             </w:r>
           </w:p>
         </w:tc>
@@ -3757,6 +3782,235 @@
                 <w:sz w:val="18"/>
                 <w:szCs w:val="18"/>
               </w:rPr>
+              <w:t xml:space="preserve">Single-Leg Hip Hinge (Bodyweight)</w:t>
+            </w:r>
+          </w:p>
+        </w:tc>
+        <w:tc>
+          <w:tcPr>
+            <w:tcW w:type="dxa" w:w="380"/>
+            <w:tcBorders>
+              <w:top w:val="none" w:color="FFFFFF" w:sz="0"/>
+              <w:left w:val="none" w:color="FFFFFF" w:sz="0"/>
+              <w:bottom w:val="none" w:color="FFFFFF" w:sz="0"/>
+              <w:right w:val="none" w:color="FFFFFF" w:sz="0"/>
+            </w:tcBorders>
+            <w:shd w:fill="FFFFFF" w:color="auto" w:val="clear"/>
+            <w:tcMar>
+              <w:top w:type="dxa" w:w="40"/>
+              <w:left w:type="dxa" w:w="80"/>
+              <w:bottom w:type="dxa" w:w="40"/>
+              <w:right w:type="dxa" w:w="80"/>
+            </w:tcMar>
+            <w:vAlign w:val="center"/>
+          </w:tcPr>
+          <w:p>
+            <w:pPr>
+              <w:jc w:val="center"/>
+            </w:pPr>
+            <w:r>
+              <w:rPr>
+                <w:rFonts w:ascii="Arial" w:cs="Arial" w:eastAsia="Arial" w:hAnsi="Arial"/>
+                <w:color w:val="6B6B6B"/>
+                <w:sz w:val="15"/>
+                <w:szCs w:val="15"/>
+              </w:rPr>
+              <w:t xml:space="preserve">2</w:t>
+            </w:r>
+          </w:p>
+        </w:tc>
+        <w:tc>
+          <w:tcPr>
+            <w:tcW w:type="dxa" w:w="420"/>
+            <w:tcBorders>
+              <w:top w:val="none" w:color="FFFFFF" w:sz="0"/>
+              <w:left w:val="none" w:color="FFFFFF" w:sz="0"/>
+              <w:bottom w:val="none" w:color="FFFFFF" w:sz="0"/>
+              <w:right w:val="none" w:color="FFFFFF" w:sz="0"/>
+            </w:tcBorders>
+            <w:shd w:fill="FFFFFF" w:color="auto" w:val="clear"/>
+            <w:tcMar>
+              <w:top w:type="dxa" w:w="40"/>
+              <w:left w:type="dxa" w:w="80"/>
+              <w:bottom w:type="dxa" w:w="40"/>
+              <w:right w:type="dxa" w:w="80"/>
+            </w:tcMar>
+            <w:vAlign w:val="center"/>
+          </w:tcPr>
+          <w:p>
+            <w:pPr>
+              <w:jc w:val="center"/>
+            </w:pPr>
+            <w:r>
+              <w:rPr>
+                <w:rFonts w:ascii="Arial" w:cs="Arial" w:eastAsia="Arial" w:hAnsi="Arial"/>
+                <w:color w:val="6B6B6B"/>
+                <w:sz w:val="15"/>
+                <w:szCs w:val="15"/>
+              </w:rPr>
+              <w:t xml:space="preserve">8 ea</w:t>
+            </w:r>
+          </w:p>
+        </w:tc>
+        <w:tc>
+          <w:tcPr>
+            <w:tcW w:type="dxa" w:w="680"/>
+            <w:tcBorders>
+              <w:top w:val="none" w:color="FFFFFF" w:sz="0"/>
+              <w:left w:val="none" w:color="FFFFFF" w:sz="0"/>
+              <w:bottom w:val="none" w:color="FFFFFF" w:sz="0"/>
+              <w:right w:val="none" w:color="FFFFFF" w:sz="0"/>
+            </w:tcBorders>
+            <w:shd w:fill="FFFFFF" w:color="auto" w:val="clear"/>
+            <w:tcMar>
+              <w:top w:type="dxa" w:w="40"/>
+              <w:left w:type="dxa" w:w="80"/>
+              <w:bottom w:type="dxa" w:w="40"/>
+              <w:right w:type="dxa" w:w="80"/>
+            </w:tcMar>
+            <w:vAlign w:val="center"/>
+          </w:tcPr>
+          <w:p>
+            <w:pPr>
+              <w:jc w:val="center"/>
+            </w:pPr>
+            <w:r>
+              <w:rPr>
+                <w:rFonts w:ascii="Arial" w:cs="Arial" w:eastAsia="Arial" w:hAnsi="Arial"/>
+                <w:color w:val="6B6B6B"/>
+                <w:sz w:val="15"/>
+                <w:szCs w:val="15"/>
+              </w:rPr>
+              <w:t xml:space="preserve">Bodyweight</w:t>
+            </w:r>
+          </w:p>
+        </w:tc>
+        <w:tc>
+          <w:tcPr>
+            <w:tcW w:type="dxa" w:w="540"/>
+            <w:tcBorders>
+              <w:top w:val="none" w:color="FFFFFF" w:sz="0"/>
+              <w:left w:val="none" w:color="FFFFFF" w:sz="0"/>
+              <w:bottom w:val="none" w:color="FFFFFF" w:sz="0"/>
+              <w:right w:val="none" w:color="FFFFFF" w:sz="0"/>
+            </w:tcBorders>
+            <w:shd w:fill="FFFFFF" w:color="auto" w:val="clear"/>
+            <w:tcMar>
+              <w:top w:type="dxa" w:w="40"/>
+              <w:left w:type="dxa" w:w="80"/>
+              <w:bottom w:type="dxa" w:w="40"/>
+              <w:right w:type="dxa" w:w="80"/>
+            </w:tcMar>
+            <w:vAlign w:val="center"/>
+          </w:tcPr>
+          <w:p>
+            <w:pPr>
+              <w:jc w:val="center"/>
+            </w:pPr>
+            <w:r>
+              <w:rPr>
+                <w:rFonts w:ascii="Arial" w:cs="Arial" w:eastAsia="Arial" w:hAnsi="Arial"/>
+                <w:color w:val="6B6B6B"/>
+                <w:sz w:val="15"/>
+                <w:szCs w:val="15"/>
+              </w:rPr>
+              <w:t xml:space="preserve">3-1-1</w:t>
+            </w:r>
+          </w:p>
+        </w:tc>
+        <w:tc>
+          <w:tcPr>
+            <w:tcW w:type="dxa" w:w="440"/>
+            <w:tcBorders>
+              <w:top w:val="none" w:color="FFFFFF" w:sz="0"/>
+              <w:left w:val="none" w:color="FFFFFF" w:sz="0"/>
+              <w:bottom w:val="none" w:color="FFFFFF" w:sz="0"/>
+              <w:right w:val="none" w:color="FFFFFF" w:sz="0"/>
+            </w:tcBorders>
+            <w:shd w:fill="FFFFFF" w:color="auto" w:val="clear"/>
+            <w:tcMar>
+              <w:top w:type="dxa" w:w="40"/>
+              <w:left w:type="dxa" w:w="80"/>
+              <w:bottom w:type="dxa" w:w="40"/>
+              <w:right w:type="dxa" w:w="80"/>
+            </w:tcMar>
+            <w:vAlign w:val="center"/>
+          </w:tcPr>
+          <w:p>
+            <w:pPr>
+              <w:jc w:val="center"/>
+            </w:pPr>
+            <w:r>
+              <w:rPr>
+                <w:rFonts w:ascii="Arial" w:cs="Arial" w:eastAsia="Arial" w:hAnsi="Arial"/>
+                <w:color w:val="6B6B6B"/>
+                <w:sz w:val="15"/>
+                <w:szCs w:val="15"/>
+              </w:rPr>
+              <w:t xml:space="preserve">30s</w:t>
+            </w:r>
+          </w:p>
+        </w:tc>
+        <w:tc>
+          <w:tcPr>
+            <w:tcW w:type="dxa" w:w="5580"/>
+            <w:tcBorders>
+              <w:top w:val="none" w:color="FFFFFF" w:sz="0"/>
+              <w:left w:val="none" w:color="FFFFFF" w:sz="0"/>
+              <w:bottom w:val="none" w:color="FFFFFF" w:sz="0"/>
+              <w:right w:val="none" w:color="FFFFFF" w:sz="0"/>
+            </w:tcBorders>
+            <w:shd w:fill="FFFFFF" w:color="auto" w:val="clear"/>
+            <w:tcMar>
+              <w:top w:type="dxa" w:w="40"/>
+              <w:left w:type="dxa" w:w="80"/>
+              <w:bottom w:type="dxa" w:w="40"/>
+              <w:right w:type="dxa" w:w="80"/>
+            </w:tcMar>
+            <w:vAlign w:val="center"/>
+          </w:tcPr>
+          <w:p>
+            <w:r>
+              <w:rPr>
+                <w:rFonts w:ascii="Arial" w:cs="Arial" w:eastAsia="Arial" w:hAnsi="Arial"/>
+                <w:color w:val="6B6B6B"/>
+                <w:sz w:val="17"/>
+                <w:szCs w:val="17"/>
+              </w:rPr>
+              <w:t xml:space="preserve">One leg, hinge from the hip, reach toward the floor. Develops hip hinge on each side independently. Left and right equal sets.</w:t>
+            </w:r>
+          </w:p>
+        </w:tc>
+      </w:tr>
+      <w:tr>
+        <w:tc>
+          <w:tcPr>
+            <w:tcW w:type="dxa" w:w="2400"/>
+            <w:tcBorders>
+              <w:top w:val="none" w:color="FFFFFF" w:sz="0"/>
+              <w:left w:val="none" w:color="FFFFFF" w:sz="0"/>
+              <w:bottom w:val="none" w:color="FFFFFF" w:sz="0"/>
+              <w:right w:val="none" w:color="FFFFFF" w:sz="0"/>
+            </w:tcBorders>
+            <w:shd w:fill="FFF5F5" w:color="auto" w:val="clear"/>
+            <w:tcMar>
+              <w:top w:type="dxa" w:w="40"/>
+              <w:left w:type="dxa" w:w="80"/>
+              <w:bottom w:type="dxa" w:w="40"/>
+              <w:right w:type="dxa" w:w="80"/>
+            </w:tcMar>
+            <w:vAlign w:val="center"/>
+          </w:tcPr>
+          <w:p>
+            <w:r>
+              <w:rPr>
+                <w:rFonts w:ascii="Arial" w:cs="Arial" w:eastAsia="Arial" w:hAnsi="Arial"/>
+                <w:b/>
+                <w:bCs/>
+                <w:color w:val="2C2C2C"/>
+                <w:sz w:val="18"/>
+                <w:szCs w:val="18"/>
+              </w:rPr>
               <w:t xml:space="preserve">Single-Leg Reverse Hyper (Bench-Supported, Assessment)</w:t>
             </w:r>
           </w:p>
@@ -3783,7 +4037,7 @@
               <w:bottom w:val="none" w:color="FFFFFF" w:sz="0"/>
               <w:right w:val="none" w:color="FFFFFF" w:sz="0"/>
             </w:tcBorders>
-            <w:shd w:fill="FFFFFF" w:color="auto" w:val="clear"/>
+            <w:shd w:fill="FFF5F5" w:color="auto" w:val="clear"/>
             <w:tcMar>
               <w:top w:type="dxa" w:w="40"/>
               <w:left w:type="dxa" w:w="80"/>
@@ -3816,7 +4070,7 @@
               <w:bottom w:val="none" w:color="FFFFFF" w:sz="0"/>
               <w:right w:val="none" w:color="FFFFFF" w:sz="0"/>
             </w:tcBorders>
-            <w:shd w:fill="FFFFFF" w:color="auto" w:val="clear"/>
+            <w:shd w:fill="FFF5F5" w:color="auto" w:val="clear"/>
             <w:tcMar>
               <w:top w:type="dxa" w:w="40"/>
               <w:left w:type="dxa" w:w="80"/>
@@ -3849,7 +4103,7 @@
               <w:bottom w:val="none" w:color="FFFFFF" w:sz="0"/>
               <w:right w:val="none" w:color="FFFFFF" w:sz="0"/>
             </w:tcBorders>
-            <w:shd w:fill="FFFFFF" w:color="auto" w:val="clear"/>
+            <w:shd w:fill="FFF5F5" w:color="auto" w:val="clear"/>
             <w:tcMar>
               <w:top w:type="dxa" w:w="40"/>
               <w:left w:type="dxa" w:w="80"/>
@@ -3882,7 +4136,7 @@
               <w:bottom w:val="none" w:color="FFFFFF" w:sz="0"/>
               <w:right w:val="none" w:color="FFFFFF" w:sz="0"/>
             </w:tcBorders>
-            <w:shd w:fill="FFFFFF" w:color="auto" w:val="clear"/>
+            <w:shd w:fill="FFF5F5" w:color="auto" w:val="clear"/>
             <w:tcMar>
               <w:top w:type="dxa" w:w="40"/>
               <w:left w:type="dxa" w:w="80"/>
@@ -3915,7 +4169,7 @@
               <w:bottom w:val="none" w:color="FFFFFF" w:sz="0"/>
               <w:right w:val="none" w:color="FFFFFF" w:sz="0"/>
             </w:tcBorders>
-            <w:shd w:fill="FFFFFF" w:color="auto" w:val="clear"/>
+            <w:shd w:fill="FFF5F5" w:color="auto" w:val="clear"/>
             <w:tcMar>
               <w:top w:type="dxa" w:w="40"/>
               <w:left w:type="dxa" w:w="80"/>
@@ -3948,7 +4202,7 @@
               <w:bottom w:val="none" w:color="FFFFFF" w:sz="0"/>
               <w:right w:val="none" w:color="FFFFFF" w:sz="0"/>
             </w:tcBorders>
-            <w:shd w:fill="FFFFFF" w:color="auto" w:val="clear"/>
+            <w:shd w:fill="FFF5F5" w:color="auto" w:val="clear"/>
             <w:tcMar>
               <w:top w:type="dxa" w:w="40"/>
               <w:left w:type="dxa" w:w="80"/>
@@ -3966,6 +4220,235 @@
                 <w:szCs w:val="17"/>
               </w:rPr>
               <w:t xml:space="preserve">New PT assessment tool. Hips at bench edge, one leg extends behind on a controlled hip-extension arc, opposite leg braces. Watch for pelvic rotation or lumbar compensation each side; quality over load.</w:t>
+            </w:r>
+          </w:p>
+        </w:tc>
+      </w:tr>
+      <w:tr>
+        <w:tc>
+          <w:tcPr>
+            <w:tcW w:type="dxa" w:w="2400"/>
+            <w:tcBorders>
+              <w:top w:val="none" w:color="FFFFFF" w:sz="0"/>
+              <w:left w:val="none" w:color="FFFFFF" w:sz="0"/>
+              <w:bottom w:val="none" w:color="FFFFFF" w:sz="0"/>
+              <w:right w:val="none" w:color="FFFFFF" w:sz="0"/>
+            </w:tcBorders>
+            <w:shd w:fill="FFFFFF" w:color="auto" w:val="clear"/>
+            <w:tcMar>
+              <w:top w:type="dxa" w:w="40"/>
+              <w:left w:type="dxa" w:w="80"/>
+              <w:bottom w:type="dxa" w:w="40"/>
+              <w:right w:type="dxa" w:w="80"/>
+            </w:tcMar>
+            <w:vAlign w:val="center"/>
+          </w:tcPr>
+          <w:p>
+            <w:r>
+              <w:rPr>
+                <w:rFonts w:ascii="Arial" w:cs="Arial" w:eastAsia="Arial" w:hAnsi="Arial"/>
+                <w:b/>
+                <w:bCs/>
+                <w:color w:val="2C2C2C"/>
+                <w:sz w:val="18"/>
+                <w:szCs w:val="18"/>
+              </w:rPr>
+              <w:t xml:space="preserve">Glute Kickback (Band or Cable)</w:t>
+            </w:r>
+          </w:p>
+        </w:tc>
+        <w:tc>
+          <w:tcPr>
+            <w:tcW w:type="dxa" w:w="380"/>
+            <w:tcBorders>
+              <w:top w:val="none" w:color="FFFFFF" w:sz="0"/>
+              <w:left w:val="none" w:color="FFFFFF" w:sz="0"/>
+              <w:bottom w:val="none" w:color="FFFFFF" w:sz="0"/>
+              <w:right w:val="none" w:color="FFFFFF" w:sz="0"/>
+            </w:tcBorders>
+            <w:shd w:fill="FFFFFF" w:color="auto" w:val="clear"/>
+            <w:tcMar>
+              <w:top w:type="dxa" w:w="40"/>
+              <w:left w:type="dxa" w:w="80"/>
+              <w:bottom w:type="dxa" w:w="40"/>
+              <w:right w:type="dxa" w:w="80"/>
+            </w:tcMar>
+            <w:vAlign w:val="center"/>
+          </w:tcPr>
+          <w:p>
+            <w:pPr>
+              <w:jc w:val="center"/>
+            </w:pPr>
+            <w:r>
+              <w:rPr>
+                <w:rFonts w:ascii="Arial" w:cs="Arial" w:eastAsia="Arial" w:hAnsi="Arial"/>
+                <w:color w:val="6B6B6B"/>
+                <w:sz w:val="15"/>
+                <w:szCs w:val="15"/>
+              </w:rPr>
+              <w:t xml:space="preserve">2-3</w:t>
+            </w:r>
+          </w:p>
+        </w:tc>
+        <w:tc>
+          <w:tcPr>
+            <w:tcW w:type="dxa" w:w="420"/>
+            <w:tcBorders>
+              <w:top w:val="none" w:color="FFFFFF" w:sz="0"/>
+              <w:left w:val="none" w:color="FFFFFF" w:sz="0"/>
+              <w:bottom w:val="none" w:color="FFFFFF" w:sz="0"/>
+              <w:right w:val="none" w:color="FFFFFF" w:sz="0"/>
+            </w:tcBorders>
+            <w:shd w:fill="FFFFFF" w:color="auto" w:val="clear"/>
+            <w:tcMar>
+              <w:top w:type="dxa" w:w="40"/>
+              <w:left w:type="dxa" w:w="80"/>
+              <w:bottom w:type="dxa" w:w="40"/>
+              <w:right w:type="dxa" w:w="80"/>
+            </w:tcMar>
+            <w:vAlign w:val="center"/>
+          </w:tcPr>
+          <w:p>
+            <w:pPr>
+              <w:jc w:val="center"/>
+            </w:pPr>
+            <w:r>
+              <w:rPr>
+                <w:rFonts w:ascii="Arial" w:cs="Arial" w:eastAsia="Arial" w:hAnsi="Arial"/>
+                <w:color w:val="6B6B6B"/>
+                <w:sz w:val="15"/>
+                <w:szCs w:val="15"/>
+              </w:rPr>
+              <w:t xml:space="preserve">12/side</w:t>
+            </w:r>
+          </w:p>
+        </w:tc>
+        <w:tc>
+          <w:tcPr>
+            <w:tcW w:type="dxa" w:w="680"/>
+            <w:tcBorders>
+              <w:top w:val="none" w:color="FFFFFF" w:sz="0"/>
+              <w:left w:val="none" w:color="FFFFFF" w:sz="0"/>
+              <w:bottom w:val="none" w:color="FFFFFF" w:sz="0"/>
+              <w:right w:val="none" w:color="FFFFFF" w:sz="0"/>
+            </w:tcBorders>
+            <w:shd w:fill="FFFFFF" w:color="auto" w:val="clear"/>
+            <w:tcMar>
+              <w:top w:type="dxa" w:w="40"/>
+              <w:left w:type="dxa" w:w="80"/>
+              <w:bottom w:type="dxa" w:w="40"/>
+              <w:right w:type="dxa" w:w="80"/>
+            </w:tcMar>
+            <w:vAlign w:val="center"/>
+          </w:tcPr>
+          <w:p>
+            <w:pPr>
+              <w:jc w:val="center"/>
+            </w:pPr>
+            <w:r>
+              <w:rPr>
+                <w:rFonts w:ascii="Arial" w:cs="Arial" w:eastAsia="Arial" w:hAnsi="Arial"/>
+                <w:color w:val="6B6B6B"/>
+                <w:sz w:val="15"/>
+                <w:szCs w:val="15"/>
+              </w:rPr>
+              <w:t xml:space="preserve">Band or cable — light-mod</w:t>
+            </w:r>
+          </w:p>
+        </w:tc>
+        <w:tc>
+          <w:tcPr>
+            <w:tcW w:type="dxa" w:w="540"/>
+            <w:tcBorders>
+              <w:top w:val="none" w:color="FFFFFF" w:sz="0"/>
+              <w:left w:val="none" w:color="FFFFFF" w:sz="0"/>
+              <w:bottom w:val="none" w:color="FFFFFF" w:sz="0"/>
+              <w:right w:val="none" w:color="FFFFFF" w:sz="0"/>
+            </w:tcBorders>
+            <w:shd w:fill="FFFFFF" w:color="auto" w:val="clear"/>
+            <w:tcMar>
+              <w:top w:type="dxa" w:w="40"/>
+              <w:left w:type="dxa" w:w="80"/>
+              <w:bottom w:type="dxa" w:w="40"/>
+              <w:right w:type="dxa" w:w="80"/>
+            </w:tcMar>
+            <w:vAlign w:val="center"/>
+          </w:tcPr>
+          <w:p>
+            <w:pPr>
+              <w:jc w:val="center"/>
+            </w:pPr>
+            <w:r>
+              <w:rPr>
+                <w:rFonts w:ascii="Arial" w:cs="Arial" w:eastAsia="Arial" w:hAnsi="Arial"/>
+                <w:color w:val="6B6B6B"/>
+                <w:sz w:val="15"/>
+                <w:szCs w:val="15"/>
+              </w:rPr>
+              <w:t xml:space="preserve">Controlled</w:t>
+            </w:r>
+          </w:p>
+        </w:tc>
+        <w:tc>
+          <w:tcPr>
+            <w:tcW w:type="dxa" w:w="440"/>
+            <w:tcBorders>
+              <w:top w:val="none" w:color="FFFFFF" w:sz="0"/>
+              <w:left w:val="none" w:color="FFFFFF" w:sz="0"/>
+              <w:bottom w:val="none" w:color="FFFFFF" w:sz="0"/>
+              <w:right w:val="none" w:color="FFFFFF" w:sz="0"/>
+            </w:tcBorders>
+            <w:shd w:fill="FFFFFF" w:color="auto" w:val="clear"/>
+            <w:tcMar>
+              <w:top w:type="dxa" w:w="40"/>
+              <w:left w:type="dxa" w:w="80"/>
+              <w:bottom w:type="dxa" w:w="40"/>
+              <w:right w:type="dxa" w:w="80"/>
+            </w:tcMar>
+            <w:vAlign w:val="center"/>
+          </w:tcPr>
+          <w:p>
+            <w:pPr>
+              <w:jc w:val="center"/>
+            </w:pPr>
+            <w:r>
+              <w:rPr>
+                <w:rFonts w:ascii="Arial" w:cs="Arial" w:eastAsia="Arial" w:hAnsi="Arial"/>
+                <w:color w:val="6B6B6B"/>
+                <w:sz w:val="15"/>
+                <w:szCs w:val="15"/>
+              </w:rPr>
+              <w:t xml:space="preserve">30s</w:t>
+            </w:r>
+          </w:p>
+        </w:tc>
+        <w:tc>
+          <w:tcPr>
+            <w:tcW w:type="dxa" w:w="5580"/>
+            <w:tcBorders>
+              <w:top w:val="none" w:color="FFFFFF" w:sz="0"/>
+              <w:left w:val="none" w:color="FFFFFF" w:sz="0"/>
+              <w:bottom w:val="none" w:color="FFFFFF" w:sz="0"/>
+              <w:right w:val="none" w:color="FFFFFF" w:sz="0"/>
+            </w:tcBorders>
+            <w:shd w:fill="FFFFFF" w:color="auto" w:val="clear"/>
+            <w:tcMar>
+              <w:top w:type="dxa" w:w="40"/>
+              <w:left w:type="dxa" w:w="80"/>
+              <w:bottom w:type="dxa" w:w="40"/>
+              <w:right w:type="dxa" w:w="80"/>
+            </w:tcMar>
+            <w:vAlign w:val="center"/>
+          </w:tcPr>
+          <w:p>
+            <w:r>
+              <w:rPr>
+                <w:rFonts w:ascii="Arial" w:cs="Arial" w:eastAsia="Arial" w:hAnsi="Arial"/>
+                <w:color w:val="6B6B6B"/>
+                <w:sz w:val="17"/>
+                <w:szCs w:val="17"/>
+              </w:rPr>
+              <w:t xml:space="preserve">New this update. Standing or quadruped hip extension, squeeze glute at end range, avoid lumbar extension/compensation. Isolated hip-extension activation reinforcing the hinge and hip thrust patterns above.</w:t>
             </w:r>
           </w:p>
         </w:tc>
@@ -6004,6 +6487,19 @@
                 <w:szCs w:val="18"/>
               </w:rPr>
               <w:t xml:space="preserve">Single-Leg RDL (DB)</w:t>
+            </w:r>
+          </w:p>
+          <w:p>
+            <w:r>
+              <w:rPr>
+                <w:rFonts w:ascii="Arial" w:cs="Arial" w:eastAsia="Arial" w:hAnsi="Arial"/>
+                <w:i/>
+                <w:iCs/>
+                <w:color w:val="6B6B6B"/>
+                <w:sz w:val="14"/>
+                <w:szCs w:val="14"/>
+              </w:rPr>
+              <w:t xml:space="preserve">Documented low-fatigue regression option: Walking Reach (a hip-hinge reach pattern without the single-leg balance demand) — available on a high-DOMS/high-fatigue day; not a standing swap, use only as needed.</w:t>
             </w:r>
           </w:p>
         </w:tc>

</xml_diff>

<commit_message>
Aimee Morris: RIR instrumentation and warm-up restructure (agent still finalizing)
</commit_message>
<xml_diff>
--- a/clients/aimee_morris/Aimee_Morris_2Day_Training_Plan.docx
+++ b/clients/aimee_morris/Aimee_Morris_2Day_Training_Plan.docx
@@ -2330,6 +2330,31 @@
           <w:szCs w:val="17"/>
         </w:rPr>
         <w:t xml:space="preserve">Aimee tested at 5 reps each in neutral, wide, and standard grip — a solid assisted baseline. The program runs pull-up progression systematically, tracking all three grips. Neutral grip leads (most shoulder-friendly), standard and wide grips progress alongside.</w:t>
+      </w:r>
+    </w:p>
+    <w:p>
+      <w:pPr>
+        <w:spacing w:after="100"/>
+      </w:pPr>
+      <w:r>
+        <w:rPr>
+          <w:rFonts w:ascii="Arial" w:cs="Arial" w:eastAsia="Arial" w:hAnsi="Arial"/>
+          <w:b/>
+          <w:bCs/>
+          <w:color w:val="C9A227"/>
+          <w:sz w:val="17"/>
+          <w:szCs w:val="17"/>
+        </w:rPr>
+        <w:t xml:space="preserve">How Hard Each Set Should Feel — Reps In Reserve (RIR):  </w:t>
+      </w:r>
+      <w:r>
+        <w:rPr>
+          <w:rFonts w:ascii="Arial" w:cs="Arial" w:eastAsia="Arial" w:hAnsi="Arial"/>
+          <w:color w:val="2C2C2C"/>
+          <w:sz w:val="17"/>
+          <w:szCs w:val="17"/>
+        </w:rPr>
+        <w:t xml:space="preserve">Most working sets in this program now carry an RIR target — the number of clean reps you could still have completed at the moment you racked the weight. 2 RIR is the default on the primary lifts (hex bar deadlift, hip thrust, flat bench press, overhead press, incline press, split squat, goblet squat, chest-supported row): finish each set with two good reps left, not grinding. 1 RIR is used only where the goal is muscle growth rather than peak strength — lateral raises, incline push-up volume, tricep work. Anything marked technique/sub-maximal sits deliberately further from failure than that: the correctives, the shoulder activation, and every movement still being established (landmine squat, reverse lunge, glute kickback). There is no meaningful difference between three, four or five reps in reserve, so do not try to hit a precise number there — just stay clearly short of hard. Some work carries no RIR target at all, on purpose: farmer carries are governed by distance and posture, planks by time, the correctives by hinge quality, and the cardio finishers and metabolic circuit by the clock and by movement quality. Given the stenosis history, training to true failure is not required and is not the goal on any lift in this program. Calibration for the first few weeks: on one sub-maximal set of a new movement, call out the RIR you think you have left, then take that same set to true failure and compare. Once your call is within one rep two sessions running, your own RIR is reliable enough to drive load increases on its own.</w:t>
       </w:r>
     </w:p>
     <w:p>
@@ -2554,7 +2579,7 @@
           <w:sz w:val="17"/>
           <w:szCs w:val="17"/>
         </w:rPr>
-        <w:t xml:space="preserve">The same SOAP note above (SOAP_AimeeMorris_2026-08-10.pdf) documented a fuller PT-led warm-up and activation circuit than the headline additions alone captured. Folded in this update: (1) a full-body PVC-stick mobility routine (shoulder passovers, overhead squat with stick, hip openers) used as her actual session opener, added to Day A's warm-up; (2) Kettlebell Hip-Hinge Hang, an isometric hinge-position hold, added to Day A Block A alongside the dynamic hinge drills; (3) Glute Kickback (band or cable), added to Day A Block A — genuinely new, not already covered by the Day B "Keiser/DB Kickback" line, which is a tricep kickback; (4) Standing Hip-Hinge Back Fly and Around-the-World Lateral Raise, real postural/shoulder activation from the same session, added to Day A's warm-up as pre-compound priming ahead of the day's heavier pressing work; (5) Walking Reach documented as a named low-fatigue regression option on the Single-Leg RDL exercise (not programmed as a standing swap — a DOMS-driven one-off accommodation, per the note above).</w:t>
+        <w:t xml:space="preserve">The same SOAP note above (SOAP_AimeeMorris_2026-08-10.pdf) documented a fuller PT-led warm-up and activation circuit than the headline additions alone captured. Folded in this update: (1) a full-body PVC-stick mobility routine (shoulder passovers, overhead squat with stick, hip openers) used as her actual session opener, added to Day A's warm-up; (2) Kettlebell Hip-Hinge Hang, an isometric hinge-position hold, added to Day A Block A alongside the dynamic hinge drills; (3) Glute Kickback (band or cable), added to Day A Block A — genuinely new, not already covered by the Day B "Keiser/DB Kickback" line, which is a tricep kickback; (4) Standing Hip-Hinge Back Fly and Around-the-World Lateral Raise, real postural/shoulder activation from the same session, now programmed as Day A Block C (Shoulder &amp; Postural Activation) with full sets/load/tempo/rest and RIR — they were originally folded into Day A's warm-up prose, which gave two genuinely loaded, rep-prescribed exercises no load columns, no progression, and no visibility to exercise-table audits (restructured 8/18/2026); (5) Walking Reach documented as a named low-fatigue regression option on the Single-Leg RDL exercise (not programmed as a standing swap — a DOMS-driven one-off accommodation, per the note above).</w:t>
       </w:r>
     </w:p>
     <w:p>
@@ -2754,7 +2779,7 @@
           <w:sz w:val="17"/>
           <w:szCs w:val="17"/>
         </w:rPr>
-        <w:t xml:space="preserve">10 min: 5 min stationary bike or treadmill walk (Zone 2 — cardiovascular warm-in). Then hip hinge rehearsal: PVC or broomstick hip hinge drill 2×10 (spine neutral, hinge from hips not back), glute bridge 2×15, dead bug 2×8 each side (spine decompression before loading), cat-cow 10 slow reps, ankle circles 10 each. PT-documented stick mobility circuit (from the 8/10 session): PVC/stick shoulder passovers 2×10 (front-to-back overhead pass, shoulder mobility prep ahead of today's pressing work), overhead squat with stick 2×8 (integrated hip/shoulder mobility), hip openers (90/90 or open-book) 8 each side. Shoulder/postural activation: standing hip-hinge back fly 2×10-12 (light DBs, rear delt/upper back, postural anti-hunch), around-the-world lateral raise 2×10 (3-5 lb, full ROM shoulder abduction, shoulders down away from ears).</w:t>
+        <w:t xml:space="preserve">10 min: 5 min stationary bike or treadmill walk (Zone 2 — cardiovascular warm-in). Then hip hinge rehearsal: PVC or broomstick hip hinge drill 2×10 (spine neutral, hinge from hips not back), glute bridge 2×15, dead bug 2×8 each side (spine decompression before loading), cat-cow 10 slow reps, ankle circles 10 each. PT-documented stick mobility circuit (from the 8/10 session): PVC/stick shoulder passovers 2×10 (front-to-back overhead pass, shoulder mobility prep ahead of today's pressing work), overhead squat with stick 2×8 (integrated hip/shoulder mobility), hip openers (90/90 or open-book) 8 each side. Shoulder and postural activation is not part of the warm-up — it runs as its own block (Block C) immediately before the pressing work, so it can be loaded and progressed properly.</w:t>
       </w:r>
     </w:p>
     <w:p>
@@ -2795,7 +2820,7 @@
           <w:sz w:val="17"/>
           <w:szCs w:val="17"/>
         </w:rPr>
-        <w:t xml:space="preserve">Hip hinge needs improvement. This means Aimee is currently bending from the lumbar spine rather than hinging from the hip joint. Under load, this puts direct stress on the stenosis. These drills run before every deadlift set until the hinge is reflexive. Hip hinge cue: push the hips BACK toward the wall behind you, not down toward the floor. Kettlebell Hip-Hinge Hang and Glute Kickback are added this update — an isometric hinge-position hold and a targeted hip-extension isolation drill, both reinforcing the same hip-hinge/hip-extension quality this block exists to build.</w:t>
+        <w:t xml:space="preserve">Hip hinge needs improvement. This means Aimee is currently bending from the lumbar spine rather than hinging from the hip joint. Under load, this puts direct stress on the stenosis. These drills run before every deadlift set until the hinge is reflexive. Hip hinge cue: push the hips BACK toward the wall behind you, not down toward the floor. Kettlebell Hip-Hinge Hang and Glute Kickback are added this update — an isometric hinge-position hold and a targeted hip-extension isolation drill, both reinforcing the same hip-hinge/hip-extension quality this block exists to build. This whole block is quality-governed, not RIR-governed: the drills end when the hinge position degrades, never when the muscle fatigues, so no reps-in-reserve target is set on them.</w:t>
       </w:r>
     </w:p>
     <w:tbl>
@@ -4449,6 +4474,17 @@
                 <w:szCs w:val="17"/>
               </w:rPr>
               <w:t xml:space="preserve">New this update. Standing or quadruped hip extension, squeeze glute at end range, avoid lumbar extension/compensation. Isolated hip-extension activation reinforcing the hinge and hip thrust patterns above.</w:t>
+            </w:r>
+            <w:r>
+              <w:rPr>
+                <w:rFonts w:ascii="Arial" w:cs="Arial" w:eastAsia="Arial" w:hAnsi="Arial"/>
+                <w:i/>
+                <w:iCs/>
+                <w:color w:val="00695C"/>
+                <w:sz w:val="14"/>
+                <w:szCs w:val="14"/>
+              </w:rPr>
+              <w:t xml:space="preserve">  Technique/sub-maximal — activation, well short of failure</w:t>
             </w:r>
           </w:p>
         </w:tc>
@@ -4994,6 +5030,17 @@
               </w:rPr>
               <w:t xml:space="preserve">Hex bar reduces lumbar shear vs conventional deadlift — appropriate for spinal stenosis. Stand centered. Hinge hips back to grip handles. Drive floor away. Hips and shoulders rise together. Lockout at top. Hip hinge drill before each set.</w:t>
             </w:r>
+            <w:r>
+              <w:rPr>
+                <w:rFonts w:ascii="Arial" w:cs="Arial" w:eastAsia="Arial" w:hAnsi="Arial"/>
+                <w:i/>
+                <w:iCs/>
+                <w:color w:val="00695C"/>
+                <w:sz w:val="14"/>
+                <w:szCs w:val="14"/>
+              </w:rPr>
+              <w:t xml:space="preserve">  2 RIR — primary lift</w:t>
+            </w:r>
           </w:p>
         </w:tc>
       </w:tr>
@@ -5223,6 +5270,17 @@
               </w:rPr>
               <w:t xml:space="preserve">New baseline 95 lbs. Upper back on bench, drive hips to full extension, squeeze glutes hard at top. Hip-dominant — no axial spinal load, one of the safest heavy-loading options for spinal stenosis.</w:t>
             </w:r>
+            <w:r>
+              <w:rPr>
+                <w:rFonts w:ascii="Arial" w:cs="Arial" w:eastAsia="Arial" w:hAnsi="Arial"/>
+                <w:i/>
+                <w:iCs/>
+                <w:color w:val="00695C"/>
+                <w:sz w:val="14"/>
+                <w:szCs w:val="14"/>
+              </w:rPr>
+              <w:t xml:space="preserve">  2 RIR — primary lift</w:t>
+            </w:r>
           </w:p>
         </w:tc>
       </w:tr>
@@ -5452,6 +5510,17 @@
               </w:rPr>
               <w:t xml:space="preserve">New baseline 20 lbs ×5RM. Fully supine, full back support — one of the safest presses for spinal stenosis. Full range, control the descent, drive up without arching off the bench.</w:t>
             </w:r>
+            <w:r>
+              <w:rPr>
+                <w:rFonts w:ascii="Arial" w:cs="Arial" w:eastAsia="Arial" w:hAnsi="Arial"/>
+                <w:i/>
+                <w:iCs/>
+                <w:color w:val="00695C"/>
+                <w:sz w:val="14"/>
+                <w:szCs w:val="14"/>
+              </w:rPr>
+              <w:t xml:space="preserve">  2 RIR — primary lift</w:t>
+            </w:r>
           </w:p>
         </w:tc>
       </w:tr>
@@ -5680,6 +5749,838 @@
                 <w:szCs w:val="17"/>
               </w:rPr>
               <w:t xml:space="preserve">Hip hinge, soft knee, full hamstring stretch at bottom. DBs track close to legs. Builds hip hinge volume after the hex bar primary work. Keep spine long throughout — no rounding.</w:t>
+            </w:r>
+            <w:r>
+              <w:rPr>
+                <w:rFonts w:ascii="Arial" w:cs="Arial" w:eastAsia="Arial" w:hAnsi="Arial"/>
+                <w:i/>
+                <w:iCs/>
+                <w:color w:val="00695C"/>
+                <w:sz w:val="14"/>
+                <w:szCs w:val="14"/>
+              </w:rPr>
+              <w:t xml:space="preserve">  2 RIR — compound accessory</w:t>
+            </w:r>
+          </w:p>
+        </w:tc>
+      </w:tr>
+    </w:tbl>
+    <w:p>
+      <w:pPr>
+        <w:spacing w:after="100"/>
+      </w:pPr>
+    </w:p>
+    <w:p>
+      <w:pPr>
+        <w:spacing w:after="60" w:before="120"/>
+      </w:pPr>
+      <w:r>
+        <w:rPr>
+          <w:rFonts w:ascii="Arial" w:cs="Arial" w:eastAsia="Arial" w:hAnsi="Arial"/>
+          <w:b/>
+          <w:bCs/>
+          <w:color w:val="C9A227"/>
+          <w:sz w:val="17"/>
+          <w:szCs w:val="17"/>
+        </w:rPr>
+        <w:t xml:space="preserve">C — SHOULDER &amp; POSTURAL ACTIVATION</w:t>
+      </w:r>
+    </w:p>
+    <w:p>
+      <w:pPr>
+        <w:spacing w:after="80"/>
+      </w:pPr>
+      <w:r>
+        <w:rPr>
+          <w:rFonts w:ascii="Arial" w:cs="Arial" w:eastAsia="Arial" w:hAnsi="Arial"/>
+          <w:b/>
+          <w:bCs/>
+          <w:color w:val="C9A227"/>
+          <w:sz w:val="17"/>
+          <w:szCs w:val="17"/>
+        </w:rPr>
+        <w:t xml:space="preserve">Why This Runs Before Pressing:  </w:t>
+      </w:r>
+      <w:r>
+        <w:rPr>
+          <w:rFonts w:ascii="Arial" w:cs="Arial" w:eastAsia="Arial" w:hAnsi="Arial"/>
+          <w:color w:val="2C2C2C"/>
+          <w:sz w:val="17"/>
+          <w:szCs w:val="17"/>
+        </w:rPr>
+        <w:t xml:space="preserve">Two light postural/shoulder drills from the 8/10 PT session, primed immediately before the pressing work below. Rear-delt and upper-back activation counteracts the forward-shoulder posture that makes overhead pressing feel tight, and full-range abduction wakes up the shoulder through its whole arc before it has to hold load overhead. Deliberately light and deliberately sub-maximal — the goal is a switched-on shoulder going into Block D, not fatigue. Both movements are tracked with real loads and a progression the same way every other trained exercise in this program is.</w:t>
+      </w:r>
+    </w:p>
+    <w:tbl>
+      <w:tblPr>
+        <w:tblW w:type="dxa" w:w="10440"/>
+        <w:tblBorders>
+          <w:top w:val="none" w:color="FFFFFF" w:sz="0"/>
+          <w:left w:val="none" w:color="FFFFFF" w:sz="0"/>
+          <w:bottom w:val="none" w:color="FFFFFF" w:sz="0"/>
+          <w:right w:val="none" w:color="FFFFFF" w:sz="0"/>
+          <w:insideH w:val="single" w:color="auto" w:sz="4"/>
+          <w:insideV w:val="single" w:color="auto" w:sz="4"/>
+        </w:tblBorders>
+      </w:tblPr>
+      <w:tblGrid>
+        <w:gridCol w:w="2400"/>
+        <w:gridCol w:w="380"/>
+        <w:gridCol w:w="420"/>
+        <w:gridCol w:w="680"/>
+        <w:gridCol w:w="540"/>
+        <w:gridCol w:w="440"/>
+        <w:gridCol w:w="5580"/>
+      </w:tblGrid>
+      <w:tr>
+        <w:tc>
+          <w:tcPr>
+            <w:tcW w:type="dxa" w:w="2400"/>
+            <w:tcBorders>
+              <w:top w:val="none" w:color="FFFFFF" w:sz="0"/>
+              <w:left w:val="none" w:color="FFFFFF" w:sz="0"/>
+              <w:bottom w:val="none" w:color="FFFFFF" w:sz="0"/>
+              <w:right w:val="none" w:color="FFFFFF" w:sz="0"/>
+            </w:tcBorders>
+            <w:shd w:fill="F5E8C0" w:color="auto" w:val="clear"/>
+            <w:tcMar>
+              <w:top w:type="dxa" w:w="40"/>
+              <w:left w:type="dxa" w:w="80"/>
+              <w:bottom w:type="dxa" w:w="40"/>
+              <w:right w:type="dxa" w:w="80"/>
+            </w:tcMar>
+            <w:vAlign w:val="center"/>
+          </w:tcPr>
+          <w:p>
+            <w:pPr>
+              <w:jc w:val="left"/>
+            </w:pPr>
+            <w:r>
+              <w:rPr>
+                <w:rFonts w:ascii="Arial" w:cs="Arial" w:eastAsia="Arial" w:hAnsi="Arial"/>
+                <w:b/>
+                <w:bCs/>
+                <w:color w:val="C9A227"/>
+                <w:sz w:val="15"/>
+                <w:szCs w:val="15"/>
+              </w:rPr>
+              <w:t xml:space="preserve">EXERCISE</w:t>
+            </w:r>
+          </w:p>
+        </w:tc>
+        <w:tc>
+          <w:tcPr>
+            <w:tcW w:type="dxa" w:w="380"/>
+            <w:tcBorders>
+              <w:top w:val="none" w:color="FFFFFF" w:sz="0"/>
+              <w:left w:val="none" w:color="FFFFFF" w:sz="0"/>
+              <w:bottom w:val="none" w:color="FFFFFF" w:sz="0"/>
+              <w:right w:val="none" w:color="FFFFFF" w:sz="0"/>
+            </w:tcBorders>
+            <w:shd w:fill="F5E8C0" w:color="auto" w:val="clear"/>
+            <w:tcMar>
+              <w:top w:type="dxa" w:w="40"/>
+              <w:left w:type="dxa" w:w="80"/>
+              <w:bottom w:type="dxa" w:w="40"/>
+              <w:right w:type="dxa" w:w="80"/>
+            </w:tcMar>
+            <w:vAlign w:val="center"/>
+          </w:tcPr>
+          <w:p>
+            <w:pPr>
+              <w:jc w:val="center"/>
+            </w:pPr>
+            <w:r>
+              <w:rPr>
+                <w:rFonts w:ascii="Arial" w:cs="Arial" w:eastAsia="Arial" w:hAnsi="Arial"/>
+                <w:b/>
+                <w:bCs/>
+                <w:color w:val="C9A227"/>
+                <w:sz w:val="13"/>
+                <w:szCs w:val="13"/>
+              </w:rPr>
+              <w:t xml:space="preserve">SETS</w:t>
+            </w:r>
+          </w:p>
+        </w:tc>
+        <w:tc>
+          <w:tcPr>
+            <w:tcW w:type="dxa" w:w="420"/>
+            <w:tcBorders>
+              <w:top w:val="none" w:color="FFFFFF" w:sz="0"/>
+              <w:left w:val="none" w:color="FFFFFF" w:sz="0"/>
+              <w:bottom w:val="none" w:color="FFFFFF" w:sz="0"/>
+              <w:right w:val="none" w:color="FFFFFF" w:sz="0"/>
+            </w:tcBorders>
+            <w:shd w:fill="F5E8C0" w:color="auto" w:val="clear"/>
+            <w:tcMar>
+              <w:top w:type="dxa" w:w="40"/>
+              <w:left w:type="dxa" w:w="80"/>
+              <w:bottom w:type="dxa" w:w="40"/>
+              <w:right w:type="dxa" w:w="80"/>
+            </w:tcMar>
+            <w:vAlign w:val="center"/>
+          </w:tcPr>
+          <w:p>
+            <w:pPr>
+              <w:jc w:val="center"/>
+            </w:pPr>
+            <w:r>
+              <w:rPr>
+                <w:rFonts w:ascii="Arial" w:cs="Arial" w:eastAsia="Arial" w:hAnsi="Arial"/>
+                <w:b/>
+                <w:bCs/>
+                <w:color w:val="C9A227"/>
+                <w:sz w:val="13"/>
+                <w:szCs w:val="13"/>
+              </w:rPr>
+              <w:t xml:space="preserve">REPS</w:t>
+            </w:r>
+          </w:p>
+        </w:tc>
+        <w:tc>
+          <w:tcPr>
+            <w:tcW w:type="dxa" w:w="680"/>
+            <w:tcBorders>
+              <w:top w:val="none" w:color="FFFFFF" w:sz="0"/>
+              <w:left w:val="none" w:color="FFFFFF" w:sz="0"/>
+              <w:bottom w:val="none" w:color="FFFFFF" w:sz="0"/>
+              <w:right w:val="none" w:color="FFFFFF" w:sz="0"/>
+            </w:tcBorders>
+            <w:shd w:fill="F5E8C0" w:color="auto" w:val="clear"/>
+            <w:tcMar>
+              <w:top w:type="dxa" w:w="40"/>
+              <w:left w:type="dxa" w:w="80"/>
+              <w:bottom w:type="dxa" w:w="40"/>
+              <w:right w:type="dxa" w:w="80"/>
+            </w:tcMar>
+            <w:vAlign w:val="center"/>
+          </w:tcPr>
+          <w:p>
+            <w:pPr>
+              <w:jc w:val="center"/>
+            </w:pPr>
+            <w:r>
+              <w:rPr>
+                <w:rFonts w:ascii="Arial" w:cs="Arial" w:eastAsia="Arial" w:hAnsi="Arial"/>
+                <w:b/>
+                <w:bCs/>
+                <w:color w:val="C9A227"/>
+                <w:sz w:val="13"/>
+                <w:szCs w:val="13"/>
+              </w:rPr>
+              <w:t xml:space="preserve">LOAD</w:t>
+            </w:r>
+          </w:p>
+        </w:tc>
+        <w:tc>
+          <w:tcPr>
+            <w:tcW w:type="dxa" w:w="540"/>
+            <w:tcBorders>
+              <w:top w:val="none" w:color="FFFFFF" w:sz="0"/>
+              <w:left w:val="none" w:color="FFFFFF" w:sz="0"/>
+              <w:bottom w:val="none" w:color="FFFFFF" w:sz="0"/>
+              <w:right w:val="none" w:color="FFFFFF" w:sz="0"/>
+            </w:tcBorders>
+            <w:shd w:fill="F5E8C0" w:color="auto" w:val="clear"/>
+            <w:tcMar>
+              <w:top w:type="dxa" w:w="40"/>
+              <w:left w:type="dxa" w:w="80"/>
+              <w:bottom w:type="dxa" w:w="40"/>
+              <w:right w:type="dxa" w:w="80"/>
+            </w:tcMar>
+            <w:vAlign w:val="center"/>
+          </w:tcPr>
+          <w:p>
+            <w:pPr>
+              <w:jc w:val="center"/>
+            </w:pPr>
+            <w:r>
+              <w:rPr>
+                <w:rFonts w:ascii="Arial" w:cs="Arial" w:eastAsia="Arial" w:hAnsi="Arial"/>
+                <w:b/>
+                <w:bCs/>
+                <w:color w:val="C9A227"/>
+                <w:sz w:val="13"/>
+                <w:szCs w:val="13"/>
+              </w:rPr>
+              <w:t xml:space="preserve">TEMPO</w:t>
+            </w:r>
+          </w:p>
+        </w:tc>
+        <w:tc>
+          <w:tcPr>
+            <w:tcW w:type="dxa" w:w="440"/>
+            <w:tcBorders>
+              <w:top w:val="none" w:color="FFFFFF" w:sz="0"/>
+              <w:left w:val="none" w:color="FFFFFF" w:sz="0"/>
+              <w:bottom w:val="none" w:color="FFFFFF" w:sz="0"/>
+              <w:right w:val="none" w:color="FFFFFF" w:sz="0"/>
+            </w:tcBorders>
+            <w:shd w:fill="F5E8C0" w:color="auto" w:val="clear"/>
+            <w:tcMar>
+              <w:top w:type="dxa" w:w="40"/>
+              <w:left w:type="dxa" w:w="80"/>
+              <w:bottom w:type="dxa" w:w="40"/>
+              <w:right w:type="dxa" w:w="80"/>
+            </w:tcMar>
+            <w:vAlign w:val="center"/>
+          </w:tcPr>
+          <w:p>
+            <w:pPr>
+              <w:jc w:val="center"/>
+            </w:pPr>
+            <w:r>
+              <w:rPr>
+                <w:rFonts w:ascii="Arial" w:cs="Arial" w:eastAsia="Arial" w:hAnsi="Arial"/>
+                <w:b/>
+                <w:bCs/>
+                <w:color w:val="C9A227"/>
+                <w:sz w:val="13"/>
+                <w:szCs w:val="13"/>
+              </w:rPr>
+              <w:t xml:space="preserve">REST</w:t>
+            </w:r>
+          </w:p>
+        </w:tc>
+        <w:tc>
+          <w:tcPr>
+            <w:tcW w:type="dxa" w:w="5580"/>
+            <w:tcBorders>
+              <w:top w:val="none" w:color="FFFFFF" w:sz="0"/>
+              <w:left w:val="none" w:color="FFFFFF" w:sz="0"/>
+              <w:bottom w:val="none" w:color="FFFFFF" w:sz="0"/>
+              <w:right w:val="none" w:color="FFFFFF" w:sz="0"/>
+            </w:tcBorders>
+            <w:shd w:fill="F5E8C0" w:color="auto" w:val="clear"/>
+            <w:tcMar>
+              <w:top w:type="dxa" w:w="40"/>
+              <w:left w:type="dxa" w:w="80"/>
+              <w:bottom w:type="dxa" w:w="40"/>
+              <w:right w:type="dxa" w:w="80"/>
+            </w:tcMar>
+            <w:vAlign w:val="center"/>
+          </w:tcPr>
+          <w:p>
+            <w:pPr>
+              <w:jc w:val="left"/>
+            </w:pPr>
+            <w:r>
+              <w:rPr>
+                <w:rFonts w:ascii="Arial" w:cs="Arial" w:eastAsia="Arial" w:hAnsi="Arial"/>
+                <w:b/>
+                <w:bCs/>
+                <w:color w:val="C9A227"/>
+                <w:sz w:val="15"/>
+                <w:szCs w:val="15"/>
+              </w:rPr>
+              <w:t xml:space="preserve">COACHING CUE</w:t>
+            </w:r>
+          </w:p>
+        </w:tc>
+      </w:tr>
+      <w:tr>
+        <w:tc>
+          <w:tcPr>
+            <w:tcW w:type="dxa" w:w="2400"/>
+            <w:tcBorders>
+              <w:top w:val="none" w:color="FFFFFF" w:sz="0"/>
+              <w:left w:val="none" w:color="FFFFFF" w:sz="0"/>
+              <w:bottom w:val="none" w:color="FFFFFF" w:sz="0"/>
+              <w:right w:val="none" w:color="FFFFFF" w:sz="0"/>
+            </w:tcBorders>
+            <w:shd w:fill="FAF3E0" w:color="auto" w:val="clear"/>
+            <w:tcMar>
+              <w:top w:type="dxa" w:w="40"/>
+              <w:left w:type="dxa" w:w="80"/>
+              <w:bottom w:type="dxa" w:w="40"/>
+              <w:right w:type="dxa" w:w="80"/>
+            </w:tcMar>
+            <w:vAlign w:val="center"/>
+          </w:tcPr>
+          <w:p>
+            <w:r>
+              <w:rPr>
+                <w:rFonts w:ascii="Arial" w:cs="Arial" w:eastAsia="Arial" w:hAnsi="Arial"/>
+                <w:b/>
+                <w:bCs/>
+                <w:color w:val="2C2C2C"/>
+                <w:sz w:val="18"/>
+                <w:szCs w:val="18"/>
+              </w:rPr>
+              <w:t xml:space="preserve">Standing Hip-Hinge Back Fly (Light DBs)</w:t>
+            </w:r>
+          </w:p>
+          <w:p>
+            <w:r>
+              <w:rPr>
+                <w:rFonts w:ascii="Arial" w:cs="Arial" w:eastAsia="Arial" w:hAnsi="Arial"/>
+                <w:i/>
+                <w:iCs/>
+                <w:color w:val="6B6B6B"/>
+                <w:sz w:val="14"/>
+                <w:szCs w:val="14"/>
+              </w:rPr>
+              <w:t xml:space="preserve">Rear delt / upper back, postural anti-hunch. PT note specified only "light DBs" — the Wk1→Wk4 numbers are a programmed progression path set against her existing 8–10 lb lateral-raise accessory load, not a figure carried from the note.</w:t>
+            </w:r>
+          </w:p>
+        </w:tc>
+        <w:tc>
+          <w:tcPr>
+            <w:tcW w:type="dxa" w:w="380"/>
+            <w:tcBorders>
+              <w:top w:val="none" w:color="FFFFFF" w:sz="0"/>
+              <w:left w:val="none" w:color="FFFFFF" w:sz="0"/>
+              <w:bottom w:val="none" w:color="FFFFFF" w:sz="0"/>
+              <w:right w:val="none" w:color="FFFFFF" w:sz="0"/>
+            </w:tcBorders>
+            <w:shd w:fill="FAF3E0" w:color="auto" w:val="clear"/>
+            <w:tcMar>
+              <w:top w:type="dxa" w:w="40"/>
+              <w:left w:type="dxa" w:w="80"/>
+              <w:bottom w:type="dxa" w:w="40"/>
+              <w:right w:type="dxa" w:w="80"/>
+            </w:tcMar>
+            <w:vAlign w:val="center"/>
+          </w:tcPr>
+          <w:p>
+            <w:pPr>
+              <w:jc w:val="center"/>
+            </w:pPr>
+            <w:r>
+              <w:rPr>
+                <w:rFonts w:ascii="Arial" w:cs="Arial" w:eastAsia="Arial" w:hAnsi="Arial"/>
+                <w:color w:val="6B6B6B"/>
+                <w:sz w:val="15"/>
+                <w:szCs w:val="15"/>
+              </w:rPr>
+              <w:t xml:space="preserve">2</w:t>
+            </w:r>
+          </w:p>
+        </w:tc>
+        <w:tc>
+          <w:tcPr>
+            <w:tcW w:type="dxa" w:w="420"/>
+            <w:tcBorders>
+              <w:top w:val="none" w:color="FFFFFF" w:sz="0"/>
+              <w:left w:val="none" w:color="FFFFFF" w:sz="0"/>
+              <w:bottom w:val="none" w:color="FFFFFF" w:sz="0"/>
+              <w:right w:val="none" w:color="FFFFFF" w:sz="0"/>
+            </w:tcBorders>
+            <w:shd w:fill="FAF3E0" w:color="auto" w:val="clear"/>
+            <w:tcMar>
+              <w:top w:type="dxa" w:w="40"/>
+              <w:left w:type="dxa" w:w="80"/>
+              <w:bottom w:type="dxa" w:w="40"/>
+              <w:right w:type="dxa" w:w="80"/>
+            </w:tcMar>
+            <w:vAlign w:val="center"/>
+          </w:tcPr>
+          <w:p>
+            <w:pPr>
+              <w:jc w:val="center"/>
+            </w:pPr>
+            <w:r>
+              <w:rPr>
+                <w:rFonts w:ascii="Arial" w:cs="Arial" w:eastAsia="Arial" w:hAnsi="Arial"/>
+                <w:color w:val="6B6B6B"/>
+                <w:sz w:val="15"/>
+                <w:szCs w:val="15"/>
+              </w:rPr>
+              <w:t xml:space="preserve">10–12</w:t>
+            </w:r>
+          </w:p>
+        </w:tc>
+        <w:tc>
+          <w:tcPr>
+            <w:tcW w:type="dxa" w:w="680"/>
+            <w:tcBorders>
+              <w:top w:val="none" w:color="FFFFFF" w:sz="0"/>
+              <w:left w:val="none" w:color="FFFFFF" w:sz="0"/>
+              <w:bottom w:val="none" w:color="FFFFFF" w:sz="0"/>
+              <w:right w:val="none" w:color="FFFFFF" w:sz="0"/>
+            </w:tcBorders>
+            <w:shd w:fill="FAF3E0" w:color="auto" w:val="clear"/>
+            <w:tcMar>
+              <w:top w:type="dxa" w:w="40"/>
+              <w:left w:type="dxa" w:w="80"/>
+              <w:bottom w:type="dxa" w:w="40"/>
+              <w:right w:type="dxa" w:w="80"/>
+            </w:tcMar>
+            <w:vAlign w:val="center"/>
+          </w:tcPr>
+          <w:p>
+            <w:pPr>
+              <w:jc w:val="center"/>
+            </w:pPr>
+            <w:r>
+              <w:rPr>
+                <w:rFonts w:ascii="Arial" w:cs="Arial" w:eastAsia="Arial" w:hAnsi="Arial"/>
+                <w:color w:val="6B6B6B"/>
+                <w:sz w:val="15"/>
+                <w:szCs w:val="15"/>
+              </w:rPr>
+              <w:t xml:space="preserve">Wk1: 5 lbs/hand → Wk4: 8 lbs/hand</w:t>
+            </w:r>
+          </w:p>
+        </w:tc>
+        <w:tc>
+          <w:tcPr>
+            <w:tcW w:type="dxa" w:w="540"/>
+            <w:tcBorders>
+              <w:top w:val="none" w:color="FFFFFF" w:sz="0"/>
+              <w:left w:val="none" w:color="FFFFFF" w:sz="0"/>
+              <w:bottom w:val="none" w:color="FFFFFF" w:sz="0"/>
+              <w:right w:val="none" w:color="FFFFFF" w:sz="0"/>
+            </w:tcBorders>
+            <w:shd w:fill="FAF3E0" w:color="auto" w:val="clear"/>
+            <w:tcMar>
+              <w:top w:type="dxa" w:w="40"/>
+              <w:left w:type="dxa" w:w="80"/>
+              <w:bottom w:type="dxa" w:w="40"/>
+              <w:right w:type="dxa" w:w="80"/>
+            </w:tcMar>
+            <w:vAlign w:val="center"/>
+          </w:tcPr>
+          <w:p>
+            <w:pPr>
+              <w:jc w:val="center"/>
+            </w:pPr>
+            <w:r>
+              <w:rPr>
+                <w:rFonts w:ascii="Arial" w:cs="Arial" w:eastAsia="Arial" w:hAnsi="Arial"/>
+                <w:color w:val="6B6B6B"/>
+                <w:sz w:val="15"/>
+                <w:szCs w:val="15"/>
+              </w:rPr>
+              <w:t xml:space="preserve">2-1-2</w:t>
+            </w:r>
+          </w:p>
+        </w:tc>
+        <w:tc>
+          <w:tcPr>
+            <w:tcW w:type="dxa" w:w="440"/>
+            <w:tcBorders>
+              <w:top w:val="none" w:color="FFFFFF" w:sz="0"/>
+              <w:left w:val="none" w:color="FFFFFF" w:sz="0"/>
+              <w:bottom w:val="none" w:color="FFFFFF" w:sz="0"/>
+              <w:right w:val="none" w:color="FFFFFF" w:sz="0"/>
+            </w:tcBorders>
+            <w:shd w:fill="FAF3E0" w:color="auto" w:val="clear"/>
+            <w:tcMar>
+              <w:top w:type="dxa" w:w="40"/>
+              <w:left w:type="dxa" w:w="80"/>
+              <w:bottom w:type="dxa" w:w="40"/>
+              <w:right w:type="dxa" w:w="80"/>
+            </w:tcMar>
+            <w:vAlign w:val="center"/>
+          </w:tcPr>
+          <w:p>
+            <w:pPr>
+              <w:jc w:val="center"/>
+            </w:pPr>
+            <w:r>
+              <w:rPr>
+                <w:rFonts w:ascii="Arial" w:cs="Arial" w:eastAsia="Arial" w:hAnsi="Arial"/>
+                <w:color w:val="6B6B6B"/>
+                <w:sz w:val="15"/>
+                <w:szCs w:val="15"/>
+              </w:rPr>
+              <w:t xml:space="preserve">30s</w:t>
+            </w:r>
+          </w:p>
+        </w:tc>
+        <w:tc>
+          <w:tcPr>
+            <w:tcW w:type="dxa" w:w="5580"/>
+            <w:tcBorders>
+              <w:top w:val="none" w:color="FFFFFF" w:sz="0"/>
+              <w:left w:val="none" w:color="FFFFFF" w:sz="0"/>
+              <w:bottom w:val="none" w:color="FFFFFF" w:sz="0"/>
+              <w:right w:val="none" w:color="FFFFFF" w:sz="0"/>
+            </w:tcBorders>
+            <w:shd w:fill="FAF3E0" w:color="auto" w:val="clear"/>
+            <w:tcMar>
+              <w:top w:type="dxa" w:w="40"/>
+              <w:left w:type="dxa" w:w="80"/>
+              <w:bottom w:type="dxa" w:w="40"/>
+              <w:right w:type="dxa" w:w="80"/>
+            </w:tcMar>
+            <w:vAlign w:val="center"/>
+          </w:tcPr>
+          <w:p>
+            <w:r>
+              <w:rPr>
+                <w:rFonts w:ascii="Arial" w:cs="Arial" w:eastAsia="Arial" w:hAnsi="Arial"/>
+                <w:color w:val="6B6B6B"/>
+                <w:sz w:val="17"/>
+                <w:szCs w:val="17"/>
+              </w:rPr>
+              <w:t xml:space="preserve">Hinge to a flat-back position, soft knees, arms long. Sweep the DBs out and back, leading with the pinky edge. Squeeze the shoulder blades together — no shrugging, no lumbar extension to help the weight up.</w:t>
+            </w:r>
+            <w:r>
+              <w:rPr>
+                <w:rFonts w:ascii="Arial" w:cs="Arial" w:eastAsia="Arial" w:hAnsi="Arial"/>
+                <w:i/>
+                <w:iCs/>
+                <w:color w:val="00695C"/>
+                <w:sz w:val="14"/>
+                <w:szCs w:val="14"/>
+              </w:rPr>
+              <w:t xml:space="preserve">  Technique/sub-maximal — activation, well short of failure</w:t>
+            </w:r>
+          </w:p>
+        </w:tc>
+      </w:tr>
+      <w:tr>
+        <w:tc>
+          <w:tcPr>
+            <w:tcW w:type="dxa" w:w="2400"/>
+            <w:tcBorders>
+              <w:top w:val="none" w:color="FFFFFF" w:sz="0"/>
+              <w:left w:val="none" w:color="FFFFFF" w:sz="0"/>
+              <w:bottom w:val="none" w:color="FFFFFF" w:sz="0"/>
+              <w:right w:val="none" w:color="FFFFFF" w:sz="0"/>
+            </w:tcBorders>
+            <w:shd w:fill="FFFFFF" w:color="auto" w:val="clear"/>
+            <w:tcMar>
+              <w:top w:type="dxa" w:w="40"/>
+              <w:left w:type="dxa" w:w="80"/>
+              <w:bottom w:type="dxa" w:w="40"/>
+              <w:right w:type="dxa" w:w="80"/>
+            </w:tcMar>
+            <w:vAlign w:val="center"/>
+          </w:tcPr>
+          <w:p>
+            <w:r>
+              <w:rPr>
+                <w:rFonts w:ascii="Arial" w:cs="Arial" w:eastAsia="Arial" w:hAnsi="Arial"/>
+                <w:b/>
+                <w:bCs/>
+                <w:color w:val="2C2C2C"/>
+                <w:sz w:val="18"/>
+                <w:szCs w:val="18"/>
+              </w:rPr>
+              <w:t xml:space="preserve">Around-the-World Lateral Raise</w:t>
+            </w:r>
+          </w:p>
+          <w:p>
+            <w:r>
+              <w:rPr>
+                <w:rFonts w:ascii="Arial" w:cs="Arial" w:eastAsia="Arial" w:hAnsi="Arial"/>
+                <w:i/>
+                <w:iCs/>
+                <w:color w:val="6B6B6B"/>
+                <w:sz w:val="14"/>
+                <w:szCs w:val="14"/>
+              </w:rPr>
+              <w:t xml:space="preserve">Load stays at 3–5 lbs on purpose — this one progresses by range and control, not by weight. Heavier shortens the arc, which removes the reason it is in the program.</w:t>
+            </w:r>
+          </w:p>
+        </w:tc>
+        <w:tc>
+          <w:tcPr>
+            <w:tcW w:type="dxa" w:w="380"/>
+            <w:tcBorders>
+              <w:top w:val="none" w:color="FFFFFF" w:sz="0"/>
+              <w:left w:val="none" w:color="FFFFFF" w:sz="0"/>
+              <w:bottom w:val="none" w:color="FFFFFF" w:sz="0"/>
+              <w:right w:val="none" w:color="FFFFFF" w:sz="0"/>
+            </w:tcBorders>
+            <w:shd w:fill="FFFFFF" w:color="auto" w:val="clear"/>
+            <w:tcMar>
+              <w:top w:type="dxa" w:w="40"/>
+              <w:left w:type="dxa" w:w="80"/>
+              <w:bottom w:type="dxa" w:w="40"/>
+              <w:right w:type="dxa" w:w="80"/>
+            </w:tcMar>
+            <w:vAlign w:val="center"/>
+          </w:tcPr>
+          <w:p>
+            <w:pPr>
+              <w:jc w:val="center"/>
+            </w:pPr>
+            <w:r>
+              <w:rPr>
+                <w:rFonts w:ascii="Arial" w:cs="Arial" w:eastAsia="Arial" w:hAnsi="Arial"/>
+                <w:color w:val="6B6B6B"/>
+                <w:sz w:val="15"/>
+                <w:szCs w:val="15"/>
+              </w:rPr>
+              <w:t xml:space="preserve">2</w:t>
+            </w:r>
+          </w:p>
+        </w:tc>
+        <w:tc>
+          <w:tcPr>
+            <w:tcW w:type="dxa" w:w="420"/>
+            <w:tcBorders>
+              <w:top w:val="none" w:color="FFFFFF" w:sz="0"/>
+              <w:left w:val="none" w:color="FFFFFF" w:sz="0"/>
+              <w:bottom w:val="none" w:color="FFFFFF" w:sz="0"/>
+              <w:right w:val="none" w:color="FFFFFF" w:sz="0"/>
+            </w:tcBorders>
+            <w:shd w:fill="FFFFFF" w:color="auto" w:val="clear"/>
+            <w:tcMar>
+              <w:top w:type="dxa" w:w="40"/>
+              <w:left w:type="dxa" w:w="80"/>
+              <w:bottom w:type="dxa" w:w="40"/>
+              <w:right w:type="dxa" w:w="80"/>
+            </w:tcMar>
+            <w:vAlign w:val="center"/>
+          </w:tcPr>
+          <w:p>
+            <w:pPr>
+              <w:jc w:val="center"/>
+            </w:pPr>
+            <w:r>
+              <w:rPr>
+                <w:rFonts w:ascii="Arial" w:cs="Arial" w:eastAsia="Arial" w:hAnsi="Arial"/>
+                <w:color w:val="6B6B6B"/>
+                <w:sz w:val="15"/>
+                <w:szCs w:val="15"/>
+              </w:rPr>
+              <w:t xml:space="preserve">10</w:t>
+            </w:r>
+          </w:p>
+        </w:tc>
+        <w:tc>
+          <w:tcPr>
+            <w:tcW w:type="dxa" w:w="680"/>
+            <w:tcBorders>
+              <w:top w:val="none" w:color="FFFFFF" w:sz="0"/>
+              <w:left w:val="none" w:color="FFFFFF" w:sz="0"/>
+              <w:bottom w:val="none" w:color="FFFFFF" w:sz="0"/>
+              <w:right w:val="none" w:color="FFFFFF" w:sz="0"/>
+            </w:tcBorders>
+            <w:shd w:fill="FFFFFF" w:color="auto" w:val="clear"/>
+            <w:tcMar>
+              <w:top w:type="dxa" w:w="40"/>
+              <w:left w:type="dxa" w:w="80"/>
+              <w:bottom w:type="dxa" w:w="40"/>
+              <w:right w:type="dxa" w:w="80"/>
+            </w:tcMar>
+            <w:vAlign w:val="center"/>
+          </w:tcPr>
+          <w:p>
+            <w:pPr>
+              <w:jc w:val="center"/>
+            </w:pPr>
+            <w:r>
+              <w:rPr>
+                <w:rFonts w:ascii="Arial" w:cs="Arial" w:eastAsia="Arial" w:hAnsi="Arial"/>
+                <w:color w:val="6B6B6B"/>
+                <w:sz w:val="15"/>
+                <w:szCs w:val="15"/>
+              </w:rPr>
+              <w:t xml:space="preserve">3–5 lbs</w:t>
+            </w:r>
+          </w:p>
+        </w:tc>
+        <w:tc>
+          <w:tcPr>
+            <w:tcW w:type="dxa" w:w="540"/>
+            <w:tcBorders>
+              <w:top w:val="none" w:color="FFFFFF" w:sz="0"/>
+              <w:left w:val="none" w:color="FFFFFF" w:sz="0"/>
+              <w:bottom w:val="none" w:color="FFFFFF" w:sz="0"/>
+              <w:right w:val="none" w:color="FFFFFF" w:sz="0"/>
+            </w:tcBorders>
+            <w:shd w:fill="FFFFFF" w:color="auto" w:val="clear"/>
+            <w:tcMar>
+              <w:top w:type="dxa" w:w="40"/>
+              <w:left w:type="dxa" w:w="80"/>
+              <w:bottom w:type="dxa" w:w="40"/>
+              <w:right w:type="dxa" w:w="80"/>
+            </w:tcMar>
+            <w:vAlign w:val="center"/>
+          </w:tcPr>
+          <w:p>
+            <w:pPr>
+              <w:jc w:val="center"/>
+            </w:pPr>
+            <w:r>
+              <w:rPr>
+                <w:rFonts w:ascii="Arial" w:cs="Arial" w:eastAsia="Arial" w:hAnsi="Arial"/>
+                <w:color w:val="6B6B6B"/>
+                <w:sz w:val="15"/>
+                <w:szCs w:val="15"/>
+              </w:rPr>
+              <w:t xml:space="preserve">2-1-2</w:t>
+            </w:r>
+          </w:p>
+        </w:tc>
+        <w:tc>
+          <w:tcPr>
+            <w:tcW w:type="dxa" w:w="440"/>
+            <w:tcBorders>
+              <w:top w:val="none" w:color="FFFFFF" w:sz="0"/>
+              <w:left w:val="none" w:color="FFFFFF" w:sz="0"/>
+              <w:bottom w:val="none" w:color="FFFFFF" w:sz="0"/>
+              <w:right w:val="none" w:color="FFFFFF" w:sz="0"/>
+            </w:tcBorders>
+            <w:shd w:fill="FFFFFF" w:color="auto" w:val="clear"/>
+            <w:tcMar>
+              <w:top w:type="dxa" w:w="40"/>
+              <w:left w:type="dxa" w:w="80"/>
+              <w:bottom w:type="dxa" w:w="40"/>
+              <w:right w:type="dxa" w:w="80"/>
+            </w:tcMar>
+            <w:vAlign w:val="center"/>
+          </w:tcPr>
+          <w:p>
+            <w:pPr>
+              <w:jc w:val="center"/>
+            </w:pPr>
+            <w:r>
+              <w:rPr>
+                <w:rFonts w:ascii="Arial" w:cs="Arial" w:eastAsia="Arial" w:hAnsi="Arial"/>
+                <w:color w:val="6B6B6B"/>
+                <w:sz w:val="15"/>
+                <w:szCs w:val="15"/>
+              </w:rPr>
+              <w:t xml:space="preserve">30s</w:t>
+            </w:r>
+          </w:p>
+        </w:tc>
+        <w:tc>
+          <w:tcPr>
+            <w:tcW w:type="dxa" w:w="5580"/>
+            <w:tcBorders>
+              <w:top w:val="none" w:color="FFFFFF" w:sz="0"/>
+              <w:left w:val="none" w:color="FFFFFF" w:sz="0"/>
+              <w:bottom w:val="none" w:color="FFFFFF" w:sz="0"/>
+              <w:right w:val="none" w:color="FFFFFF" w:sz="0"/>
+            </w:tcBorders>
+            <w:shd w:fill="FFFFFF" w:color="auto" w:val="clear"/>
+            <w:tcMar>
+              <w:top w:type="dxa" w:w="40"/>
+              <w:left w:type="dxa" w:w="80"/>
+              <w:bottom w:type="dxa" w:w="40"/>
+              <w:right w:type="dxa" w:w="80"/>
+            </w:tcMar>
+            <w:vAlign w:val="center"/>
+          </w:tcPr>
+          <w:p>
+            <w:r>
+              <w:rPr>
+                <w:rFonts w:ascii="Arial" w:cs="Arial" w:eastAsia="Arial" w:hAnsi="Arial"/>
+                <w:color w:val="6B6B6B"/>
+                <w:sz w:val="17"/>
+                <w:szCs w:val="17"/>
+              </w:rPr>
+              <w:t xml:space="preserve">Full arc from the hips to overhead and back, shoulders pulled down away from the ears the whole way. If the shoulders start to hike or the arc shortens, stop the set — range is the point of this one.</w:t>
+            </w:r>
+            <w:r>
+              <w:rPr>
+                <w:rFonts w:ascii="Arial" w:cs="Arial" w:eastAsia="Arial" w:hAnsi="Arial"/>
+                <w:i/>
+                <w:iCs/>
+                <w:color w:val="00695C"/>
+                <w:sz w:val="14"/>
+                <w:szCs w:val="14"/>
+              </w:rPr>
+              <w:t xml:space="preserve">  Technique/sub-maximal — range and control, never near failure</w:t>
             </w:r>
           </w:p>
         </w:tc>
@@ -5703,7 +6604,7 @@
           <w:sz w:val="17"/>
           <w:szCs w:val="17"/>
         </w:rPr>
-        <w:t xml:space="preserve">C — PRIMARY PRESS STRENGTH</w:t>
+        <w:t xml:space="preserve">D — PRIMARY PRESS STRENGTH</w:t>
       </w:r>
     </w:p>
     <w:p>
@@ -6225,6 +7126,17 @@
               </w:rPr>
               <w:t xml:space="preserve">Updated baseline 17.5 lbs ×5RM. Wk1 starts at 15 lbs for 10 reps. Seated: back supported, spine neutral. Press overhead, arms alongside ears. Core braced throughout. Add 2.5 lbs every 2 weeks.</w:t>
             </w:r>
+            <w:r>
+              <w:rPr>
+                <w:rFonts w:ascii="Arial" w:cs="Arial" w:eastAsia="Arial" w:hAnsi="Arial"/>
+                <w:i/>
+                <w:iCs/>
+                <w:color w:val="00695C"/>
+                <w:sz w:val="14"/>
+                <w:szCs w:val="14"/>
+              </w:rPr>
+              <w:t xml:space="preserve">  2 RIR — primary lift</w:t>
+            </w:r>
           </w:p>
         </w:tc>
       </w:tr>
@@ -6454,6 +7366,17 @@
               </w:rPr>
               <w:t xml:space="preserve">Updated baseline 15 lbs ×8 reps. Primary chest movement. 30–45° incline. Elbows at 45°. Full range, squeeze at top. Safe for spinal stenosis — no axial load.</w:t>
             </w:r>
+            <w:r>
+              <w:rPr>
+                <w:rFonts w:ascii="Arial" w:cs="Arial" w:eastAsia="Arial" w:hAnsi="Arial"/>
+                <w:i/>
+                <w:iCs/>
+                <w:color w:val="00695C"/>
+                <w:sz w:val="14"/>
+                <w:szCs w:val="14"/>
+              </w:rPr>
+              <w:t xml:space="preserve">  2 RIR — primary lift</w:t>
+            </w:r>
           </w:p>
         </w:tc>
       </w:tr>
@@ -6696,6 +7619,17 @@
               </w:rPr>
               <w:t xml:space="preserve">Updated baseline 25 lbs ×8. Slight knee bend, hinge from hip, feel hamstring load. Return by squeezing glute. Left and right equal. The most effective hip hinge developer in this plan — single-leg removes the compensation that two-leg hinging allows.</w:t>
             </w:r>
+            <w:r>
+              <w:rPr>
+                <w:rFonts w:ascii="Arial" w:cs="Arial" w:eastAsia="Arial" w:hAnsi="Arial"/>
+                <w:i/>
+                <w:iCs/>
+                <w:color w:val="00695C"/>
+                <w:sz w:val="14"/>
+                <w:szCs w:val="14"/>
+              </w:rPr>
+              <w:t xml:space="preserve">  2 RIR — balance-limited, stop when the hinge drifts</w:t>
+            </w:r>
           </w:p>
         </w:tc>
       </w:tr>
@@ -6924,6 +7858,17 @@
                 <w:szCs w:val="17"/>
               </w:rPr>
               <w:t xml:space="preserve">Lateral delt. Arms slightly bent. Raise to shoulder height. 1-second hold at top. Slow 2-second lower. Short rest maintains heart rate for fat loss.</w:t>
+            </w:r>
+            <w:r>
+              <w:rPr>
+                <w:rFonts w:ascii="Arial" w:cs="Arial" w:eastAsia="Arial" w:hAnsi="Arial"/>
+                <w:i/>
+                <w:iCs/>
+                <w:color w:val="00695C"/>
+                <w:sz w:val="14"/>
+                <w:szCs w:val="14"/>
+              </w:rPr>
+              <w:t xml:space="preserve">  1 RIR — hypertrophy-priority isolation</w:t>
             </w:r>
           </w:p>
         </w:tc>
@@ -6947,7 +7892,7 @@
           <w:sz w:val="17"/>
           <w:szCs w:val="17"/>
         </w:rPr>
-        <w:t xml:space="preserve">D — LOADED CARRY + CORE</w:t>
+        <w:t xml:space="preserve">E — LOADED CARRY + CORE</w:t>
       </w:r>
     </w:p>
     <w:p>
@@ -6972,7 +7917,7 @@
           <w:sz w:val="17"/>
           <w:szCs w:val="17"/>
         </w:rPr>
-        <w:t xml:space="preserve">Loaded carries build deep spinal stabilizer strength (multifidus, QL) with neutral spine and shoulders packed. Sit-up and bicycle crunch are new this update — previously restricted, now cleared, reintroduced at moderate volume and controlled tempo. Stop and flag any discomfort rather than pushing through.</w:t>
+        <w:t xml:space="preserve">Loaded carries build deep spinal stabilizer strength (multifidus, QL) with neutral spine and shoulders packed. Sit-up and bicycle crunch are new this update — previously restricted, now cleared, reintroduced at moderate volume and controlled tempo. Stop and flag any discomfort rather than pushing through. Nothing in this block carries an RIR target: the carry is governed by distance and posture, the plank by time, and the core work by control and symptom response — a carry that ends because the grip failed is a different (and worse) set than one that ends with the spine still stacked.</w:t>
       </w:r>
     </w:p>
     <w:tbl>
@@ -8178,7 +9123,7 @@
           <w:sz w:val="17"/>
           <w:szCs w:val="17"/>
         </w:rPr>
-        <w:t xml:space="preserve">E — CARDIOVASCULAR FINISHER (CHOOSE ONE)</w:t>
+        <w:t xml:space="preserve">F — CARDIOVASCULAR FINISHER (CHOOSE ONE)</w:t>
       </w:r>
     </w:p>
     <w:p>
@@ -8203,7 +9148,7 @@
           <w:sz w:val="17"/>
           <w:szCs w:val="17"/>
         </w:rPr>
-        <w:t xml:space="preserve">At 2 days per week, cardiovascular improvement depends heavily on the quality of conditioning work done within each session. Every Day A ends with one of these finishers. They are not optional. This is the primary fat loss and cardiovascular adaptation mechanism in the program.</w:t>
+        <w:t xml:space="preserve">At 2 days per week, cardiovascular improvement depends heavily on the quality of conditioning work done within each session. Every Day A ends with one of these finishers. They are not optional. This is the primary fat loss and cardiovascular adaptation mechanism in the program. None of these carry an RIR target — they are governed by heart rate, time, and drive quality, not by reps left in reserve. On the sled specifically: end a round when drive speed drops off sharply, rather than grinding out the distance.</w:t>
       </w:r>
     </w:p>
     <w:tbl>
@@ -10252,6 +11197,17 @@
               </w:rPr>
               <w:t xml:space="preserve">Baseline 35 lbs ×3RM. Start at 25 lbs for 8 quality reps with full depth. Front foot elevated 2–4 inches increases range of motion. Front knee tracks over second toe. Left leg leads first. Add 2.5 lbs every 2 weeks.</w:t>
             </w:r>
+            <w:r>
+              <w:rPr>
+                <w:rFonts w:ascii="Arial" w:cs="Arial" w:eastAsia="Arial" w:hAnsi="Arial"/>
+                <w:i/>
+                <w:iCs/>
+                <w:color w:val="00695C"/>
+                <w:sz w:val="14"/>
+                <w:szCs w:val="14"/>
+              </w:rPr>
+              <w:t xml:space="preserve">  2 RIR — primary lift</w:t>
+            </w:r>
           </w:p>
         </w:tc>
       </w:tr>
@@ -10481,6 +11437,17 @@
               </w:rPr>
               <w:t xml:space="preserve">New this update. Chest up, drive through heels, full ROM. Angled bar path loads the spine more forgivingly than a straight barbell — bridges toward barbell squatting once that's reintroduced.</w:t>
             </w:r>
+            <w:r>
+              <w:rPr>
+                <w:rFonts w:ascii="Arial" w:cs="Arial" w:eastAsia="Arial" w:hAnsi="Arial"/>
+                <w:i/>
+                <w:iCs/>
+                <w:color w:val="00695C"/>
+                <w:sz w:val="14"/>
+                <w:szCs w:val="14"/>
+              </w:rPr>
+              <w:t xml:space="preserve">  Technique/sub-maximal while the pattern is new</w:t>
+            </w:r>
           </w:p>
         </w:tc>
       </w:tr>
@@ -10710,6 +11677,17 @@
               </w:rPr>
               <w:t xml:space="preserve">Pull to face, elbows at ear height, external rotation at end range. Rear delt and rotator cuff health. Balances the pressing volume from Day A. Non-negotiable for shoulder health.</w:t>
             </w:r>
+            <w:r>
+              <w:rPr>
+                <w:rFonts w:ascii="Arial" w:cs="Arial" w:eastAsia="Arial" w:hAnsi="Arial"/>
+                <w:i/>
+                <w:iCs/>
+                <w:color w:val="00695C"/>
+                <w:sz w:val="14"/>
+                <w:szCs w:val="14"/>
+              </w:rPr>
+              <w:t xml:space="preserve">  Technique/sub-maximal — shoulder health, never near failure</w:t>
+            </w:r>
           </w:p>
         </w:tc>
       </w:tr>
@@ -10939,6 +11917,17 @@
               </w:rPr>
               <w:t xml:space="preserve">New this update — first genuine lunge-pattern movement in the program. Step straight back, lower until rear knee lightly grazes floor, front knee tracks over toes, drive through front heel to return. Controlled step-back (not walking lunge) — lower deceleration demand, appropriate given the stenosis history. Left leg leads first.</w:t>
             </w:r>
+            <w:r>
+              <w:rPr>
+                <w:rFonts w:ascii="Arial" w:cs="Arial" w:eastAsia="Arial" w:hAnsi="Arial"/>
+                <w:i/>
+                <w:iCs/>
+                <w:color w:val="00695C"/>
+                <w:sz w:val="14"/>
+                <w:szCs w:val="14"/>
+              </w:rPr>
+              <w:t xml:space="preserve">  Technique/sub-maximal — new pattern, quality first</w:t>
+            </w:r>
           </w:p>
         </w:tc>
       </w:tr>
@@ -11167,6 +12156,17 @@
                 <w:szCs w:val="17"/>
               </w:rPr>
               <w:t xml:space="preserve">18–20 inch box. Drive through front heel, full hip extension at top. Left leg leads. Excellent glute and quad developer.</w:t>
+            </w:r>
+            <w:r>
+              <w:rPr>
+                <w:rFonts w:ascii="Arial" w:cs="Arial" w:eastAsia="Arial" w:hAnsi="Arial"/>
+                <w:i/>
+                <w:iCs/>
+                <w:color w:val="00695C"/>
+                <w:sz w:val="14"/>
+                <w:szCs w:val="14"/>
+              </w:rPr>
+              <w:t xml:space="preserve">  2 RIR — compound accessory</w:t>
             </w:r>
           </w:p>
         </w:tc>
@@ -11712,6 +12712,17 @@
               </w:rPr>
               <w:t xml:space="preserve">LEADS every session — safest grip for spinal stenosis. Full hang at bottom. Chin over bar at top. Controlled 3-second descent. Neural grip (palms facing each other). Add 1 rep every 2 weeks.</w:t>
             </w:r>
+            <w:r>
+              <w:rPr>
+                <w:rFonts w:ascii="Arial" w:cs="Arial" w:eastAsia="Arial" w:hAnsi="Arial"/>
+                <w:i/>
+                <w:iCs/>
+                <w:color w:val="00695C"/>
+                <w:sz w:val="14"/>
+                <w:szCs w:val="14"/>
+              </w:rPr>
+              <w:t xml:space="preserve">  2 RIR — set the assist so the last rep is clean with ~2 left</w:t>
+            </w:r>
           </w:p>
         </w:tc>
       </w:tr>
@@ -11941,6 +12952,17 @@
               </w:rPr>
               <w:t xml:space="preserve">Standard overhand grip, shoulder-width. Same quality as neutral grip. 3-second descent. Second grip in the rotation.</w:t>
             </w:r>
+            <w:r>
+              <w:rPr>
+                <w:rFonts w:ascii="Arial" w:cs="Arial" w:eastAsia="Arial" w:hAnsi="Arial"/>
+                <w:i/>
+                <w:iCs/>
+                <w:color w:val="00695C"/>
+                <w:sz w:val="14"/>
+                <w:szCs w:val="14"/>
+              </w:rPr>
+              <w:t xml:space="preserve">  2 RIR — same assist standard as neutral grip</w:t>
+            </w:r>
           </w:p>
         </w:tc>
       </w:tr>
@@ -12170,6 +13192,17 @@
               </w:rPr>
               <w:t xml:space="preserve">Wide overhand grip. Hardest of the three. Greatest lat stretch at bottom. Full range — do not partial rep. 3-second descent. If reps drop below 4, reduce to 4 and hold there until strength catches up.</w:t>
             </w:r>
+            <w:r>
+              <w:rPr>
+                <w:rFonts w:ascii="Arial" w:cs="Arial" w:eastAsia="Arial" w:hAnsi="Arial"/>
+                <w:i/>
+                <w:iCs/>
+                <w:color w:val="00695C"/>
+                <w:sz w:val="14"/>
+                <w:szCs w:val="14"/>
+              </w:rPr>
+              <w:t xml:space="preserve">  2 RIR — same assist standard; rep floor overrides it</w:t>
+            </w:r>
           </w:p>
         </w:tc>
       </w:tr>
@@ -12399,6 +13432,17 @@
               </w:rPr>
               <w:t xml:space="preserve">Baseline 25 lbs ×5RM. Chest on incline bench — removes ALL lumbar load. Most spine-safe rowing variation available. Drive elbow to hip. Full stretch at bottom. This is the preferred row for spinal stenosis.</w:t>
             </w:r>
+            <w:r>
+              <w:rPr>
+                <w:rFonts w:ascii="Arial" w:cs="Arial" w:eastAsia="Arial" w:hAnsi="Arial"/>
+                <w:i/>
+                <w:iCs/>
+                <w:color w:val="00695C"/>
+                <w:sz w:val="14"/>
+                <w:szCs w:val="14"/>
+              </w:rPr>
+              <w:t xml:space="preserve">  2 RIR — primary lift</w:t>
+            </w:r>
           </w:p>
         </w:tc>
       </w:tr>
@@ -12627,6 +13671,17 @@
                 <w:szCs w:val="17"/>
               </w:rPr>
               <w:t xml:space="preserve">DB held at chest. Full depth, chest tall. Elbows inside knees at bottom. Knees track out over toes. Progress load every 2 weeks.</w:t>
+            </w:r>
+            <w:r>
+              <w:rPr>
+                <w:rFonts w:ascii="Arial" w:cs="Arial" w:eastAsia="Arial" w:hAnsi="Arial"/>
+                <w:i/>
+                <w:iCs/>
+                <w:color w:val="00695C"/>
+                <w:sz w:val="14"/>
+                <w:szCs w:val="14"/>
+              </w:rPr>
+              <w:t xml:space="preserve">  2 RIR — primary lift</w:t>
             </w:r>
           </w:p>
         </w:tc>
@@ -13172,6 +14227,17 @@
               </w:rPr>
               <w:t xml:space="preserve">Updated baseline 7 reps. Hands on bench or box. Full chest to bench level. Controlled descent. Progress by lowering the incline height each week. Bridges the gap to floor push-ups.</w:t>
             </w:r>
+            <w:r>
+              <w:rPr>
+                <w:rFonts w:ascii="Arial" w:cs="Arial" w:eastAsia="Arial" w:hAnsi="Arial"/>
+                <w:i/>
+                <w:iCs/>
+                <w:color w:val="00695C"/>
+                <w:sz w:val="14"/>
+                <w:szCs w:val="14"/>
+              </w:rPr>
+              <w:t xml:space="preserve">  1 RIR — hypertrophy-priority accessory volume</w:t>
+            </w:r>
           </w:p>
         </w:tc>
       </w:tr>
@@ -13401,6 +14467,17 @@
               </w:rPr>
               <w:t xml:space="preserve">Attempt full push-ups. Stop 2 reps before form breaks. Record reps every set every session. Target: 8–10 full reps by Week 4. Neutral spine throughout — no sag or pike.</w:t>
             </w:r>
+            <w:r>
+              <w:rPr>
+                <w:rFonts w:ascii="Arial" w:cs="Arial" w:eastAsia="Arial" w:hAnsi="Arial"/>
+                <w:i/>
+                <w:iCs/>
+                <w:color w:val="00695C"/>
+                <w:sz w:val="14"/>
+                <w:szCs w:val="14"/>
+              </w:rPr>
+              <w:t xml:space="preserve">  Form-governed, not RIR — this is the one recorded max-rep set; stop 2 reps before form breaks</w:t>
+            </w:r>
           </w:p>
         </w:tc>
       </w:tr>
@@ -13629,6 +14706,17 @@
                 <w:szCs w:val="17"/>
               </w:rPr>
               <w:t xml:space="preserve">Dip: hands on bench behind body, lower until elbows reach 90°, drive back up. Keiser/DB kickback: hinge forward, elbow fixed at side, extend through full range, squeeze at lockout. Coach/client choice — both build tricep strength for push-up progression.</w:t>
+            </w:r>
+            <w:r>
+              <w:rPr>
+                <w:rFonts w:ascii="Arial" w:cs="Arial" w:eastAsia="Arial" w:hAnsi="Arial"/>
+                <w:i/>
+                <w:iCs/>
+                <w:color w:val="00695C"/>
+                <w:sz w:val="14"/>
+                <w:szCs w:val="14"/>
+              </w:rPr>
+              <w:t xml:space="preserve">  1 RIR — hypertrophy-priority isolation</w:t>
             </w:r>
           </w:p>
         </w:tc>
@@ -13677,7 +14765,7 @@
           <w:sz w:val="17"/>
           <w:szCs w:val="17"/>
         </w:rPr>
-        <w:t xml:space="preserve">Day B's cardiovascular work is a metabolic circuit rather than dedicated cardio. This provides the strength-plus-conditioning stimulus that is most effective for fat loss and body composition at 2 days per week. Kettlebell swing and pull-through are new this update — moderate, hip-hinge-dominant options from the cross-training notes, replacing goblet squat in this slot (client/coach choice over jump squat, which stays deferred for now given moderate-progression pacing). After 3 circuit rounds: 10-minute cardiovascular finisher — choose stationary bike easy spin, treadmill Zone 2 walk, or rowing machine easy pace.</w:t>
+        <w:t xml:space="preserve">Day B's cardiovascular work is a metabolic circuit rather than dedicated cardio. This provides the strength-plus-conditioning stimulus that is most effective for fat loss and body composition at 2 days per week. Kettlebell swing and pull-through are new this update — moderate, hip-hinge-dominant options from the cross-training notes, replacing goblet squat in this slot (client/coach choice over jump squat, which stays deferred for now given moderate-progression pacing). After 3 circuit rounds: 10-minute cardiovascular finisher — choose stationary bike easy spin, treadmill Zone 2 walk, or rowing machine easy pace. Nothing in this circuit carries an RIR target — it is paced by the clock and by movement quality, not by reps left in reserve. End a round of swings or pull-throughs if the hinge mechanics start to degrade, rather than completing the number.</w:t>
       </w:r>
     </w:p>
     <w:tbl>

</xml_diff>

<commit_message>
Checkpoint: Block Method batch 2 in progress (Aimee Morris, Mary Burfete, Johnna Macarthur, Nicolette Scott — agent still building; final state and audit to follow)
Co-Authored-By: Claude Fable 5 <noreply@anthropic.com>
Claude-Session: https://claude.ai/code/session_01VTRA12TAy4P16NRVKS4SK5
</commit_message>
<xml_diff>
--- a/clients/aimee_morris/Aimee_Morris_2Day_Training_Plan.docx
+++ b/clients/aimee_morris/Aimee_Morris_2Day_Training_Plan.docx
@@ -2355,6 +2355,31 @@
           <w:szCs w:val="17"/>
         </w:rPr>
         <w:t xml:space="preserve">Most working sets in this program now carry an RIR target — the number of clean reps you could still have completed at the moment you racked the weight. 2 RIR is the default on the primary lifts (hex bar deadlift, hip thrust, flat bench press, overhead press, incline press, split squat, goblet squat, chest-supported row): finish each set with two good reps left, not grinding. 1 RIR is used only where the goal is muscle growth rather than peak strength — lateral raises, incline push-up volume, tricep work. Anything marked technique/sub-maximal sits deliberately further from failure than that: the correctives, the shoulder activation, and every movement still being established (landmine squat, reverse lunge, glute kickback). There is no meaningful difference between three, four or five reps in reserve, so do not try to hit a precise number there — just stay clearly short of hard. Some work carries no RIR target at all, on purpose: farmer carries are governed by distance and posture, planks by time, the correctives by hinge quality, and the cardio finishers and metabolic circuit by the clock and by movement quality. Given the stenosis history, training to true failure is not required and is not the goal on any lift in this program. Calibration for the first few weeks: on one sub-maximal set of a new movement, call out the RIR you think you have left, then take that same set to true failure and compare. Once your call is within one rep two sessions running, your own RIR is reliable enough to drive load increases on its own.</w:t>
+      </w:r>
+    </w:p>
+    <w:p>
+      <w:pPr>
+        <w:spacing w:after="100"/>
+      </w:pPr>
+      <w:r>
+        <w:rPr>
+          <w:rFonts w:ascii="Arial" w:cs="Arial" w:eastAsia="Arial" w:hAnsi="Arial"/>
+          <w:b/>
+          <w:bCs/>
+          <w:color w:val="1565C0"/>
+          <w:sz w:val="17"/>
+          <w:szCs w:val="17"/>
+        </w:rPr>
+        <w:t xml:space="preserve">Planned Deload — Week 5, Directly After the Week 4 Strength Check:  </w:t>
+      </w:r>
+      <w:r>
+        <w:rPr>
+          <w:rFonts w:ascii="Arial" w:cs="Arial" w:eastAsia="Arial" w:hAnsi="Arial"/>
+          <w:color w:val="2C2C2C"/>
+          <w:sz w:val="17"/>
+          <w:szCs w:val="17"/>
+        </w:rPr>
+        <w:t xml:space="preserve">This program deliberately includes one lighter week, and it is planned, not a reaction to anything going wrong. Week 5 — immediately after the Week 4 strength check — is a structured deload: the same exercises and the same movement patterns, with sets reduced by roughly a third, every set held comfortably in the technique band (3 or more reps in reserve), and loads held at Week 3-4 levels rather than climbing — the usual add-weight rule pauses for this one week. With previously-restricted movements still being reintroduced on a moderate-progression plan and a PT-set long-arc deadlift target underway, this is how the program consolidates the strength built in Weeks 1-4 before Weeks 6-8 rebuild from the Week 4 loads toward the 8-week retest. One light week costs nothing that matters: muscle built over the previous month is not lost in a single reduced-volume week — only a small edge of peak strength dips, and it returns within days of resuming.</w:t>
       </w:r>
     </w:p>
     <w:p>
@@ -2579,7 +2604,32 @@
           <w:sz w:val="17"/>
           <w:szCs w:val="17"/>
         </w:rPr>
-        <w:t xml:space="preserve">The same SOAP note above (SOAP_AimeeMorris_2026-08-10.pdf) documented a fuller PT-led warm-up and activation circuit than the headline additions alone captured. Folded in this update: (1) a full-body PVC-stick mobility routine (shoulder passovers, overhead squat with stick, hip openers) used as her actual session opener, added to Day A's warm-up; (2) Kettlebell Hip-Hinge Hang, an isometric hinge-position hold, added to Day A Block A alongside the dynamic hinge drills; (3) Glute Kickback (band or cable), added to Day A Block A — genuinely new, not already covered by the Day B "Keiser/DB Kickback" line, which is a tricep kickback; (4) Standing Hip-Hinge Back Fly and Around-the-World Lateral Raise, real postural/shoulder activation from the same session, now programmed as Day A Block C (Shoulder &amp; Postural Activation) with full sets/load/tempo/rest and RIR — they were originally folded into Day A's warm-up prose, which gave two genuinely loaded, rep-prescribed exercises no load columns, no progression, and no visibility to exercise-table audits (restructured 8/18/2026); (5) Walking Reach documented as a named low-fatigue regression option on the Single-Leg RDL exercise (not programmed as a standing swap — a DOMS-driven one-off accommodation, per the note above).</w:t>
+        <w:t xml:space="preserve">The same SOAP note above (SOAP_AimeeMorris_2026-08-10.pdf) documented a fuller PT-led warm-up and activation circuit than the headline additions alone captured. Folded in this update: (1) a full-body PVC-stick mobility routine (shoulder passovers, overhead squat with stick, hip openers) used as her actual session opener, added to Day A's warm-up; (2) Kettlebell Hip-Hinge Hang, an isometric hinge-position hold, added to Day A Block A alongside the dynamic hinge drills; (3) Glute Kickback (band or Kieser), added to Day A Block A — genuinely new, not already covered by the Day B "Kieser/DB Kickback" line (Day B Block D as of the 8/19 restructure), which is a tricep kickback; (4) Standing Hip-Hinge Back Fly and Around-the-World Lateral Raise, real postural/shoulder activation from the same session, now programmed as Day A's Shoulder &amp; Postural Activation block (Block D as of the 8/19 restructure) with full sets/load/tempo/rest and RIR — they were originally folded into Day A's warm-up prose, which gave two genuinely loaded, rep-prescribed exercises no load columns, no progression, and no visibility to exercise-table audits (restructured 8/18/2026); (5) Walking Reach documented as a named low-fatigue regression option on the Single-Leg RDL exercise (not programmed as a standing swap — a DOMS-driven one-off accommodation, per the note above).</w:t>
+      </w:r>
+    </w:p>
+    <w:p>
+      <w:pPr>
+        <w:spacing w:after="100"/>
+      </w:pPr>
+      <w:r>
+        <w:rPr>
+          <w:rFonts w:ascii="Arial" w:cs="Arial" w:eastAsia="Arial" w:hAnsi="Arial"/>
+          <w:b/>
+          <w:bCs/>
+          <w:color w:val="C9A227"/>
+          <w:sz w:val="17"/>
+          <w:szCs w:val="17"/>
+        </w:rPr>
+        <w:t xml:space="preserve">Session Architecture — ICONS Block Method Restructure (8/19/2026):  </w:t>
+      </w:r>
+      <w:r>
+        <w:rPr>
+          <w:rFonts w:ascii="Arial" w:cs="Arial" w:eastAsia="Arial" w:hAnsi="Arial"/>
+          <w:color w:val="2C2C2C"/>
+          <w:sz w:val="17"/>
+          <w:szCs w:val="17"/>
+        </w:rPr>
+        <w:t xml:space="preserve">Both days restructured onto the ICONS Block Method six-slot order (Corrective → Primary Compound → Accessory → Jason's Exercise → Secondary Compound → Third Compound/Integration) with the rendered exercise order on both days UNCHANGED — block boundaries and titles were re-cut around the existing sequence, which deliberately preserves the 8/12/2026 Antagonist Rotation four-in-a-row fixes and the 8/13/2026 Reverse Lunge insertion verbatim. Day A: slot 1 = Hip Hinge Corrective (Jason's hinge exercises stay slot-1 priming, as his session used them); slot 2 = Hex Bar Deadlift; slot 3 = Hip Thrust + DB Flat Bench + DB RDL; slot 4 = the Shoulder &amp; Postural Activation block (Back Fly + Around-the-World Raise are Jason's documented 8/10-session exercises and were already positioned exactly where slot 4 sits — pre-press); slot 5 = Press block; slot 6 = Loaded Carry + Core as integration; cardio finisher follows. Day B: slots 1 and 4 honestly omitted (no documented day-region corrective beyond the unloaded warm-up hinge rehearsal, and all Jason content lives on Day A as prescribed — importing it would be a dosing addition he didn't order); slot 2 = Split + Landmine Squat; slot 3 = Face Pull + Reverse Lunge + Step-Up; slot 5 = pull block (goblet squat stays its closer per the 8/12 fix); Push-Up Progression retained as a standing baseline-protocol block; slot 6 = the metabolic circuit as the integration closer. Compound-slot options menus (in block intros) were constraint-filtered before listing: barbell back squat, conventional barbell deadlift, and clean-to-overhead-press are excluded from every menu (deferred per the moderate-progression plan) and each exclusion is stated in the menu itself; overhead barbell pressing likewise excluded; the anchor lift is named in every menu. Same pass: cable→Kieser renames (incl. the old "Keiser" spelling), Week-5 proactive deload added (coordinated-care + reintroduction phase + 8-week arc), 4-week strength-check cadence stated, warm-up drift re-verified resolved (fixed 8/18), 10-movement coverage re-verified intact.</w:t>
       </w:r>
     </w:p>
     <w:p>
@@ -2779,7 +2829,7 @@
           <w:sz w:val="17"/>
           <w:szCs w:val="17"/>
         </w:rPr>
-        <w:t xml:space="preserve">10 min: 5 min stationary bike or treadmill walk (Zone 2 — cardiovascular warm-in). Then hip hinge rehearsal: PVC or broomstick hip hinge drill 2×10 (spine neutral, hinge from hips not back), glute bridge 2×15, dead bug 2×8 each side (spine decompression before loading), cat-cow 10 slow reps, ankle circles 10 each. PT-documented stick mobility circuit (from the 8/10 session): PVC/stick shoulder passovers 2×10 (front-to-back overhead pass, shoulder mobility prep ahead of today's pressing work), overhead squat with stick 2×8 (integrated hip/shoulder mobility), hip openers (90/90 or open-book) 8 each side. Shoulder and postural activation is not part of the warm-up — it runs as its own block (Block C) immediately before the pressing work, so it can be loaded and progressed properly.</w:t>
+        <w:t xml:space="preserve">10 min: 5 min stationary bike or treadmill walk (Zone 2 — cardiovascular warm-in). Then hip hinge rehearsal: PVC or broomstick hip hinge drill 2×10 (spine neutral, hinge from hips not back), glute bridge 2×15, dead bug 2×8 each side (spine decompression before loading), cat-cow 10 slow reps, ankle circles 10 each. PT-led stick mobility circuit, used as the session opener: PVC/stick shoulder passovers 2×10 (front-to-back overhead pass, shoulder mobility prep ahead of today's pressing work), overhead squat with stick 2×8 (integrated hip/shoulder mobility), hip openers (90/90 or open-book) 8 each side. Shoulder and postural activation is not part of the warm-up — it runs as its own block (Block D) immediately before the pressing work, so it can be loaded and progressed properly.</w:t>
       </w:r>
     </w:p>
     <w:p>
@@ -2820,7 +2870,7 @@
           <w:sz w:val="17"/>
           <w:szCs w:val="17"/>
         </w:rPr>
-        <w:t xml:space="preserve">Hip hinge needs improvement. This means Aimee is currently bending from the lumbar spine rather than hinging from the hip joint. Under load, this puts direct stress on the stenosis. These drills run before every deadlift set until the hinge is reflexive. Hip hinge cue: push the hips BACK toward the wall behind you, not down toward the floor. Kettlebell Hip-Hinge Hang and Glute Kickback are added this update — an isometric hinge-position hold and a targeted hip-extension isolation drill, both reinforcing the same hip-hinge/hip-extension quality this block exists to build. This whole block is quality-governed, not RIR-governed: the drills end when the hinge position degrades, never when the muscle fatigues, so no reps-in-reserve target is set on them.</w:t>
+        <w:t xml:space="preserve">Hip hinge needs improvement. This means Aimee is currently bending from the lumbar spine rather than hinging from the hip joint. Under load, this puts direct stress on the stenosis. These drills run before every deadlift set until the hinge is reflexive. Hip hinge cue: push the hips BACK toward the wall behind you, not down toward the floor. Kettlebell Hip-Hinge Hang and Glute Kickback — an isometric hinge-position hold and a targeted hip-extension isolation drill — both reinforce the same hip-hinge/hip-extension quality this block exists to build. This whole block is quality-governed, not RIR-governed: the drills end when the hinge position degrades, never when the muscle fatigues, so no reps-in-reserve target is set on them.</w:t>
       </w:r>
     </w:p>
     <w:tbl>
@@ -3773,7 +3823,7 @@
                 <w:sz w:val="17"/>
                 <w:szCs w:val="17"/>
               </w:rPr>
-              <w:t xml:space="preserve">New this update. Hold at the bottom of the hinge position — neutral spine, lats engaged, no eccentric loading. Builds hinge-position control and time-under-tension awareness without adding load stress before the working sets.</w:t>
+              <w:t xml:space="preserve">Hold at the bottom of the hinge position — neutral spine, lats engaged, no eccentric loading. Builds hinge-position control and time-under-tension awareness without adding load stress before the working sets.</w:t>
             </w:r>
           </w:p>
         </w:tc>
@@ -4244,7 +4294,7 @@
                 <w:sz w:val="17"/>
                 <w:szCs w:val="17"/>
               </w:rPr>
-              <w:t xml:space="preserve">New PT assessment tool. Hips at bench edge, one leg extends behind on a controlled hip-extension arc, opposite leg braces. Watch for pelvic rotation or lumbar compensation each side; quality over load.</w:t>
+              <w:t xml:space="preserve">PT assessment tool. Hips at bench edge, one leg extends behind on a controlled hip-extension arc, opposite leg braces. Watch for pelvic rotation or lumbar compensation each side; quality over load.</w:t>
             </w:r>
           </w:p>
         </w:tc>
@@ -4278,7 +4328,7 @@
                 <w:sz w:val="18"/>
                 <w:szCs w:val="18"/>
               </w:rPr>
-              <w:t xml:space="preserve">Glute Kickback (Band or Cable)</w:t>
+              <w:t xml:space="preserve">Glute Kickback (Band or Kieser)</w:t>
             </w:r>
           </w:p>
         </w:tc>
@@ -4377,7 +4427,7 @@
                 <w:sz w:val="15"/>
                 <w:szCs w:val="15"/>
               </w:rPr>
-              <w:t xml:space="preserve">Band or cable — light-mod</w:t>
+              <w:t xml:space="preserve">Band or Kieser — light-mod</w:t>
             </w:r>
           </w:p>
         </w:tc>
@@ -4473,7 +4523,7 @@
                 <w:sz w:val="17"/>
                 <w:szCs w:val="17"/>
               </w:rPr>
-              <w:t xml:space="preserve">New this update. Standing or quadruped hip extension, squeeze glute at end range, avoid lumbar extension/compensation. Isolated hip-extension activation reinforcing the hinge and hip thrust patterns above.</w:t>
+              <w:t xml:space="preserve">Standing or quadruped hip extension, squeeze glute at end range, avoid lumbar extension/compensation. Isolated hip-extension activation reinforcing the hinge and hip thrust patterns above.</w:t>
             </w:r>
             <w:r>
               <w:rPr>
@@ -4508,7 +4558,7 @@
           <w:sz w:val="17"/>
           <w:szCs w:val="17"/>
         </w:rPr>
-        <w:t xml:space="preserve">B — PRIMARY HINGE STRENGTH</w:t>
+        <w:t xml:space="preserve">B — PRIMARY COMPOUND — HEX BAR DEADLIFT</w:t>
       </w:r>
     </w:p>
     <w:p>
@@ -4533,7 +4583,7 @@
           <w:sz w:val="17"/>
           <w:szCs w:val="17"/>
         </w:rPr>
-        <w:t xml:space="preserve">Week 1 backs down to 95 lbs ×4×4. The 3RM baseline means technique may be under pressure at higher loads. Given the spinal stenosis, form is the absolute priority over load. Hip hinge corrective runs before every set. Add 5 lbs per week when all sets complete with clean hip hinge mechanics. Hex bar only — no conventional barbell. Hip thrust is new this block — hip-dominant and fully spine-safe, it reinforces the hip hinge pattern without any axial load. Your PT has set an explicit longer-arc target of 95 → 135 lbs over 6–8 weeks — this program's Wk1→Wk4 progression (95→120 lbs) is the compatible first step toward that goal.</w:t>
+        <w:t xml:space="preserve">The day's main lift. Week 1 backs down to 95 lbs ×4×4. The 3RM baseline means technique may be under pressure at higher loads — form is the absolute priority over load, and the hip hinge corrective runs before every set. Add 5 lbs per week when all sets complete with clean hip hinge mechanics. Hex bar only — no conventional barbell. Your PT has set an explicit longer-arc target of 95 → 135 lbs over 6–8 weeks — this program's Wk1→Wk4 progression (95→120 lbs) is the compatible first step toward that goal. If the day calls for a variation, rotate between: a double-DB Romanian deadlift, a hex bar pull from low blocks (shortened range, useful on a higher-fatigue day), or a B-stance DB RDL. The conventional barbell deadlift is not on this menu — it stays deferred to a later phase per the moderate-progression plan — and the hex bar lift stays the one we track and retest.</w:t>
       </w:r>
     </w:p>
     <w:tbl>
@@ -5044,6 +5094,74 @@
           </w:p>
         </w:tc>
       </w:tr>
+    </w:tbl>
+    <w:p>
+      <w:pPr>
+        <w:spacing w:after="100"/>
+      </w:pPr>
+    </w:p>
+    <w:p>
+      <w:pPr>
+        <w:spacing w:after="60" w:before="120"/>
+      </w:pPr>
+      <w:r>
+        <w:rPr>
+          <w:rFonts w:ascii="Arial" w:cs="Arial" w:eastAsia="Arial" w:hAnsi="Arial"/>
+          <w:b/>
+          <w:bCs/>
+          <w:color w:val="1565C0"/>
+          <w:sz w:val="17"/>
+          <w:szCs w:val="17"/>
+        </w:rPr>
+        <w:t xml:space="preserve">C — ACCESSORY — HIP THRUST, PRESS &amp; HINGE VOLUME</w:t>
+      </w:r>
+    </w:p>
+    <w:p>
+      <w:pPr>
+        <w:spacing w:after="80"/>
+      </w:pPr>
+      <w:r>
+        <w:rPr>
+          <w:rFonts w:ascii="Arial" w:cs="Arial" w:eastAsia="Arial" w:hAnsi="Arial"/>
+          <w:b/>
+          <w:bCs/>
+          <w:color w:val="1565C0"/>
+          <w:sz w:val="17"/>
+          <w:szCs w:val="17"/>
+        </w:rPr>
+        <w:t xml:space="preserve">Accessory Load Targets:  </w:t>
+      </w:r>
+      <w:r>
+        <w:rPr>
+          <w:rFonts w:ascii="Arial" w:cs="Arial" w:eastAsia="Arial" w:hAnsi="Arial"/>
+          <w:color w:val="2C2C2C"/>
+          <w:sz w:val="17"/>
+          <w:szCs w:val="17"/>
+        </w:rPr>
+        <w:t xml:space="preserve">The muscle-building volume directly behind the deadlift: hip thrust (hip-dominant and fully spine-safe — it reinforces the hip hinge pattern without any axial load), supine flat pressing, and DB hinge volume, in an order that never stacks the same pattern three times running. If the hip thrust needs a variation: a floor glute bridge or a B-stance hip thrust covers the same pattern at the same spine-safe angle — the bench-supported hip thrust stays the lift we track.</w:t>
+      </w:r>
+    </w:p>
+    <w:tbl>
+      <w:tblPr>
+        <w:tblW w:type="dxa" w:w="10440"/>
+        <w:tblBorders>
+          <w:top w:val="none" w:color="FFFFFF" w:sz="0"/>
+          <w:left w:val="none" w:color="FFFFFF" w:sz="0"/>
+          <w:bottom w:val="none" w:color="FFFFFF" w:sz="0"/>
+          <w:right w:val="none" w:color="FFFFFF" w:sz="0"/>
+          <w:insideH w:val="single" w:color="auto" w:sz="4"/>
+          <w:insideV w:val="single" w:color="auto" w:sz="4"/>
+        </w:tblBorders>
+      </w:tblPr>
+      <w:tblGrid>
+        <w:gridCol w:w="2400"/>
+        <w:gridCol w:w="380"/>
+        <w:gridCol w:w="420"/>
+        <w:gridCol w:w="680"/>
+        <w:gridCol w:w="540"/>
+        <w:gridCol w:w="440"/>
+        <w:gridCol w:w="5580"/>
+      </w:tblGrid>
       <w:tr>
         <w:tc>
           <w:tcPr>
@@ -5054,7 +5172,254 @@
               <w:bottom w:val="none" w:color="FFFFFF" w:sz="0"/>
               <w:right w:val="none" w:color="FFFFFF" w:sz="0"/>
             </w:tcBorders>
-            <w:shd w:fill="FFFFFF" w:color="auto" w:val="clear"/>
+            <w:shd w:fill="EAF4FB" w:color="auto" w:val="clear"/>
+            <w:tcMar>
+              <w:top w:type="dxa" w:w="40"/>
+              <w:left w:type="dxa" w:w="80"/>
+              <w:bottom w:type="dxa" w:w="40"/>
+              <w:right w:type="dxa" w:w="80"/>
+            </w:tcMar>
+            <w:vAlign w:val="center"/>
+          </w:tcPr>
+          <w:p>
+            <w:pPr>
+              <w:jc w:val="left"/>
+            </w:pPr>
+            <w:r>
+              <w:rPr>
+                <w:rFonts w:ascii="Arial" w:cs="Arial" w:eastAsia="Arial" w:hAnsi="Arial"/>
+                <w:b/>
+                <w:bCs/>
+                <w:color w:val="1565C0"/>
+                <w:sz w:val="15"/>
+                <w:szCs w:val="15"/>
+              </w:rPr>
+              <w:t xml:space="preserve">EXERCISE</w:t>
+            </w:r>
+          </w:p>
+        </w:tc>
+        <w:tc>
+          <w:tcPr>
+            <w:tcW w:type="dxa" w:w="380"/>
+            <w:tcBorders>
+              <w:top w:val="none" w:color="FFFFFF" w:sz="0"/>
+              <w:left w:val="none" w:color="FFFFFF" w:sz="0"/>
+              <w:bottom w:val="none" w:color="FFFFFF" w:sz="0"/>
+              <w:right w:val="none" w:color="FFFFFF" w:sz="0"/>
+            </w:tcBorders>
+            <w:shd w:fill="EAF4FB" w:color="auto" w:val="clear"/>
+            <w:tcMar>
+              <w:top w:type="dxa" w:w="40"/>
+              <w:left w:type="dxa" w:w="80"/>
+              <w:bottom w:type="dxa" w:w="40"/>
+              <w:right w:type="dxa" w:w="80"/>
+            </w:tcMar>
+            <w:vAlign w:val="center"/>
+          </w:tcPr>
+          <w:p>
+            <w:pPr>
+              <w:jc w:val="center"/>
+            </w:pPr>
+            <w:r>
+              <w:rPr>
+                <w:rFonts w:ascii="Arial" w:cs="Arial" w:eastAsia="Arial" w:hAnsi="Arial"/>
+                <w:b/>
+                <w:bCs/>
+                <w:color w:val="1565C0"/>
+                <w:sz w:val="13"/>
+                <w:szCs w:val="13"/>
+              </w:rPr>
+              <w:t xml:space="preserve">SETS</w:t>
+            </w:r>
+          </w:p>
+        </w:tc>
+        <w:tc>
+          <w:tcPr>
+            <w:tcW w:type="dxa" w:w="420"/>
+            <w:tcBorders>
+              <w:top w:val="none" w:color="FFFFFF" w:sz="0"/>
+              <w:left w:val="none" w:color="FFFFFF" w:sz="0"/>
+              <w:bottom w:val="none" w:color="FFFFFF" w:sz="0"/>
+              <w:right w:val="none" w:color="FFFFFF" w:sz="0"/>
+            </w:tcBorders>
+            <w:shd w:fill="EAF4FB" w:color="auto" w:val="clear"/>
+            <w:tcMar>
+              <w:top w:type="dxa" w:w="40"/>
+              <w:left w:type="dxa" w:w="80"/>
+              <w:bottom w:type="dxa" w:w="40"/>
+              <w:right w:type="dxa" w:w="80"/>
+            </w:tcMar>
+            <w:vAlign w:val="center"/>
+          </w:tcPr>
+          <w:p>
+            <w:pPr>
+              <w:jc w:val="center"/>
+            </w:pPr>
+            <w:r>
+              <w:rPr>
+                <w:rFonts w:ascii="Arial" w:cs="Arial" w:eastAsia="Arial" w:hAnsi="Arial"/>
+                <w:b/>
+                <w:bCs/>
+                <w:color w:val="1565C0"/>
+                <w:sz w:val="13"/>
+                <w:szCs w:val="13"/>
+              </w:rPr>
+              <w:t xml:space="preserve">REPS</w:t>
+            </w:r>
+          </w:p>
+        </w:tc>
+        <w:tc>
+          <w:tcPr>
+            <w:tcW w:type="dxa" w:w="680"/>
+            <w:tcBorders>
+              <w:top w:val="none" w:color="FFFFFF" w:sz="0"/>
+              <w:left w:val="none" w:color="FFFFFF" w:sz="0"/>
+              <w:bottom w:val="none" w:color="FFFFFF" w:sz="0"/>
+              <w:right w:val="none" w:color="FFFFFF" w:sz="0"/>
+            </w:tcBorders>
+            <w:shd w:fill="EAF4FB" w:color="auto" w:val="clear"/>
+            <w:tcMar>
+              <w:top w:type="dxa" w:w="40"/>
+              <w:left w:type="dxa" w:w="80"/>
+              <w:bottom w:type="dxa" w:w="40"/>
+              <w:right w:type="dxa" w:w="80"/>
+            </w:tcMar>
+            <w:vAlign w:val="center"/>
+          </w:tcPr>
+          <w:p>
+            <w:pPr>
+              <w:jc w:val="center"/>
+            </w:pPr>
+            <w:r>
+              <w:rPr>
+                <w:rFonts w:ascii="Arial" w:cs="Arial" w:eastAsia="Arial" w:hAnsi="Arial"/>
+                <w:b/>
+                <w:bCs/>
+                <w:color w:val="1565C0"/>
+                <w:sz w:val="13"/>
+                <w:szCs w:val="13"/>
+              </w:rPr>
+              <w:t xml:space="preserve">LOAD</w:t>
+            </w:r>
+          </w:p>
+        </w:tc>
+        <w:tc>
+          <w:tcPr>
+            <w:tcW w:type="dxa" w:w="540"/>
+            <w:tcBorders>
+              <w:top w:val="none" w:color="FFFFFF" w:sz="0"/>
+              <w:left w:val="none" w:color="FFFFFF" w:sz="0"/>
+              <w:bottom w:val="none" w:color="FFFFFF" w:sz="0"/>
+              <w:right w:val="none" w:color="FFFFFF" w:sz="0"/>
+            </w:tcBorders>
+            <w:shd w:fill="EAF4FB" w:color="auto" w:val="clear"/>
+            <w:tcMar>
+              <w:top w:type="dxa" w:w="40"/>
+              <w:left w:type="dxa" w:w="80"/>
+              <w:bottom w:type="dxa" w:w="40"/>
+              <w:right w:type="dxa" w:w="80"/>
+            </w:tcMar>
+            <w:vAlign w:val="center"/>
+          </w:tcPr>
+          <w:p>
+            <w:pPr>
+              <w:jc w:val="center"/>
+            </w:pPr>
+            <w:r>
+              <w:rPr>
+                <w:rFonts w:ascii="Arial" w:cs="Arial" w:eastAsia="Arial" w:hAnsi="Arial"/>
+                <w:b/>
+                <w:bCs/>
+                <w:color w:val="1565C0"/>
+                <w:sz w:val="13"/>
+                <w:szCs w:val="13"/>
+              </w:rPr>
+              <w:t xml:space="preserve">TEMPO</w:t>
+            </w:r>
+          </w:p>
+        </w:tc>
+        <w:tc>
+          <w:tcPr>
+            <w:tcW w:type="dxa" w:w="440"/>
+            <w:tcBorders>
+              <w:top w:val="none" w:color="FFFFFF" w:sz="0"/>
+              <w:left w:val="none" w:color="FFFFFF" w:sz="0"/>
+              <w:bottom w:val="none" w:color="FFFFFF" w:sz="0"/>
+              <w:right w:val="none" w:color="FFFFFF" w:sz="0"/>
+            </w:tcBorders>
+            <w:shd w:fill="EAF4FB" w:color="auto" w:val="clear"/>
+            <w:tcMar>
+              <w:top w:type="dxa" w:w="40"/>
+              <w:left w:type="dxa" w:w="80"/>
+              <w:bottom w:type="dxa" w:w="40"/>
+              <w:right w:type="dxa" w:w="80"/>
+            </w:tcMar>
+            <w:vAlign w:val="center"/>
+          </w:tcPr>
+          <w:p>
+            <w:pPr>
+              <w:jc w:val="center"/>
+            </w:pPr>
+            <w:r>
+              <w:rPr>
+                <w:rFonts w:ascii="Arial" w:cs="Arial" w:eastAsia="Arial" w:hAnsi="Arial"/>
+                <w:b/>
+                <w:bCs/>
+                <w:color w:val="1565C0"/>
+                <w:sz w:val="13"/>
+                <w:szCs w:val="13"/>
+              </w:rPr>
+              <w:t xml:space="preserve">REST</w:t>
+            </w:r>
+          </w:p>
+        </w:tc>
+        <w:tc>
+          <w:tcPr>
+            <w:tcW w:type="dxa" w:w="5580"/>
+            <w:tcBorders>
+              <w:top w:val="none" w:color="FFFFFF" w:sz="0"/>
+              <w:left w:val="none" w:color="FFFFFF" w:sz="0"/>
+              <w:bottom w:val="none" w:color="FFFFFF" w:sz="0"/>
+              <w:right w:val="none" w:color="FFFFFF" w:sz="0"/>
+            </w:tcBorders>
+            <w:shd w:fill="EAF4FB" w:color="auto" w:val="clear"/>
+            <w:tcMar>
+              <w:top w:type="dxa" w:w="40"/>
+              <w:left w:type="dxa" w:w="80"/>
+              <w:bottom w:type="dxa" w:w="40"/>
+              <w:right w:type="dxa" w:w="80"/>
+            </w:tcMar>
+            <w:vAlign w:val="center"/>
+          </w:tcPr>
+          <w:p>
+            <w:pPr>
+              <w:jc w:val="left"/>
+            </w:pPr>
+            <w:r>
+              <w:rPr>
+                <w:rFonts w:ascii="Arial" w:cs="Arial" w:eastAsia="Arial" w:hAnsi="Arial"/>
+                <w:b/>
+                <w:bCs/>
+                <w:color w:val="1565C0"/>
+                <w:sz w:val="15"/>
+                <w:szCs w:val="15"/>
+              </w:rPr>
+              <w:t xml:space="preserve">COACHING CUE</w:t>
+            </w:r>
+          </w:p>
+        </w:tc>
+      </w:tr>
+      <w:tr>
+        <w:tc>
+          <w:tcPr>
+            <w:tcW w:type="dxa" w:w="2400"/>
+            <w:tcBorders>
+              <w:top w:val="none" w:color="FFFFFF" w:sz="0"/>
+              <w:left w:val="none" w:color="FFFFFF" w:sz="0"/>
+              <w:bottom w:val="none" w:color="FFFFFF" w:sz="0"/>
+              <w:right w:val="none" w:color="FFFFFF" w:sz="0"/>
+            </w:tcBorders>
+            <w:shd w:fill="F0F7FF" w:color="auto" w:val="clear"/>
             <w:tcMar>
               <w:top w:type="dxa" w:w="40"/>
               <w:left w:type="dxa" w:w="80"/>
@@ -5086,7 +5451,7 @@
               <w:bottom w:val="none" w:color="FFFFFF" w:sz="0"/>
               <w:right w:val="none" w:color="FFFFFF" w:sz="0"/>
             </w:tcBorders>
-            <w:shd w:fill="FFFFFF" w:color="auto" w:val="clear"/>
+            <w:shd w:fill="F0F7FF" w:color="auto" w:val="clear"/>
             <w:tcMar>
               <w:top w:type="dxa" w:w="40"/>
               <w:left w:type="dxa" w:w="80"/>
@@ -5119,7 +5484,7 @@
               <w:bottom w:val="none" w:color="FFFFFF" w:sz="0"/>
               <w:right w:val="none" w:color="FFFFFF" w:sz="0"/>
             </w:tcBorders>
-            <w:shd w:fill="FFFFFF" w:color="auto" w:val="clear"/>
+            <w:shd w:fill="F0F7FF" w:color="auto" w:val="clear"/>
             <w:tcMar>
               <w:top w:type="dxa" w:w="40"/>
               <w:left w:type="dxa" w:w="80"/>
@@ -5152,7 +5517,7 @@
               <w:bottom w:val="none" w:color="FFFFFF" w:sz="0"/>
               <w:right w:val="none" w:color="FFFFFF" w:sz="0"/>
             </w:tcBorders>
-            <w:shd w:fill="FFFFFF" w:color="auto" w:val="clear"/>
+            <w:shd w:fill="F0F7FF" w:color="auto" w:val="clear"/>
             <w:tcMar>
               <w:top w:type="dxa" w:w="40"/>
               <w:left w:type="dxa" w:w="80"/>
@@ -5185,7 +5550,7 @@
               <w:bottom w:val="none" w:color="FFFFFF" w:sz="0"/>
               <w:right w:val="none" w:color="FFFFFF" w:sz="0"/>
             </w:tcBorders>
-            <w:shd w:fill="FFFFFF" w:color="auto" w:val="clear"/>
+            <w:shd w:fill="F0F7FF" w:color="auto" w:val="clear"/>
             <w:tcMar>
               <w:top w:type="dxa" w:w="40"/>
               <w:left w:type="dxa" w:w="80"/>
@@ -5218,7 +5583,7 @@
               <w:bottom w:val="none" w:color="FFFFFF" w:sz="0"/>
               <w:right w:val="none" w:color="FFFFFF" w:sz="0"/>
             </w:tcBorders>
-            <w:shd w:fill="FFFFFF" w:color="auto" w:val="clear"/>
+            <w:shd w:fill="F0F7FF" w:color="auto" w:val="clear"/>
             <w:tcMar>
               <w:top w:type="dxa" w:w="40"/>
               <w:left w:type="dxa" w:w="80"/>
@@ -5251,7 +5616,7 @@
               <w:bottom w:val="none" w:color="FFFFFF" w:sz="0"/>
               <w:right w:val="none" w:color="FFFFFF" w:sz="0"/>
             </w:tcBorders>
-            <w:shd w:fill="FFFFFF" w:color="auto" w:val="clear"/>
+            <w:shd w:fill="F0F7FF" w:color="auto" w:val="clear"/>
             <w:tcMar>
               <w:top w:type="dxa" w:w="40"/>
               <w:left w:type="dxa" w:w="80"/>
@@ -5294,7 +5659,7 @@
               <w:bottom w:val="none" w:color="FFFFFF" w:sz="0"/>
               <w:right w:val="none" w:color="FFFFFF" w:sz="0"/>
             </w:tcBorders>
-            <w:shd w:fill="F0F7FF" w:color="auto" w:val="clear"/>
+            <w:shd w:fill="FFFFFF" w:color="auto" w:val="clear"/>
             <w:tcMar>
               <w:top w:type="dxa" w:w="40"/>
               <w:left w:type="dxa" w:w="80"/>
@@ -5326,7 +5691,7 @@
               <w:bottom w:val="none" w:color="FFFFFF" w:sz="0"/>
               <w:right w:val="none" w:color="FFFFFF" w:sz="0"/>
             </w:tcBorders>
-            <w:shd w:fill="F0F7FF" w:color="auto" w:val="clear"/>
+            <w:shd w:fill="FFFFFF" w:color="auto" w:val="clear"/>
             <w:tcMar>
               <w:top w:type="dxa" w:w="40"/>
               <w:left w:type="dxa" w:w="80"/>
@@ -5359,7 +5724,7 @@
               <w:bottom w:val="none" w:color="FFFFFF" w:sz="0"/>
               <w:right w:val="none" w:color="FFFFFF" w:sz="0"/>
             </w:tcBorders>
-            <w:shd w:fill="F0F7FF" w:color="auto" w:val="clear"/>
+            <w:shd w:fill="FFFFFF" w:color="auto" w:val="clear"/>
             <w:tcMar>
               <w:top w:type="dxa" w:w="40"/>
               <w:left w:type="dxa" w:w="80"/>
@@ -5392,7 +5757,7 @@
               <w:bottom w:val="none" w:color="FFFFFF" w:sz="0"/>
               <w:right w:val="none" w:color="FFFFFF" w:sz="0"/>
             </w:tcBorders>
-            <w:shd w:fill="F0F7FF" w:color="auto" w:val="clear"/>
+            <w:shd w:fill="FFFFFF" w:color="auto" w:val="clear"/>
             <w:tcMar>
               <w:top w:type="dxa" w:w="40"/>
               <w:left w:type="dxa" w:w="80"/>
@@ -5425,7 +5790,7 @@
               <w:bottom w:val="none" w:color="FFFFFF" w:sz="0"/>
               <w:right w:val="none" w:color="FFFFFF" w:sz="0"/>
             </w:tcBorders>
-            <w:shd w:fill="F0F7FF" w:color="auto" w:val="clear"/>
+            <w:shd w:fill="FFFFFF" w:color="auto" w:val="clear"/>
             <w:tcMar>
               <w:top w:type="dxa" w:w="40"/>
               <w:left w:type="dxa" w:w="80"/>
@@ -5458,7 +5823,7 @@
               <w:bottom w:val="none" w:color="FFFFFF" w:sz="0"/>
               <w:right w:val="none" w:color="FFFFFF" w:sz="0"/>
             </w:tcBorders>
-            <w:shd w:fill="F0F7FF" w:color="auto" w:val="clear"/>
+            <w:shd w:fill="FFFFFF" w:color="auto" w:val="clear"/>
             <w:tcMar>
               <w:top w:type="dxa" w:w="40"/>
               <w:left w:type="dxa" w:w="80"/>
@@ -5491,7 +5856,7 @@
               <w:bottom w:val="none" w:color="FFFFFF" w:sz="0"/>
               <w:right w:val="none" w:color="FFFFFF" w:sz="0"/>
             </w:tcBorders>
-            <w:shd w:fill="F0F7FF" w:color="auto" w:val="clear"/>
+            <w:shd w:fill="FFFFFF" w:color="auto" w:val="clear"/>
             <w:tcMar>
               <w:top w:type="dxa" w:w="40"/>
               <w:left w:type="dxa" w:w="80"/>
@@ -5534,7 +5899,7 @@
               <w:bottom w:val="none" w:color="FFFFFF" w:sz="0"/>
               <w:right w:val="none" w:color="FFFFFF" w:sz="0"/>
             </w:tcBorders>
-            <w:shd w:fill="FFFFFF" w:color="auto" w:val="clear"/>
+            <w:shd w:fill="F0F7FF" w:color="auto" w:val="clear"/>
             <w:tcMar>
               <w:top w:type="dxa" w:w="40"/>
               <w:left w:type="dxa" w:w="80"/>
@@ -5566,7 +5931,7 @@
               <w:bottom w:val="none" w:color="FFFFFF" w:sz="0"/>
               <w:right w:val="none" w:color="FFFFFF" w:sz="0"/>
             </w:tcBorders>
-            <w:shd w:fill="FFFFFF" w:color="auto" w:val="clear"/>
+            <w:shd w:fill="F0F7FF" w:color="auto" w:val="clear"/>
             <w:tcMar>
               <w:top w:type="dxa" w:w="40"/>
               <w:left w:type="dxa" w:w="80"/>
@@ -5599,7 +5964,7 @@
               <w:bottom w:val="none" w:color="FFFFFF" w:sz="0"/>
               <w:right w:val="none" w:color="FFFFFF" w:sz="0"/>
             </w:tcBorders>
-            <w:shd w:fill="FFFFFF" w:color="auto" w:val="clear"/>
+            <w:shd w:fill="F0F7FF" w:color="auto" w:val="clear"/>
             <w:tcMar>
               <w:top w:type="dxa" w:w="40"/>
               <w:left w:type="dxa" w:w="80"/>
@@ -5632,7 +5997,7 @@
               <w:bottom w:val="none" w:color="FFFFFF" w:sz="0"/>
               <w:right w:val="none" w:color="FFFFFF" w:sz="0"/>
             </w:tcBorders>
-            <w:shd w:fill="FFFFFF" w:color="auto" w:val="clear"/>
+            <w:shd w:fill="F0F7FF" w:color="auto" w:val="clear"/>
             <w:tcMar>
               <w:top w:type="dxa" w:w="40"/>
               <w:left w:type="dxa" w:w="80"/>
@@ -5665,7 +6030,7 @@
               <w:bottom w:val="none" w:color="FFFFFF" w:sz="0"/>
               <w:right w:val="none" w:color="FFFFFF" w:sz="0"/>
             </w:tcBorders>
-            <w:shd w:fill="FFFFFF" w:color="auto" w:val="clear"/>
+            <w:shd w:fill="F0F7FF" w:color="auto" w:val="clear"/>
             <w:tcMar>
               <w:top w:type="dxa" w:w="40"/>
               <w:left w:type="dxa" w:w="80"/>
@@ -5698,7 +6063,7 @@
               <w:bottom w:val="none" w:color="FFFFFF" w:sz="0"/>
               <w:right w:val="none" w:color="FFFFFF" w:sz="0"/>
             </w:tcBorders>
-            <w:shd w:fill="FFFFFF" w:color="auto" w:val="clear"/>
+            <w:shd w:fill="F0F7FF" w:color="auto" w:val="clear"/>
             <w:tcMar>
               <w:top w:type="dxa" w:w="40"/>
               <w:left w:type="dxa" w:w="80"/>
@@ -5731,7 +6096,7 @@
               <w:bottom w:val="none" w:color="FFFFFF" w:sz="0"/>
               <w:right w:val="none" w:color="FFFFFF" w:sz="0"/>
             </w:tcBorders>
-            <w:shd w:fill="FFFFFF" w:color="auto" w:val="clear"/>
+            <w:shd w:fill="F0F7FF" w:color="auto" w:val="clear"/>
             <w:tcMar>
               <w:top w:type="dxa" w:w="40"/>
               <w:left w:type="dxa" w:w="80"/>
@@ -5783,7 +6148,7 @@
           <w:sz w:val="17"/>
           <w:szCs w:val="17"/>
         </w:rPr>
-        <w:t xml:space="preserve">C — SHOULDER &amp; POSTURAL ACTIVATION</w:t>
+        <w:t xml:space="preserve">D — PT-LED SHOULDER &amp; POSTURAL ACTIVATION</w:t>
       </w:r>
     </w:p>
     <w:p>
@@ -5808,7 +6173,7 @@
           <w:sz w:val="17"/>
           <w:szCs w:val="17"/>
         </w:rPr>
-        <w:t xml:space="preserve">Two light postural/shoulder drills from the 8/10 PT session, primed immediately before the pressing work below. Rear-delt and upper-back activation counteracts the forward-shoulder posture that makes overhead pressing feel tight, and full-range abduction wakes up the shoulder through its whole arc before it has to hold load overhead. Deliberately light and deliberately sub-maximal — the goal is a switched-on shoulder going into Block D, not fatigue. Both movements are tracked with real loads and a progression the same way every other trained exercise in this program is.</w:t>
+        <w:t xml:space="preserve">Two light postural/shoulder drills from her PT-led session work with Jason Bethea, Brace Life's in-house Trainer/Physical Therapist, primed immediately before the pressing work below — keeping in-session continuity with his hands-on work. Rear-delt and upper-back activation counteracts the forward-shoulder posture that makes overhead pressing feel tight, and full-range abduction wakes up the shoulder through its whole arc before it has to hold load overhead. Deliberately light and deliberately sub-maximal — the goal is a switched-on shoulder going into Block E, not fatigue. Both movements are tracked with real loads and a progression the same way every other trained exercise in this program is.</w:t>
       </w:r>
     </w:p>
     <w:tbl>
@@ -6604,7 +6969,7 @@
           <w:sz w:val="17"/>
           <w:szCs w:val="17"/>
         </w:rPr>
-        <w:t xml:space="preserve">D — PRIMARY PRESS STRENGTH</w:t>
+        <w:t xml:space="preserve">E — SECONDARY COMPOUND — PRESS STRENGTH</w:t>
       </w:r>
     </w:p>
     <w:p>
@@ -6629,7 +6994,7 @@
           <w:sz w:val="17"/>
           <w:szCs w:val="17"/>
         </w:rPr>
-        <w:t xml:space="preserve">All pressing is dumbbell-based — no barbell overhead press. Dumbbells allow the spine to remain in a more neutral position and reduce axial load vs a barbell. Seated overhead press is preferred for spinal stenosis (supported lumbar spine). Flat bench press is new this block — fully supine, no axial load. Avoid pressing to absolute failure — brace fails first.</w:t>
+        <w:t xml:space="preserve">The day's second compound pattern — pressing, rotating off the hinge work above. All pressing is dumbbell-based — no barbell overhead press. Dumbbells allow the spine to remain in a more neutral position and reduce axial load vs a barbell. Seated overhead press is preferred for spinal stenosis (supported lumbar spine). Avoid pressing to absolute failure — brace fails first. If the day calls for a press variation, rotate between: a landmine press (angled path, easy on the spine — the same logic as the landmine squat), a half-kneeling single-arm DB press, or a higher-incline DB press. Barbell overhead pressing and the clean-to-press stay off this menu — both deferred per the moderate-progression plan — and the seated DB press and incline press stay the lifts we track and retest.</w:t>
       </w:r>
     </w:p>
     <w:tbl>
@@ -7892,7 +8257,7 @@
           <w:sz w:val="17"/>
           <w:szCs w:val="17"/>
         </w:rPr>
-        <w:t xml:space="preserve">E — LOADED CARRY + CORE</w:t>
+        <w:t xml:space="preserve">F — FULL-BODY INTEGRATION — LOADED CARRY + CORE</w:t>
       </w:r>
     </w:p>
     <w:p>
@@ -7917,7 +8282,7 @@
           <w:sz w:val="17"/>
           <w:szCs w:val="17"/>
         </w:rPr>
-        <w:t xml:space="preserve">Loaded carries build deep spinal stabilizer strength (multifidus, QL) with neutral spine and shoulders packed. Sit-up and bicycle crunch are new this update — previously restricted, now cleared, reintroduced at moderate volume and controlled tempo. Stop and flag any discomfort rather than pushing through. Nothing in this block carries an RIR target: the carry is governed by distance and posture, the plank by time, and the core work by control and symptom response — a carry that ends because the grip failed is a different (and worse) set than one that ends with the spine still stacked.</w:t>
+        <w:t xml:space="preserve">The session's closing compound work — the carry pulls today's hinge strength, pressing posture, and core bracing together under gait, building deep spinal stabilizer strength (multifidus, QL) with neutral spine and shoulders packed. Sit-up and bicycle crunch are newly reintroduced — previously restricted, now cleared — at moderate volume and controlled tempo; stop and flag any discomfort rather than pushing through. Nothing in this block carries an RIR target: the carry is governed by distance and posture, the plank by time, and the core work by control and symptom response — a carry that ends because the grip failed is a different (and worse) set than one that ends with the spine still stacked. If a carry variation suits the day: a front-rack or goblet carry (upright-posture bias), or a light suitcase carry (one side at a time — brace against the lean, and keep it lighter than the two-hand carry). If carry loads ever progress past 60 lbs per hand, the carry moves to the hex bar.</w:t>
       </w:r>
     </w:p>
     <w:tbl>
@@ -9123,7 +9488,7 @@
           <w:sz w:val="17"/>
           <w:szCs w:val="17"/>
         </w:rPr>
-        <w:t xml:space="preserve">F — CARDIOVASCULAR FINISHER (CHOOSE ONE)</w:t>
+        <w:t xml:space="preserve">G — CARDIOVASCULAR FINISHER (CHOOSE ONE)</w:t>
       </w:r>
     </w:p>
     <w:p>
@@ -10330,7 +10695,7 @@
                 <w:sz w:val="17"/>
                 <w:szCs w:val="17"/>
               </w:rPr>
-              <w:t xml:space="preserve">New option from cross-training notes. Drive aggressively from the hips, short rest between rounds. Horizontal loading — well tolerated even while other patterns are being reintroduced gradually.</w:t>
+              <w:t xml:space="preserve">Drive aggressively from the hips, short rest between rounds. Horizontal loading — well tolerated even while other patterns are being reintroduced gradually.</w:t>
             </w:r>
           </w:p>
         </w:tc>
@@ -10675,7 +11040,7 @@
           <w:sz w:val="17"/>
           <w:szCs w:val="17"/>
         </w:rPr>
-        <w:t xml:space="preserve">A — PRIMARY SQUAT STRENGTH</w:t>
+        <w:t xml:space="preserve">A — PRIMARY COMPOUND — SPLIT SQUAT &amp; LANDMINE SQUAT</w:t>
       </w:r>
     </w:p>
     <w:p>
@@ -10700,7 +11065,7 @@
           <w:sz w:val="17"/>
           <w:szCs w:val="17"/>
         </w:rPr>
-        <w:t xml:space="preserve">DB split squat and goblet squat remain the primary lower body movements on Day B. Landmine squat is new this update — the angled bar path is more forgiving than a straight barbell back squat, a good bridge exercise while barbell squatting itself is still deferred (see baseline notes). The split squat 3RM baseline (35 lbs/hand) suggests form may be under pressure at max load — Week 1 trains at 25 lbs for 8 reps with full depth focus. Reverse Lunge is new this update — a genuinely distinct lunge-pattern movement from DB Split Squat, started at bodyweight.</w:t>
+        <w:t xml:space="preserve">The day's main squat-pattern work. The split squat 3RM baseline (35 lbs/hand) suggests form may be under pressure at max load — Week 1 trains at 25 lbs for 8 reps with full depth focus. Landmine squat pairs directly behind it — the angled bar path is more forgiving than a straight barbell back squat, a good bridge exercise while barbell squatting itself is still deferred (see baseline notes). If the day calls for a squat variation, rotate between: a goblet squat (also programmed later today), a box squat (depth set by the box — a genuinely useful choice on a heavier-feeling day), or a supported split squat holding a rail. The barbell back squat is not on this menu — it stays deferred to a later phase per the moderate-progression plan — and the DB split squat stays the lift we track and retest.</w:t>
       </w:r>
     </w:p>
     <w:tbl>
@@ -11435,7 +11800,7 @@
                 <w:sz w:val="17"/>
                 <w:szCs w:val="17"/>
               </w:rPr>
-              <w:t xml:space="preserve">New this update. Chest up, drive through heels, full ROM. Angled bar path loads the spine more forgivingly than a straight barbell — bridges toward barbell squatting once that's reintroduced.</w:t>
+              <w:t xml:space="preserve">Chest up, drive through heels, full ROM. Angled bar path loads the spine more forgivingly than a straight barbell — bridges toward barbell squatting once that's reintroduced.</w:t>
             </w:r>
             <w:r>
               <w:rPr>
@@ -11451,6 +11816,74 @@
           </w:p>
         </w:tc>
       </w:tr>
+    </w:tbl>
+    <w:p>
+      <w:pPr>
+        <w:spacing w:after="100"/>
+      </w:pPr>
+    </w:p>
+    <w:p>
+      <w:pPr>
+        <w:spacing w:after="60" w:before="120"/>
+      </w:pPr>
+      <w:r>
+        <w:rPr>
+          <w:rFonts w:ascii="Arial" w:cs="Arial" w:eastAsia="Arial" w:hAnsi="Arial"/>
+          <w:b/>
+          <w:bCs/>
+          <w:color w:val="C9A227"/>
+          <w:sz w:val="17"/>
+          <w:szCs w:val="17"/>
+        </w:rPr>
+        <w:t xml:space="preserve">B — ACCESSORY — SHOULDER HEALTH &amp; LUNGE PATTERNS</w:t>
+      </w:r>
+    </w:p>
+    <w:p>
+      <w:pPr>
+        <w:spacing w:after="80"/>
+      </w:pPr>
+      <w:r>
+        <w:rPr>
+          <w:rFonts w:ascii="Arial" w:cs="Arial" w:eastAsia="Arial" w:hAnsi="Arial"/>
+          <w:b/>
+          <w:bCs/>
+          <w:color w:val="C9A227"/>
+          <w:sz w:val="17"/>
+          <w:szCs w:val="17"/>
+        </w:rPr>
+        <w:t xml:space="preserve">Why This Order:  </w:t>
+      </w:r>
+      <w:r>
+        <w:rPr>
+          <w:rFonts w:ascii="Arial" w:cs="Arial" w:eastAsia="Arial" w:hAnsi="Arial"/>
+          <w:color w:val="2C2C2C"/>
+          <w:sz w:val="17"/>
+          <w:szCs w:val="17"/>
+        </w:rPr>
+        <w:t xml:space="preserve">Accessory work behind the squat pair: the face pull breaks up the leg patterns while doing non-negotiable rear-delt/rotator-cuff work, then the lunge patterns close the block — a true stepping reverse lunge (genuinely distinct from the stationary split squat) followed by the step-up. This order never stacks three same-pattern leg exercises in a row.</w:t>
+      </w:r>
+    </w:p>
+    <w:tbl>
+      <w:tblPr>
+        <w:tblW w:type="dxa" w:w="10440"/>
+        <w:tblBorders>
+          <w:top w:val="none" w:color="FFFFFF" w:sz="0"/>
+          <w:left w:val="none" w:color="FFFFFF" w:sz="0"/>
+          <w:bottom w:val="none" w:color="FFFFFF" w:sz="0"/>
+          <w:right w:val="none" w:color="FFFFFF" w:sz="0"/>
+          <w:insideH w:val="single" w:color="auto" w:sz="4"/>
+          <w:insideV w:val="single" w:color="auto" w:sz="4"/>
+        </w:tblBorders>
+      </w:tblPr>
+      <w:tblGrid>
+        <w:gridCol w:w="2400"/>
+        <w:gridCol w:w="380"/>
+        <w:gridCol w:w="420"/>
+        <w:gridCol w:w="680"/>
+        <w:gridCol w:w="540"/>
+        <w:gridCol w:w="440"/>
+        <w:gridCol w:w="5580"/>
+      </w:tblGrid>
       <w:tr>
         <w:tc>
           <w:tcPr>
@@ -11461,7 +11894,254 @@
               <w:bottom w:val="none" w:color="FFFFFF" w:sz="0"/>
               <w:right w:val="none" w:color="FFFFFF" w:sz="0"/>
             </w:tcBorders>
-            <w:shd w:fill="F1F8F2" w:color="auto" w:val="clear"/>
+            <w:shd w:fill="F5E8C0" w:color="auto" w:val="clear"/>
+            <w:tcMar>
+              <w:top w:type="dxa" w:w="40"/>
+              <w:left w:type="dxa" w:w="80"/>
+              <w:bottom w:type="dxa" w:w="40"/>
+              <w:right w:type="dxa" w:w="80"/>
+            </w:tcMar>
+            <w:vAlign w:val="center"/>
+          </w:tcPr>
+          <w:p>
+            <w:pPr>
+              <w:jc w:val="left"/>
+            </w:pPr>
+            <w:r>
+              <w:rPr>
+                <w:rFonts w:ascii="Arial" w:cs="Arial" w:eastAsia="Arial" w:hAnsi="Arial"/>
+                <w:b/>
+                <w:bCs/>
+                <w:color w:val="C9A227"/>
+                <w:sz w:val="15"/>
+                <w:szCs w:val="15"/>
+              </w:rPr>
+              <w:t xml:space="preserve">EXERCISE</w:t>
+            </w:r>
+          </w:p>
+        </w:tc>
+        <w:tc>
+          <w:tcPr>
+            <w:tcW w:type="dxa" w:w="380"/>
+            <w:tcBorders>
+              <w:top w:val="none" w:color="FFFFFF" w:sz="0"/>
+              <w:left w:val="none" w:color="FFFFFF" w:sz="0"/>
+              <w:bottom w:val="none" w:color="FFFFFF" w:sz="0"/>
+              <w:right w:val="none" w:color="FFFFFF" w:sz="0"/>
+            </w:tcBorders>
+            <w:shd w:fill="F5E8C0" w:color="auto" w:val="clear"/>
+            <w:tcMar>
+              <w:top w:type="dxa" w:w="40"/>
+              <w:left w:type="dxa" w:w="80"/>
+              <w:bottom w:type="dxa" w:w="40"/>
+              <w:right w:type="dxa" w:w="80"/>
+            </w:tcMar>
+            <w:vAlign w:val="center"/>
+          </w:tcPr>
+          <w:p>
+            <w:pPr>
+              <w:jc w:val="center"/>
+            </w:pPr>
+            <w:r>
+              <w:rPr>
+                <w:rFonts w:ascii="Arial" w:cs="Arial" w:eastAsia="Arial" w:hAnsi="Arial"/>
+                <w:b/>
+                <w:bCs/>
+                <w:color w:val="C9A227"/>
+                <w:sz w:val="13"/>
+                <w:szCs w:val="13"/>
+              </w:rPr>
+              <w:t xml:space="preserve">SETS</w:t>
+            </w:r>
+          </w:p>
+        </w:tc>
+        <w:tc>
+          <w:tcPr>
+            <w:tcW w:type="dxa" w:w="420"/>
+            <w:tcBorders>
+              <w:top w:val="none" w:color="FFFFFF" w:sz="0"/>
+              <w:left w:val="none" w:color="FFFFFF" w:sz="0"/>
+              <w:bottom w:val="none" w:color="FFFFFF" w:sz="0"/>
+              <w:right w:val="none" w:color="FFFFFF" w:sz="0"/>
+            </w:tcBorders>
+            <w:shd w:fill="F5E8C0" w:color="auto" w:val="clear"/>
+            <w:tcMar>
+              <w:top w:type="dxa" w:w="40"/>
+              <w:left w:type="dxa" w:w="80"/>
+              <w:bottom w:type="dxa" w:w="40"/>
+              <w:right w:type="dxa" w:w="80"/>
+            </w:tcMar>
+            <w:vAlign w:val="center"/>
+          </w:tcPr>
+          <w:p>
+            <w:pPr>
+              <w:jc w:val="center"/>
+            </w:pPr>
+            <w:r>
+              <w:rPr>
+                <w:rFonts w:ascii="Arial" w:cs="Arial" w:eastAsia="Arial" w:hAnsi="Arial"/>
+                <w:b/>
+                <w:bCs/>
+                <w:color w:val="C9A227"/>
+                <w:sz w:val="13"/>
+                <w:szCs w:val="13"/>
+              </w:rPr>
+              <w:t xml:space="preserve">REPS</w:t>
+            </w:r>
+          </w:p>
+        </w:tc>
+        <w:tc>
+          <w:tcPr>
+            <w:tcW w:type="dxa" w:w="680"/>
+            <w:tcBorders>
+              <w:top w:val="none" w:color="FFFFFF" w:sz="0"/>
+              <w:left w:val="none" w:color="FFFFFF" w:sz="0"/>
+              <w:bottom w:val="none" w:color="FFFFFF" w:sz="0"/>
+              <w:right w:val="none" w:color="FFFFFF" w:sz="0"/>
+            </w:tcBorders>
+            <w:shd w:fill="F5E8C0" w:color="auto" w:val="clear"/>
+            <w:tcMar>
+              <w:top w:type="dxa" w:w="40"/>
+              <w:left w:type="dxa" w:w="80"/>
+              <w:bottom w:type="dxa" w:w="40"/>
+              <w:right w:type="dxa" w:w="80"/>
+            </w:tcMar>
+            <w:vAlign w:val="center"/>
+          </w:tcPr>
+          <w:p>
+            <w:pPr>
+              <w:jc w:val="center"/>
+            </w:pPr>
+            <w:r>
+              <w:rPr>
+                <w:rFonts w:ascii="Arial" w:cs="Arial" w:eastAsia="Arial" w:hAnsi="Arial"/>
+                <w:b/>
+                <w:bCs/>
+                <w:color w:val="C9A227"/>
+                <w:sz w:val="13"/>
+                <w:szCs w:val="13"/>
+              </w:rPr>
+              <w:t xml:space="preserve">LOAD</w:t>
+            </w:r>
+          </w:p>
+        </w:tc>
+        <w:tc>
+          <w:tcPr>
+            <w:tcW w:type="dxa" w:w="540"/>
+            <w:tcBorders>
+              <w:top w:val="none" w:color="FFFFFF" w:sz="0"/>
+              <w:left w:val="none" w:color="FFFFFF" w:sz="0"/>
+              <w:bottom w:val="none" w:color="FFFFFF" w:sz="0"/>
+              <w:right w:val="none" w:color="FFFFFF" w:sz="0"/>
+            </w:tcBorders>
+            <w:shd w:fill="F5E8C0" w:color="auto" w:val="clear"/>
+            <w:tcMar>
+              <w:top w:type="dxa" w:w="40"/>
+              <w:left w:type="dxa" w:w="80"/>
+              <w:bottom w:type="dxa" w:w="40"/>
+              <w:right w:type="dxa" w:w="80"/>
+            </w:tcMar>
+            <w:vAlign w:val="center"/>
+          </w:tcPr>
+          <w:p>
+            <w:pPr>
+              <w:jc w:val="center"/>
+            </w:pPr>
+            <w:r>
+              <w:rPr>
+                <w:rFonts w:ascii="Arial" w:cs="Arial" w:eastAsia="Arial" w:hAnsi="Arial"/>
+                <w:b/>
+                <w:bCs/>
+                <w:color w:val="C9A227"/>
+                <w:sz w:val="13"/>
+                <w:szCs w:val="13"/>
+              </w:rPr>
+              <w:t xml:space="preserve">TEMPO</w:t>
+            </w:r>
+          </w:p>
+        </w:tc>
+        <w:tc>
+          <w:tcPr>
+            <w:tcW w:type="dxa" w:w="440"/>
+            <w:tcBorders>
+              <w:top w:val="none" w:color="FFFFFF" w:sz="0"/>
+              <w:left w:val="none" w:color="FFFFFF" w:sz="0"/>
+              <w:bottom w:val="none" w:color="FFFFFF" w:sz="0"/>
+              <w:right w:val="none" w:color="FFFFFF" w:sz="0"/>
+            </w:tcBorders>
+            <w:shd w:fill="F5E8C0" w:color="auto" w:val="clear"/>
+            <w:tcMar>
+              <w:top w:type="dxa" w:w="40"/>
+              <w:left w:type="dxa" w:w="80"/>
+              <w:bottom w:type="dxa" w:w="40"/>
+              <w:right w:type="dxa" w:w="80"/>
+            </w:tcMar>
+            <w:vAlign w:val="center"/>
+          </w:tcPr>
+          <w:p>
+            <w:pPr>
+              <w:jc w:val="center"/>
+            </w:pPr>
+            <w:r>
+              <w:rPr>
+                <w:rFonts w:ascii="Arial" w:cs="Arial" w:eastAsia="Arial" w:hAnsi="Arial"/>
+                <w:b/>
+                <w:bCs/>
+                <w:color w:val="C9A227"/>
+                <w:sz w:val="13"/>
+                <w:szCs w:val="13"/>
+              </w:rPr>
+              <w:t xml:space="preserve">REST</w:t>
+            </w:r>
+          </w:p>
+        </w:tc>
+        <w:tc>
+          <w:tcPr>
+            <w:tcW w:type="dxa" w:w="5580"/>
+            <w:tcBorders>
+              <w:top w:val="none" w:color="FFFFFF" w:sz="0"/>
+              <w:left w:val="none" w:color="FFFFFF" w:sz="0"/>
+              <w:bottom w:val="none" w:color="FFFFFF" w:sz="0"/>
+              <w:right w:val="none" w:color="FFFFFF" w:sz="0"/>
+            </w:tcBorders>
+            <w:shd w:fill="F5E8C0" w:color="auto" w:val="clear"/>
+            <w:tcMar>
+              <w:top w:type="dxa" w:w="40"/>
+              <w:left w:type="dxa" w:w="80"/>
+              <w:bottom w:type="dxa" w:w="40"/>
+              <w:right w:type="dxa" w:w="80"/>
+            </w:tcMar>
+            <w:vAlign w:val="center"/>
+          </w:tcPr>
+          <w:p>
+            <w:pPr>
+              <w:jc w:val="left"/>
+            </w:pPr>
+            <w:r>
+              <w:rPr>
+                <w:rFonts w:ascii="Arial" w:cs="Arial" w:eastAsia="Arial" w:hAnsi="Arial"/>
+                <w:b/>
+                <w:bCs/>
+                <w:color w:val="C9A227"/>
+                <w:sz w:val="15"/>
+                <w:szCs w:val="15"/>
+              </w:rPr>
+              <w:t xml:space="preserve">COACHING CUE</w:t>
+            </w:r>
+          </w:p>
+        </w:tc>
+      </w:tr>
+      <w:tr>
+        <w:tc>
+          <w:tcPr>
+            <w:tcW w:type="dxa" w:w="2400"/>
+            <w:tcBorders>
+              <w:top w:val="none" w:color="FFFFFF" w:sz="0"/>
+              <w:left w:val="none" w:color="FFFFFF" w:sz="0"/>
+              <w:bottom w:val="none" w:color="FFFFFF" w:sz="0"/>
+              <w:right w:val="none" w:color="FFFFFF" w:sz="0"/>
+            </w:tcBorders>
+            <w:shd w:fill="FAF3E0" w:color="auto" w:val="clear"/>
             <w:tcMar>
               <w:top w:type="dxa" w:w="40"/>
               <w:left w:type="dxa" w:w="80"/>
@@ -11480,7 +12160,7 @@
                 <w:sz w:val="18"/>
                 <w:szCs w:val="18"/>
               </w:rPr>
-              <w:t xml:space="preserve">Face Pull (Cable)</w:t>
+              <w:t xml:space="preserve">Face Pull (Kieser)</w:t>
             </w:r>
           </w:p>
         </w:tc>
@@ -11493,7 +12173,7 @@
               <w:bottom w:val="none" w:color="FFFFFF" w:sz="0"/>
               <w:right w:val="none" w:color="FFFFFF" w:sz="0"/>
             </w:tcBorders>
-            <w:shd w:fill="F1F8F2" w:color="auto" w:val="clear"/>
+            <w:shd w:fill="FAF3E0" w:color="auto" w:val="clear"/>
             <w:tcMar>
               <w:top w:type="dxa" w:w="40"/>
               <w:left w:type="dxa" w:w="80"/>
@@ -11526,7 +12206,7 @@
               <w:bottom w:val="none" w:color="FFFFFF" w:sz="0"/>
               <w:right w:val="none" w:color="FFFFFF" w:sz="0"/>
             </w:tcBorders>
-            <w:shd w:fill="F1F8F2" w:color="auto" w:val="clear"/>
+            <w:shd w:fill="FAF3E0" w:color="auto" w:val="clear"/>
             <w:tcMar>
               <w:top w:type="dxa" w:w="40"/>
               <w:left w:type="dxa" w:w="80"/>
@@ -11559,7 +12239,7 @@
               <w:bottom w:val="none" w:color="FFFFFF" w:sz="0"/>
               <w:right w:val="none" w:color="FFFFFF" w:sz="0"/>
             </w:tcBorders>
-            <w:shd w:fill="F1F8F2" w:color="auto" w:val="clear"/>
+            <w:shd w:fill="FAF3E0" w:color="auto" w:val="clear"/>
             <w:tcMar>
               <w:top w:type="dxa" w:w="40"/>
               <w:left w:type="dxa" w:w="80"/>
@@ -11592,7 +12272,7 @@
               <w:bottom w:val="none" w:color="FFFFFF" w:sz="0"/>
               <w:right w:val="none" w:color="FFFFFF" w:sz="0"/>
             </w:tcBorders>
-            <w:shd w:fill="F1F8F2" w:color="auto" w:val="clear"/>
+            <w:shd w:fill="FAF3E0" w:color="auto" w:val="clear"/>
             <w:tcMar>
               <w:top w:type="dxa" w:w="40"/>
               <w:left w:type="dxa" w:w="80"/>
@@ -11625,7 +12305,7 @@
               <w:bottom w:val="none" w:color="FFFFFF" w:sz="0"/>
               <w:right w:val="none" w:color="FFFFFF" w:sz="0"/>
             </w:tcBorders>
-            <w:shd w:fill="F1F8F2" w:color="auto" w:val="clear"/>
+            <w:shd w:fill="FAF3E0" w:color="auto" w:val="clear"/>
             <w:tcMar>
               <w:top w:type="dxa" w:w="40"/>
               <w:left w:type="dxa" w:w="80"/>
@@ -11658,7 +12338,7 @@
               <w:bottom w:val="none" w:color="FFFFFF" w:sz="0"/>
               <w:right w:val="none" w:color="FFFFFF" w:sz="0"/>
             </w:tcBorders>
-            <w:shd w:fill="F1F8F2" w:color="auto" w:val="clear"/>
+            <w:shd w:fill="FAF3E0" w:color="auto" w:val="clear"/>
             <w:tcMar>
               <w:top w:type="dxa" w:w="40"/>
               <w:left w:type="dxa" w:w="80"/>
@@ -11915,7 +12595,7 @@
                 <w:sz w:val="17"/>
                 <w:szCs w:val="17"/>
               </w:rPr>
-              <w:t xml:space="preserve">New this update — first genuine lunge-pattern movement in the program. Step straight back, lower until rear knee lightly grazes floor, front knee tracks over toes, drive through front heel to return. Controlled step-back (not walking lunge) — lower deceleration demand, appropriate given the stenosis history. Left leg leads first.</w:t>
+              <w:t xml:space="preserve">Step straight back, lower until rear knee lightly grazes floor, front knee tracks over toes, drive through front heel to return. Controlled step-back (not walking lunge) — lower deceleration demand, appropriate given the stenosis history. Left leg leads first.</w:t>
             </w:r>
             <w:r>
               <w:rPr>
@@ -11941,7 +12621,7 @@
               <w:bottom w:val="none" w:color="FFFFFF" w:sz="0"/>
               <w:right w:val="none" w:color="FFFFFF" w:sz="0"/>
             </w:tcBorders>
-            <w:shd w:fill="F1F8F2" w:color="auto" w:val="clear"/>
+            <w:shd w:fill="FAF3E0" w:color="auto" w:val="clear"/>
             <w:tcMar>
               <w:top w:type="dxa" w:w="40"/>
               <w:left w:type="dxa" w:w="80"/>
@@ -11973,7 +12653,7 @@
               <w:bottom w:val="none" w:color="FFFFFF" w:sz="0"/>
               <w:right w:val="none" w:color="FFFFFF" w:sz="0"/>
             </w:tcBorders>
-            <w:shd w:fill="F1F8F2" w:color="auto" w:val="clear"/>
+            <w:shd w:fill="FAF3E0" w:color="auto" w:val="clear"/>
             <w:tcMar>
               <w:top w:type="dxa" w:w="40"/>
               <w:left w:type="dxa" w:w="80"/>
@@ -12006,7 +12686,7 @@
               <w:bottom w:val="none" w:color="FFFFFF" w:sz="0"/>
               <w:right w:val="none" w:color="FFFFFF" w:sz="0"/>
             </w:tcBorders>
-            <w:shd w:fill="F1F8F2" w:color="auto" w:val="clear"/>
+            <w:shd w:fill="FAF3E0" w:color="auto" w:val="clear"/>
             <w:tcMar>
               <w:top w:type="dxa" w:w="40"/>
               <w:left w:type="dxa" w:w="80"/>
@@ -12039,7 +12719,7 @@
               <w:bottom w:val="none" w:color="FFFFFF" w:sz="0"/>
               <w:right w:val="none" w:color="FFFFFF" w:sz="0"/>
             </w:tcBorders>
-            <w:shd w:fill="F1F8F2" w:color="auto" w:val="clear"/>
+            <w:shd w:fill="FAF3E0" w:color="auto" w:val="clear"/>
             <w:tcMar>
               <w:top w:type="dxa" w:w="40"/>
               <w:left w:type="dxa" w:w="80"/>
@@ -12072,7 +12752,7 @@
               <w:bottom w:val="none" w:color="FFFFFF" w:sz="0"/>
               <w:right w:val="none" w:color="FFFFFF" w:sz="0"/>
             </w:tcBorders>
-            <w:shd w:fill="F1F8F2" w:color="auto" w:val="clear"/>
+            <w:shd w:fill="FAF3E0" w:color="auto" w:val="clear"/>
             <w:tcMar>
               <w:top w:type="dxa" w:w="40"/>
               <w:left w:type="dxa" w:w="80"/>
@@ -12105,7 +12785,7 @@
               <w:bottom w:val="none" w:color="FFFFFF" w:sz="0"/>
               <w:right w:val="none" w:color="FFFFFF" w:sz="0"/>
             </w:tcBorders>
-            <w:shd w:fill="F1F8F2" w:color="auto" w:val="clear"/>
+            <w:shd w:fill="FAF3E0" w:color="auto" w:val="clear"/>
             <w:tcMar>
               <w:top w:type="dxa" w:w="40"/>
               <w:left w:type="dxa" w:w="80"/>
@@ -12138,7 +12818,7 @@
               <w:bottom w:val="none" w:color="FFFFFF" w:sz="0"/>
               <w:right w:val="none" w:color="FFFFFF" w:sz="0"/>
             </w:tcBorders>
-            <w:shd w:fill="F1F8F2" w:color="auto" w:val="clear"/>
+            <w:shd w:fill="FAF3E0" w:color="auto" w:val="clear"/>
             <w:tcMar>
               <w:top w:type="dxa" w:w="40"/>
               <w:left w:type="dxa" w:w="80"/>
@@ -12190,7 +12870,7 @@
           <w:sz w:val="17"/>
           <w:szCs w:val="17"/>
         </w:rPr>
-        <w:t xml:space="preserve">B — PRIMARY PULL STRENGTH + PULL-UP PROGRESSION</w:t>
+        <w:t xml:space="preserve">C — SECONDARY COMPOUND — PULL STRENGTH + PULL-UP PROGRESSION</w:t>
       </w:r>
     </w:p>
     <w:p>
@@ -12215,7 +12895,7 @@
           <w:sz w:val="17"/>
           <w:szCs w:val="17"/>
         </w:rPr>
-        <w:t xml:space="preserve">Neutral grip is the safest for spinal stenosis — least internal rotation and least lat tension through the lumbar spine at end range. Neutral grip leads in every session. All three grips trained every session for comprehensive lat and upper back development. Progress: +1 rep per grip every 2 weeks.</w:t>
+        <w:t xml:space="preserve">The day's second compound pattern — pulling, rotating off the squat and lunge work above. Neutral grip is the safest for spinal stenosis — least internal rotation and least lat tension through the lumbar spine at end range. Neutral grip leads in every session; all three grips trained every session for comprehensive lat and upper back development. Progress: +1 rep per grip every 2 weeks. If the row needs a variation: a single-arm Kieser row or a single-arm DB row on a bench covers the same pattern with the same no-lumbar-load intent — the chest-supported row stays the one we track. The three-grip pull-up progression is its own sequence — run it as written. Goblet squat closes the block as squat-pattern volume after the pulling work.</w:t>
       </w:r>
     </w:p>
     <w:tbl>
@@ -13705,7 +14385,7 @@
           <w:sz w:val="17"/>
           <w:szCs w:val="17"/>
         </w:rPr>
-        <w:t xml:space="preserve">C — PUSH-UP PROGRESSION</w:t>
+        <w:t xml:space="preserve">D — PUSH-UP PROGRESSION</w:t>
       </w:r>
     </w:p>
     <w:p>
@@ -14510,7 +15190,7 @@
                 <w:sz w:val="18"/>
                 <w:szCs w:val="18"/>
               </w:rPr>
-              <w:t xml:space="preserve">Tricep Dip (Bench) OR Keiser / DB Kickback</w:t>
+              <w:t xml:space="preserve">Tricep Dip (Bench) OR Kieser / DB Kickback</w:t>
             </w:r>
           </w:p>
         </w:tc>
@@ -14705,7 +15385,7 @@
                 <w:sz w:val="17"/>
                 <w:szCs w:val="17"/>
               </w:rPr>
-              <w:t xml:space="preserve">Dip: hands on bench behind body, lower until elbows reach 90°, drive back up. Keiser/DB kickback: hinge forward, elbow fixed at side, extend through full range, squeeze at lockout. Coach/client choice — both build tricep strength for push-up progression.</w:t>
+              <w:t xml:space="preserve">Dip: hands on bench behind body, lower until elbows reach 90°, drive back up. Kieser/DB kickback: hinge forward, elbow fixed at side, extend through full range, squeeze at lockout. Coach/client choice — both build tricep strength for push-up progression.</w:t>
             </w:r>
             <w:r>
               <w:rPr>
@@ -14740,7 +15420,7 @@
           <w:sz w:val="17"/>
           <w:szCs w:val="17"/>
         </w:rPr>
-        <w:t xml:space="preserve">D — METABOLIC CONDITIONING CIRCUIT — 3 ROUNDS</w:t>
+        <w:t xml:space="preserve">E — FULL-BODY INTEGRATION — METABOLIC CONDITIONING CIRCUIT (3 ROUNDS)</w:t>
       </w:r>
     </w:p>
     <w:p>
@@ -14765,7 +15445,7 @@
           <w:sz w:val="17"/>
           <w:szCs w:val="17"/>
         </w:rPr>
-        <w:t xml:space="preserve">Day B's cardiovascular work is a metabolic circuit rather than dedicated cardio. This provides the strength-plus-conditioning stimulus that is most effective for fat loss and body composition at 2 days per week. Kettlebell swing and pull-through are new this update — moderate, hip-hinge-dominant options from the cross-training notes, replacing goblet squat in this slot (client/coach choice over jump squat, which stays deferred for now given moderate-progression pacing). After 3 circuit rounds: 10-minute cardiovascular finisher — choose stationary bike easy spin, treadmill Zone 2 walk, or rowing machine easy pace. Nothing in this circuit carries an RIR target — it is paced by the clock and by movement quality, not by reps left in reserve. End a round of swings or pull-throughs if the hinge mechanics start to degrade, rather than completing the number.</w:t>
+        <w:t xml:space="preserve">The session's closing compound circuit — hinge, pull, push, and core in one continuous complex, pulling the whole day's patterns together while doubling as Day B's cardiovascular work. This provides the strength-plus-conditioning stimulus that is most effective for fat loss and body composition at 2 days per week. The hinge station rotates between kettlebell swing and Kieser/band pull-through (client/coach choice — jump squat stays deferred for now given moderate-progression pacing). After 3 circuit rounds: 10-minute cardiovascular finisher — choose stationary bike easy spin, treadmill Zone 2 walk, or rowing machine easy pace. Nothing in this circuit carries an RIR target — it is paced by the clock and by movement quality, not by reps left in reserve. End a round of swings or pull-throughs if the hinge mechanics start to degrade, rather than completing the number.</w:t>
       </w:r>
     </w:p>
     <w:tbl>
@@ -15065,7 +15745,7 @@
                 <w:sz w:val="18"/>
                 <w:szCs w:val="18"/>
               </w:rPr>
-              <w:t xml:space="preserve">Kettlebell Swing OR Cable/Band Pull-Through</w:t>
+              <w:t xml:space="preserve">Kettlebell Swing OR Kieser/Band Pull-Through</w:t>
             </w:r>
           </w:p>
         </w:tc>
@@ -15164,7 +15844,7 @@
                 <w:sz w:val="15"/>
                 <w:szCs w:val="15"/>
               </w:rPr>
-              <w:t xml:space="preserve">Light-Mod KB or band/cable</w:t>
+              <w:t xml:space="preserve">Light-Mod KB or band/Kieser</w:t>
             </w:r>
           </w:p>
         </w:tc>
@@ -17055,7 +17735,7 @@
           <w:sz w:val="17"/>
           <w:szCs w:val="17"/>
         </w:rPr>
-        <w:t xml:space="preserve">All updated baseline lifts surpassed. Push-up: 8–10 full unassisted. Plank: 1:15. Hip hinge: clean and reflexive. Reassess pull-up assist level.</w:t>
+        <w:t xml:space="preserve">All updated baseline lifts surpassed. Push-up: 8–10 full unassisted. Plank: 1:15. Hip hinge: clean and reflexive. Reassess pull-up assist level. Week 4 closes with the strength check (the standing 4-week reassessment); Week 5 that follows is the planned deload week — same movements, sets reduced, loads held (see the deload note above) — before Weeks 6–8 rebuild from the Week 4 loads.</w:t>
       </w:r>
     </w:p>
     <w:p>
@@ -17080,7 +17760,7 @@
           <w:sz w:val="17"/>
           <w:szCs w:val="17"/>
         </w:rPr>
-        <w:t xml:space="preserve">Strength: Hex DL progressing toward the PT-documented 95→135 lbs / 6–8 week target (Wk4 program checkpoint 120 lbs). Hip Thrust 115+ lbs ×5–6. OHP 22.5 lbs/hand ×8. Incline 22.5 lbs/hand ×8. Flat Press 27.5 lbs/hand ×8. Row 32.5 lbs ×8. Split Squat 37.5 lbs/hand ×8. Landmine Squat progressing in load. Goblet 45 lbs ×10. SL-RDL 32.5 lbs/hand. Carry 50 lbs/hand. Push-up 12 full unassisted. Pull-up 8 reps all grips. Plank 1:30. Single-Leg Reverse Hyper: clean, controlled hip extension with no pelvic rotation either side. Sit-up/bicycle crunch and KB swing clean and symptom-free for 3–4+ weeks. Cardiovascular: Day A cardio finisher extends to 20–25 min Zone 2 or 10 rounds of incline intervals; Day B metabolic circuit completes 3 rounds faster than Week 1 at the same loads. Revisit barbell back squat, conventional barbell deadlift, and clean-to-overhead-press for reintroduction once the above is consistent.</w:t>
+        <w:t xml:space="preserve">Reached through the Week 4 strength check, the planned Week 5 deload, and the Weeks 6–8 rebuild. Strength: Hex DL progressing toward the PT-documented 95→135 lbs / 6–8 week target (Wk4 program checkpoint 120 lbs). Hip Thrust 115+ lbs ×5–6. OHP 22.5 lbs/hand ×8. Incline 22.5 lbs/hand ×8. Flat Press 27.5 lbs/hand ×8. Row 32.5 lbs ×8. Split Squat 37.5 lbs/hand ×8. Landmine Squat progressing in load. Goblet 45 lbs ×10. SL-RDL 32.5 lbs/hand. Carry 50 lbs/hand. Push-up 12 full unassisted. Pull-up 8 reps all grips. Plank 1:30. Single-Leg Reverse Hyper: clean, controlled hip extension with no pelvic rotation either side. Sit-up/bicycle crunch and KB swing clean and symptom-free for 3–4+ weeks. Cardiovascular: Day A cardio finisher extends to 20–25 min Zone 2 or 10 rounds of incline intervals; Day B metabolic circuit completes 3 rounds faster than Week 1 at the same loads. Revisit barbell back squat, conventional barbell deadlift, and clean-to-overhead-press for reintroduction once the above is consistent.</w:t>
       </w:r>
     </w:p>
     <w:p>
@@ -17105,7 +17785,7 @@
           <w:sz w:val="17"/>
           <w:szCs w:val="17"/>
         </w:rPr>
-        <w:t xml:space="preserve">No Styku scan is on file for this client — reassess at 8 weeks via baseline lift retest, pull-up assist-level reduction, and resting heart rate trend rather than a body-composition rescan.</w:t>
+        <w:t xml:space="preserve">Strength is reassessed on the standing 4-week cadence: the Week 4 check above is the first reassessment, the Week 8 retest the second — run each against the baseline lift table, pull-up assist level, and resting heart rate trend. No Styku scan is on file for this client, so there is no body-composition rescan to book yet; once a first scan is taken, the separate 8–12 week body-composition rescan cadence starts from that scan date.</w:t>
       </w:r>
     </w:p>
     <w:p>

</xml_diff>